<commit_message>
Upgrade VS toolset; update solution and fix main.c
Bump Visual Studio metadata and toolset, update project configurations, and fix source. The .sln was updated to Visual Studio 18 and solution configurations extended/normalized to include DebugNormal and DebugOverflow for x64/x86. The .vcxproj platformToolset was upgraded from v143 to v145 across configurations. In main.c the strftime call in get_order_date was commented out and a stray '=' was removed from main to fix a syntax issue. Also a practicum .docx file was modified (binary change).
</commit_message>
<xml_diff>
--- a/Sec-Week-1/C security practicum 1.docx
+++ b/Sec-Week-1/C security practicum 1.docx
@@ -4,7 +4,7 @@
   <w:body>
     <w:p>
       <w:pPr>
-        <w:pStyle w:val="895"/>
+        <w:pStyle w:val="848"/>
         <w:pBdr/>
         <w:spacing/>
         <w:ind/>
@@ -27,7 +27,7 @@
     </w:p>
     <w:p>
       <w:pPr>
-        <w:pStyle w:val="895"/>
+        <w:pStyle w:val="848"/>
         <w:pBdr/>
         <w:spacing/>
         <w:ind/>
@@ -89,7 +89,7 @@
     </w:p>
     <w:p>
       <w:pPr>
-        <w:pStyle w:val="900"/>
+        <w:pStyle w:val="853"/>
         <w:numPr>
           <w:ilvl w:val="0"/>
           <w:numId w:val="4"/>
@@ -137,7 +137,7 @@
                         </pic:cNvPicPr>
                         <pic:nvPr/>
                       </pic:nvPicPr>
-                      <pic:blipFill rotWithShape="1">
+                      <pic:blipFill>
                         <a:blip r:embed="rId9"/>
                         <a:stretch/>
                       </pic:blipFill>
@@ -194,16 +194,17 @@
     </w:p>
     <w:p>
       <w:pPr>
-        <w:pStyle w:val="900"/>
-        <w:numPr>
-          <w:ilvl w:val="0"/>
-          <w:numId w:val="4"/>
-        </w:numPr>
-        <w:pBdr/>
-        <w:spacing/>
-        <w:ind/>
+        <w:pBdr/>
+        <w:spacing/>
+        <w:ind w:firstLine="0" w:left="0"/>
         <w:rPr/>
       </w:pPr>
+      <w:r>
+        <w:rPr>
+          <w:lang w:val="en-GB"/>
+        </w:rPr>
+        <w:t xml:space="preserve">B)  </w:t>
+      </w:r>
       <w:r>
         <w:t xml:space="preserve">Laat zien met welke “string” van de strcpy welke variabele wel of niet worden aangepast. Bereken de lengte van deze “string” waarbij iets wordt aangepast</w:t>
         <w:br/>
@@ -211,6 +212,85 @@
       </w:r>
       <w:r>
         <w:t xml:space="preserve">De functie strcpy kopieert een string naar een buffer totdat ook de nulterminator (\0) is meegekopieerd. Als de string langer is dan de buffer, worden ook gegevens op de stack van variabelen ernaast overschreven.</w:t>
+      </w:r>
+      <w:r>
+        <w:br/>
+      </w:r>
+      <w:r>
+        <w:t xml:space="preserve">Volgorde op stack (laag naar hoog adres):</w:t>
+      </w:r>
+      <w:r>
+        <w:br/>
+      </w:r>
+      <w:r/>
+      <w:r>
+        <w:t xml:space="preserve">filename[128]           (bytes 0-127)</w:t>
+      </w:r>
+      <w:r/>
+    </w:p>
+    <w:p>
+      <w:pPr>
+        <w:pStyle w:val="853"/>
+        <w:pBdr/>
+        <w:spacing/>
+        <w:ind/>
+        <w:rPr/>
+      </w:pPr>
+      <w:r>
+        <w:t xml:space="preserve">buffer[20]              (bytes 128-147)</w:t>
+      </w:r>
+      <w:r/>
+    </w:p>
+    <w:p>
+      <w:pPr>
+        <w:pStyle w:val="853"/>
+        <w:pBdr/>
+        <w:spacing/>
+        <w:ind/>
+        <w:rPr/>
+      </w:pPr>
+      <w:r>
+        <w:t xml:space="preserve">buffer2[20]             (bytes 148-167)</w:t>
+      </w:r>
+      <w:r/>
+    </w:p>
+    <w:p>
+      <w:pPr>
+        <w:pStyle w:val="853"/>
+        <w:pBdr/>
+        <w:spacing/>
+        <w:ind/>
+        <w:rPr/>
+      </w:pPr>
+      <w:r>
+        <w:t xml:space="preserve">klant_geverifieerd[4]   (bytes 168-171)</w:t>
+      </w:r>
+      <w:r/>
+    </w:p>
+    <w:p>
+      <w:pPr>
+        <w:pStyle w:val="853"/>
+        <w:pBdr/>
+        <w:spacing/>
+        <w:ind/>
+        <w:rPr/>
+      </w:pPr>
+      <w:r>
+        <w:t xml:space="preserve">klantnr[16]             (bytes 172-187)</w:t>
+      </w:r>
+      <w:r/>
+    </w:p>
+    <w:p>
+      <w:pPr>
+        <w:pStyle w:val="853"/>
+        <w:pBdr/>
+        <w:spacing/>
+        <w:ind/>
+        <w:rPr/>
+      </w:pPr>
+      <w:r/>
+      <w:r>
+        <w:t xml:space="preserve">incassorekening[10]     (bytes 188-197)</w:t>
       </w:r>
       <w:r>
         <w:br/>
@@ -230,20 +310,20 @@
                   <a:graphicData uri="http://schemas.openxmlformats.org/drawingml/2006/picture">
                     <pic:pic xmlns:pic="http://schemas.openxmlformats.org/drawingml/2006/picture">
                       <pic:nvPicPr>
-                        <pic:cNvPr id="895205978" name=""/>
+                        <pic:cNvPr id="1235626125" name=""/>
                         <pic:cNvPicPr>
                           <a:picLocks noChangeAspect="1"/>
                         </pic:cNvPicPr>
                         <pic:nvPr/>
                       </pic:nvPicPr>
-                      <pic:blipFill rotWithShape="1">
+                      <pic:blipFill>
                         <a:blip r:embed="rId10"/>
                         <a:stretch/>
                       </pic:blipFill>
                       <pic:spPr bwMode="auto">
                         <a:xfrm>
                           <a:off x="0" y="0"/>
-                          <a:ext cx="3857625" cy="1419224"/>
+                          <a:ext cx="3857625" cy="1419223"/>
                         </a:xfrm>
                         <a:prstGeom prst="rect">
                           <a:avLst/>
@@ -287,11 +367,295 @@
       <w:r>
         <w:br/>
       </w:r>
+      <w:r>
+        <w:t xml:space="preserve">Tabel - String lengte vs aangepaste variabelen:</w:t>
+      </w:r>
+      <w:r/>
       <w:r/>
     </w:p>
     <w:p>
       <w:pPr>
-        <w:pStyle w:val="900"/>
+        <w:pStyle w:val="853"/>
+        <w:pBdr/>
+        <w:spacing/>
+        <w:ind/>
+        <w:rPr/>
+      </w:pPr>
+      <w:r>
+        <w:t xml:space="preserve">String lengte</w:t>
+        <w:tab/>
+        <w:t xml:space="preserve">Null-terminator op byte</w:t>
+        <w:tab/>
+        <w:t xml:space="preserve">Variabelen aangepast</w:t>
+      </w:r>
+      <w:r/>
+    </w:p>
+    <w:p>
+      <w:pPr>
+        <w:pStyle w:val="853"/>
+        <w:pBdr/>
+        <w:spacing/>
+        <w:ind/>
+        <w:rPr/>
+      </w:pPr>
+      <w:r>
+        <w:t xml:space="preserve">≤ 128</w:t>
+        <w:tab/>
+        <w:t xml:space="preserve">Binnen filename</w:t>
+        <w:tab/>
+        <w:t xml:space="preserve">Geen</w:t>
+      </w:r>
+      <w:r/>
+    </w:p>
+    <w:p>
+      <w:pPr>
+        <w:pStyle w:val="853"/>
+        <w:pBdr/>
+        <w:spacing/>
+        <w:ind/>
+        <w:rPr/>
+      </w:pPr>
+      <w:r>
+        <w:t xml:space="preserve">129</w:t>
+        <w:tab/>
+        <w:t xml:space="preserve">129 (buffer[1])</w:t>
+        <w:tab/>
+        <w:t xml:space="preserve">buffer</w:t>
+      </w:r>
+      <w:r/>
+    </w:p>
+    <w:p>
+      <w:pPr>
+        <w:pStyle w:val="853"/>
+        <w:pBdr/>
+        <w:spacing/>
+        <w:ind/>
+        <w:rPr/>
+      </w:pPr>
+      <w:r>
+        <w:t xml:space="preserve">148</w:t>
+        <w:tab/>
+        <w:t xml:space="preserve">148 (buffer[20])</w:t>
+        <w:tab/>
+        <w:t xml:space="preserve">buffer</w:t>
+      </w:r>
+      <w:r/>
+    </w:p>
+    <w:p>
+      <w:pPr>
+        <w:pStyle w:val="853"/>
+        <w:pBdr/>
+        <w:spacing/>
+        <w:ind/>
+        <w:rPr/>
+      </w:pPr>
+      <w:r>
+        <w:t xml:space="preserve">149</w:t>
+        <w:tab/>
+        <w:t xml:space="preserve">149 (buffer2[1])</w:t>
+        <w:tab/>
+        <w:t xml:space="preserve">buffer + buffer2</w:t>
+      </w:r>
+      <w:r/>
+    </w:p>
+    <w:p>
+      <w:pPr>
+        <w:pStyle w:val="853"/>
+        <w:pBdr/>
+        <w:spacing/>
+        <w:ind/>
+        <w:rPr/>
+      </w:pPr>
+      <w:r>
+        <w:t xml:space="preserve">168</w:t>
+        <w:tab/>
+        <w:t xml:space="preserve">168 (buffer2[20])</w:t>
+        <w:tab/>
+        <w:t xml:space="preserve">buffer + buffer2</w:t>
+      </w:r>
+      <w:r/>
+    </w:p>
+    <w:p>
+      <w:pPr>
+        <w:pStyle w:val="853"/>
+        <w:pBdr/>
+        <w:spacing/>
+        <w:ind/>
+        <w:rPr/>
+      </w:pPr>
+      <w:r>
+        <w:t xml:space="preserve">169</w:t>
+        <w:tab/>
+        <w:t xml:space="preserve">169 (klant_geverifieerd[1])</w:t>
+        <w:tab/>
+        <w:t xml:space="preserve">buffer + buffer2 + klant_geverifieerd</w:t>
+      </w:r>
+      <w:r/>
+    </w:p>
+    <w:p>
+      <w:pPr>
+        <w:pStyle w:val="853"/>
+        <w:pBdr/>
+        <w:spacing/>
+        <w:ind/>
+        <w:rPr/>
+      </w:pPr>
+      <w:r>
+        <w:t xml:space="preserve">172</w:t>
+        <w:tab/>
+        <w:t xml:space="preserve">172 (klant_geverifieerd[4])</w:t>
+        <w:tab/>
+        <w:t xml:space="preserve">buffer + buffer2 + klant_geverifieerd</w:t>
+      </w:r>
+      <w:r/>
+    </w:p>
+    <w:p>
+      <w:pPr>
+        <w:pStyle w:val="853"/>
+        <w:pBdr/>
+        <w:spacing/>
+        <w:ind/>
+        <w:rPr/>
+      </w:pPr>
+      <w:r>
+        <w:t xml:space="preserve">173</w:t>
+        <w:tab/>
+        <w:t xml:space="preserve">173 (klantnr[1])</w:t>
+        <w:tab/>
+        <w:t xml:space="preserve">buffer + buffer2 + klant_geverifieerd + klantnr</w:t>
+      </w:r>
+      <w:r/>
+    </w:p>
+    <w:p>
+      <w:pPr>
+        <w:pStyle w:val="853"/>
+        <w:pBdr/>
+        <w:spacing/>
+        <w:ind/>
+        <w:rPr/>
+      </w:pPr>
+      <w:r>
+        <w:t xml:space="preserve">188</w:t>
+        <w:tab/>
+        <w:t xml:space="preserve">188 (klantnr[16])</w:t>
+        <w:tab/>
+        <w:t xml:space="preserve">buffer + buffer2 + klant_geverifieerd + klantnr</w:t>
+      </w:r>
+      <w:r/>
+    </w:p>
+    <w:p>
+      <w:pPr>
+        <w:pStyle w:val="853"/>
+        <w:pBdr/>
+        <w:spacing/>
+        <w:ind/>
+        <w:rPr/>
+      </w:pPr>
+      <w:r>
+        <w:t xml:space="preserve">189</w:t>
+        <w:tab/>
+        <w:t xml:space="preserve">189 (incassorekening[1])</w:t>
+        <w:tab/>
+        <w:t xml:space="preserve">buffer + buffer2 + klant_geverifieerd + klantnr + incassorekening</w:t>
+      </w:r>
+      <w:r/>
+    </w:p>
+    <w:p>
+      <w:pPr>
+        <w:pStyle w:val="853"/>
+        <w:pBdr/>
+        <w:spacing/>
+        <w:ind/>
+        <w:rPr/>
+      </w:pPr>
+      <w:r>
+        <w:t xml:space="preserve">Minimale lengte voor overflow naar volgende variabele:</w:t>
+      </w:r>
+      <w:r/>
+    </w:p>
+    <w:p>
+      <w:pPr>
+        <w:pStyle w:val="853"/>
+        <w:pBdr/>
+        <w:spacing/>
+        <w:ind/>
+        <w:rPr/>
+      </w:pPr>
+      <w:r>
+        <w:t xml:space="preserve">•</w:t>
+        <w:tab/>
+        <w:t xml:space="preserve">129 bytes: buffer aangepast</w:t>
+      </w:r>
+      <w:r/>
+    </w:p>
+    <w:p>
+      <w:pPr>
+        <w:pStyle w:val="853"/>
+        <w:pBdr/>
+        <w:spacing/>
+        <w:ind/>
+        <w:rPr/>
+      </w:pPr>
+      <w:r>
+        <w:t xml:space="preserve">•</w:t>
+        <w:tab/>
+        <w:t xml:space="preserve">149 bytes: buffer2 aangepast</w:t>
+      </w:r>
+      <w:r/>
+    </w:p>
+    <w:p>
+      <w:pPr>
+        <w:pStyle w:val="853"/>
+        <w:pBdr/>
+        <w:spacing/>
+        <w:ind/>
+        <w:rPr/>
+      </w:pPr>
+      <w:r>
+        <w:t xml:space="preserve">•</w:t>
+        <w:tab/>
+        <w:t xml:space="preserve">169 bytes: klant_geverifieerd aangepast</w:t>
+      </w:r>
+      <w:r/>
+    </w:p>
+    <w:p>
+      <w:pPr>
+        <w:pStyle w:val="853"/>
+        <w:pBdr/>
+        <w:spacing/>
+        <w:ind/>
+        <w:rPr/>
+      </w:pPr>
+      <w:r>
+        <w:t xml:space="preserve">•</w:t>
+        <w:tab/>
+        <w:t xml:space="preserve">173 bytes: klantnr aangepast</w:t>
+      </w:r>
+      <w:r/>
+    </w:p>
+    <w:p>
+      <w:pPr>
+        <w:pBdr/>
+        <w:spacing/>
+        <w:ind w:firstLine="0" w:left="720"/>
+        <w:rPr/>
+      </w:pPr>
+      <w:r>
+        <w:t xml:space="preserve">•</w:t>
+        <w:tab/>
+        <w:t xml:space="preserve">189 bytes: incassorekening aangepast</w:t>
+      </w:r>
+      <w:r/>
+      <w:r>
+        <w:br/>
+        <w:br/>
+      </w:r>
+      <w:r/>
+      <w:r/>
+    </w:p>
+    <w:p>
+      <w:pPr>
+        <w:pStyle w:val="853"/>
         <w:numPr>
           <w:ilvl w:val="0"/>
           <w:numId w:val="4"/>
@@ -326,7 +690,7 @@
                         </pic:cNvPicPr>
                         <pic:nvPr/>
                       </pic:nvPicPr>
-                      <pic:blipFill rotWithShape="1">
+                      <pic:blipFill>
                         <a:blip r:embed="rId11"/>
                         <a:stretch/>
                       </pic:blipFill>
@@ -396,7 +760,7 @@
                         </pic:cNvPicPr>
                         <pic:nvPr/>
                       </pic:nvPicPr>
-                      <pic:blipFill rotWithShape="1">
+                      <pic:blipFill>
                         <a:blip r:embed="rId12"/>
                         <a:stretch/>
                       </pic:blipFill>
@@ -448,7 +812,7 @@
     </w:p>
     <w:p>
       <w:pPr>
-        <w:pStyle w:val="900"/>
+        <w:pStyle w:val="853"/>
         <w:numPr>
           <w:ilvl w:val="0"/>
           <w:numId w:val="4"/>
@@ -519,7 +883,7 @@
                         </pic:cNvPicPr>
                         <pic:nvPr/>
                       </pic:nvPicPr>
-                      <pic:blipFill rotWithShape="1">
+                      <pic:blipFill>
                         <a:blip r:embed="rId13"/>
                         <a:stretch/>
                       </pic:blipFill>
@@ -576,7 +940,7 @@
     </w:p>
     <w:p>
       <w:pPr>
-        <w:pStyle w:val="900"/>
+        <w:pStyle w:val="853"/>
         <w:numPr>
           <w:ilvl w:val="0"/>
           <w:numId w:val="4"/>
@@ -596,7 +960,7 @@
     </w:p>
     <w:p>
       <w:pPr>
-        <w:pStyle w:val="900"/>
+        <w:pStyle w:val="853"/>
         <w:numPr>
           <w:ilvl w:val="0"/>
           <w:numId w:val="4"/>
@@ -613,7 +977,7 @@
     </w:p>
     <w:p>
       <w:pPr>
-        <w:pStyle w:val="900"/>
+        <w:pStyle w:val="853"/>
         <w:pBdr/>
         <w:spacing/>
         <w:ind/>
@@ -630,7 +994,7 @@
     </w:p>
     <w:p>
       <w:pPr>
-        <w:pStyle w:val="900"/>
+        <w:pStyle w:val="853"/>
         <w:pBdr/>
         <w:spacing/>
         <w:ind/>
@@ -643,7 +1007,7 @@
     </w:p>
     <w:p>
       <w:pPr>
-        <w:pStyle w:val="900"/>
+        <w:pStyle w:val="853"/>
         <w:pBdr/>
         <w:spacing/>
         <w:ind/>
@@ -656,7 +1020,7 @@
     </w:p>
     <w:p>
       <w:pPr>
-        <w:pStyle w:val="900"/>
+        <w:pStyle w:val="853"/>
         <w:pBdr/>
         <w:spacing/>
         <w:ind/>
@@ -669,7 +1033,7 @@
     </w:p>
     <w:p>
       <w:pPr>
-        <w:pStyle w:val="900"/>
+        <w:pStyle w:val="853"/>
         <w:pBdr/>
         <w:spacing/>
         <w:ind/>
@@ -682,7 +1046,7 @@
     </w:p>
     <w:p>
       <w:pPr>
-        <w:pStyle w:val="900"/>
+        <w:pStyle w:val="853"/>
         <w:pBdr/>
         <w:spacing/>
         <w:ind/>
@@ -729,7 +1093,7 @@
                         </pic:cNvPicPr>
                         <pic:nvPr/>
                       </pic:nvPicPr>
-                      <pic:blipFill rotWithShape="1">
+                      <pic:blipFill>
                         <a:blip r:embed="rId14"/>
                         <a:stretch/>
                       </pic:blipFill>
@@ -958,6 +1322,11 @@
           <w:color w:val="4472c4" w:themeColor="accent1"/>
         </w:rPr>
       </w:r>
+      <w:r>
+        <w:rPr>
+          <w:color w:val="4472c4" w:themeColor="accent1"/>
+        </w:rPr>
+      </w:r>
     </w:p>
     <w:p>
       <w:pPr>
@@ -980,6 +1349,11 @@
           <w:color w:val="4472c4" w:themeColor="accent1"/>
         </w:rPr>
       </w:r>
+      <w:r>
+        <w:rPr>
+          <w:color w:val="4472c4" w:themeColor="accent1"/>
+        </w:rPr>
+      </w:r>
     </w:p>
     <w:p>
       <w:pPr>
@@ -1002,6 +1376,11 @@
           <w:color w:val="4472c4" w:themeColor="accent1"/>
         </w:rPr>
       </w:r>
+      <w:r>
+        <w:rPr>
+          <w:color w:val="4472c4" w:themeColor="accent1"/>
+        </w:rPr>
+      </w:r>
     </w:p>
     <w:p>
       <w:pPr>
@@ -1024,6 +1403,11 @@
           <w:color w:val="4472c4" w:themeColor="accent1"/>
         </w:rPr>
       </w:r>
+      <w:r>
+        <w:rPr>
+          <w:color w:val="4472c4" w:themeColor="accent1"/>
+        </w:rPr>
+      </w:r>
     </w:p>
     <w:p>
       <w:pPr>
@@ -1046,6 +1430,11 @@
           <w:color w:val="4472c4" w:themeColor="accent1"/>
         </w:rPr>
       </w:r>
+      <w:r>
+        <w:rPr>
+          <w:color w:val="4472c4" w:themeColor="accent1"/>
+        </w:rPr>
+      </w:r>
     </w:p>
     <w:p>
       <w:pPr>
@@ -1068,6 +1457,11 @@
           <w:color w:val="4472c4" w:themeColor="accent1"/>
         </w:rPr>
       </w:r>
+      <w:r>
+        <w:rPr>
+          <w:color w:val="4472c4" w:themeColor="accent1"/>
+        </w:rPr>
+      </w:r>
     </w:p>
     <w:p>
       <w:pPr>
@@ -1090,6 +1484,11 @@
           <w:color w:val="4472c4" w:themeColor="accent1"/>
         </w:rPr>
       </w:r>
+      <w:r>
+        <w:rPr>
+          <w:color w:val="4472c4" w:themeColor="accent1"/>
+        </w:rPr>
+      </w:r>
     </w:p>
     <w:p>
       <w:pPr>
@@ -1112,6 +1511,11 @@
           <w:color w:val="4472c4" w:themeColor="accent1"/>
         </w:rPr>
       </w:r>
+      <w:r>
+        <w:rPr>
+          <w:color w:val="4472c4" w:themeColor="accent1"/>
+        </w:rPr>
+      </w:r>
     </w:p>
     <w:p>
       <w:pPr>
@@ -1134,6 +1538,11 @@
           <w:color w:val="4472c4" w:themeColor="accent1"/>
         </w:rPr>
       </w:r>
+      <w:r>
+        <w:rPr>
+          <w:color w:val="4472c4" w:themeColor="accent1"/>
+        </w:rPr>
+      </w:r>
     </w:p>
     <w:p>
       <w:pPr>
@@ -1156,6 +1565,11 @@
           <w:color w:val="4472c4" w:themeColor="accent1"/>
         </w:rPr>
       </w:r>
+      <w:r>
+        <w:rPr>
+          <w:color w:val="4472c4" w:themeColor="accent1"/>
+        </w:rPr>
+      </w:r>
     </w:p>
     <w:p>
       <w:pPr>
@@ -1178,6 +1592,11 @@
           <w:color w:val="4472c4" w:themeColor="accent1"/>
         </w:rPr>
       </w:r>
+      <w:r>
+        <w:rPr>
+          <w:color w:val="4472c4" w:themeColor="accent1"/>
+        </w:rPr>
+      </w:r>
     </w:p>
     <w:p>
       <w:pPr>
@@ -1200,6 +1619,11 @@
           <w:color w:val="4472c4" w:themeColor="accent1"/>
         </w:rPr>
       </w:r>
+      <w:r>
+        <w:rPr>
+          <w:color w:val="4472c4" w:themeColor="accent1"/>
+        </w:rPr>
+      </w:r>
     </w:p>
     <w:p>
       <w:pPr>
@@ -1222,6 +1646,11 @@
           <w:color w:val="4472c4" w:themeColor="accent1"/>
         </w:rPr>
       </w:r>
+      <w:r>
+        <w:rPr>
+          <w:color w:val="4472c4" w:themeColor="accent1"/>
+        </w:rPr>
+      </w:r>
     </w:p>
     <w:p>
       <w:pPr>
@@ -1236,6 +1665,11 @@
         <w:rPr>
           <w:color w:val="4472c4" w:themeColor="accent1"/>
           <w:lang w:val="en-US"/>
+        </w:rPr>
+      </w:r>
+      <w:r>
+        <w:rPr>
+          <w:color w:val="4472c4" w:themeColor="accent1"/>
         </w:rPr>
       </w:r>
       <w:r>
@@ -1265,6 +1699,11 @@
           <w:color w:val="4472c4" w:themeColor="accent1"/>
         </w:rPr>
       </w:r>
+      <w:r>
+        <w:rPr>
+          <w:color w:val="4472c4" w:themeColor="accent1"/>
+        </w:rPr>
+      </w:r>
     </w:p>
     <w:p>
       <w:pPr>
@@ -1285,7 +1724,6 @@
       <w:r>
         <w:rPr>
           <w:color w:val="4472c4" w:themeColor="accent1"/>
-          <w:lang w:val="en-US"/>
         </w:rPr>
       </w:r>
       <w:r>
@@ -1357,57 +1795,278 @@
       <w:r>
         <w:t xml:space="preserve"> aanpast.</w:t>
       </w:r>
-      <w:r/>
-    </w:p>
-    <w:p>
-      <w:pPr>
-        <w:pBdr/>
-        <w:spacing/>
-        <w:ind/>
-        <w:rPr/>
-      </w:pPr>
       <w:r>
         <w:rPr>
           <w:highlight w:val="none"/>
         </w:rPr>
+      </w:r>
+    </w:p>
+    <w:p>
+      <w:pPr>
+        <w:pBdr/>
+        <w:spacing/>
+        <w:ind/>
+        <w:rPr>
+          <w:color w:val="4472c4" w:themeColor="accent1"/>
+        </w:rPr>
+      </w:pPr>
+      <w:r>
+        <w:rPr>
+          <w:color w:val="4472c4" w:themeColor="accent1"/>
+          <w:highlight w:val="none"/>
+        </w:rPr>
         <w:t xml:space="preserve">klantnr 1234</w:t>
       </w:r>
-      <w:r/>
+      <w:r>
+        <w:rPr>
+          <w:color w:val="4472c4" w:themeColor="accent1"/>
+        </w:rPr>
+      </w:r>
     </w:p>
     <w:p>
       <w:pPr>
         <w:pBdr/>
         <w:spacing/>
         <w:ind/>
-        <w:rPr/>
+        <w:rPr>
+          <w:color w:val="4472c4" w:themeColor="accent1"/>
+        </w:rPr>
       </w:pPr>
       <w:r>
         <w:rPr>
+          <w:color w:val="4472c4" w:themeColor="accent1"/>
           <w:highlight w:val="none"/>
         </w:rPr>
         <w:t xml:space="preserve">Artikelnr Aantal</w:t>
       </w:r>
-      <w:r/>
+      <w:r>
+        <w:rPr>
+          <w:color w:val="4472c4" w:themeColor="accent1"/>
+        </w:rPr>
+      </w:r>
     </w:p>
     <w:p>
       <w:pPr>
         <w:pBdr/>
         <w:spacing/>
         <w:ind/>
-        <w:rPr/>
+        <w:rPr>
+          <w:color w:val="4472c4" w:themeColor="accent1"/>
+        </w:rPr>
       </w:pPr>
       <w:r>
         <w:rPr>
+          <w:color w:val="4472c4" w:themeColor="accent1"/>
           <w:highlight w:val="none"/>
         </w:rPr>
         <w:t xml:space="preserve">BBBBBBBBBBBBBBBBBB2025-01-01 5</w:t>
+      </w:r>
+      <w:r>
+        <w:rPr>
+          <w:color w:val="4472c4" w:themeColor="accent1"/>
+          <w:highlight w:val="none"/>
+        </w:rPr>
+      </w:r>
+      <w:r>
+        <w:rPr>
+          <w:color w:val="4472c4" w:themeColor="accent1"/>
+        </w:rPr>
+      </w:r>
+    </w:p>
+    <w:p>
+      <w:pPr>
+        <w:pBdr/>
+        <w:spacing/>
+        <w:ind/>
+        <w:rPr/>
+      </w:pPr>
+      <w:r>
+        <w:rPr>
+          <w:lang w:val="en-GB"/>
+        </w:rPr>
+      </w:r>
+      <w:r/>
+      <w:r>
+        <mc:AlternateContent>
+          <mc:Choice Requires="wpg">
+            <w:drawing>
+              <wp:inline xmlns:wp="http://schemas.openxmlformats.org/drawingml/2006/wordprocessingDrawing" distT="0" distB="0" distL="0" distR="0">
+                <wp:extent cx="5731510" cy="1044846"/>
+                <wp:effectExtent l="0" t="0" r="0" b="0"/>
+                <wp:docPr id="7" name=""/>
+                <wp:cNvGraphicFramePr>
+                  <a:graphicFrameLocks xmlns:a="http://schemas.openxmlformats.org/drawingml/2006/main" noChangeAspect="1"/>
+                </wp:cNvGraphicFramePr>
+                <a:graphic xmlns:a="http://schemas.openxmlformats.org/drawingml/2006/main">
+                  <a:graphicData uri="http://schemas.openxmlformats.org/drawingml/2006/picture">
+                    <pic:pic xmlns:pic="http://schemas.openxmlformats.org/drawingml/2006/picture">
+                      <pic:nvPicPr>
+                        <pic:cNvPr id="38141314" name=""/>
+                        <pic:cNvPicPr>
+                          <a:picLocks noChangeAspect="1"/>
+                        </pic:cNvPicPr>
+                        <pic:nvPr/>
+                      </pic:nvPicPr>
+                      <pic:blipFill>
+                        <a:blip r:embed="rId15"/>
+                        <a:stretch/>
+                      </pic:blipFill>
+                      <pic:spPr bwMode="auto">
+                        <a:xfrm>
+                          <a:off x="0" y="0"/>
+                          <a:ext cx="5731509" cy="1044845"/>
+                        </a:xfrm>
+                        <a:prstGeom prst="rect">
+                          <a:avLst/>
+                        </a:prstGeom>
+                      </pic:spPr>
+                    </pic:pic>
+                  </a:graphicData>
+                </a:graphic>
+              </wp:inline>
+            </w:drawing>
+          </mc:Choice>
+          <mc:Fallback>
+            <w:pict>
+              <v:shapetype id="_x0000_t75" coordsize="21600,21600" o:spt="75" o:preferrelative="t" path="m@4@5l@4@11@9@11@9@5xe" filled="f" stroked="f">
+                <v:stroke joinstyle="miter"/>
+                <v:formulas>
+                  <v:f eqn="if lineDrawn pixelLineWidth 0"/>
+                  <v:f eqn="sum @0 1 0"/>
+                  <v:f eqn="sum 0 0 @1"/>
+                  <v:f eqn="prod @2 1 2"/>
+                  <v:f eqn="prod @3 21600 pixelWidth"/>
+                  <v:f eqn="prod @3 21600 pixelHeight"/>
+                  <v:f eqn="sum @0 0 1"/>
+                  <v:f eqn="prod @6 1 2"/>
+                  <v:f eqn="prod @7 21600 pixelWidth"/>
+                  <v:f eqn="sum @8 21600 0"/>
+                  <v:f eqn="prod @7 21600 pixelHeight"/>
+                  <v:f eqn="sum @10 21600 0"/>
+                </v:formulas>
+                <v:path o:extrusionok="f" gradientshapeok="t" o:connecttype="rect"/>
+                <o:lock v:ext="edit" aspectratio="t"/>
+              </v:shapetype>
+              <v:shape id="_x0000_i6" o:spid="_x0000_s6" type="#_x0000_t75" style="width:451.30pt;height:82.27pt;mso-wrap-distance-left:0.00pt;mso-wrap-distance-top:0.00pt;mso-wrap-distance-right:0.00pt;mso-wrap-distance-bottom:0.00pt;z-index:1;" stroked="false">
+                <v:imagedata r:id="rId15" o:title=""/>
+                <o:lock v:ext="edit" rotation="t"/>
+              </v:shape>
+            </w:pict>
+          </mc:Fallback>
+        </mc:AlternateContent>
       </w:r>
       <w:r/>
       <w:r>
         <w:rPr>
           <w:highlight w:val="none"/>
+          <w:lang w:val="en-GB"/>
         </w:rPr>
       </w:r>
+      <w:r>
+        <w:rPr>
+          <w:highlight w:val="none"/>
+          <w:lang w:val="en-GB"/>
+        </w:rPr>
+      </w:r>
+      <w:r/>
+    </w:p>
+    <w:p>
+      <w:pPr>
+        <w:pBdr/>
+        <w:spacing/>
+        <w:ind/>
+        <w:rPr>
+          <w:highlight w:val="none"/>
+          <w:lang w:val="en-GB"/>
+        </w:rPr>
+      </w:pPr>
+      <w:r/>
+      <w:r>
+        <mc:AlternateContent>
+          <mc:Choice Requires="wpg">
+            <w:drawing>
+              <wp:inline xmlns:wp="http://schemas.openxmlformats.org/drawingml/2006/wordprocessingDrawing" distT="0" distB="0" distL="0" distR="0">
+                <wp:extent cx="5731510" cy="551178"/>
+                <wp:effectExtent l="0" t="0" r="0" b="0"/>
+                <wp:docPr id="8" name=""/>
+                <wp:cNvGraphicFramePr>
+                  <a:graphicFrameLocks xmlns:a="http://schemas.openxmlformats.org/drawingml/2006/main" noChangeAspect="1"/>
+                </wp:cNvGraphicFramePr>
+                <a:graphic xmlns:a="http://schemas.openxmlformats.org/drawingml/2006/main">
+                  <a:graphicData uri="http://schemas.openxmlformats.org/drawingml/2006/picture">
+                    <pic:pic xmlns:pic="http://schemas.openxmlformats.org/drawingml/2006/picture">
+                      <pic:nvPicPr>
+                        <pic:cNvPr id="245154130" name=""/>
+                        <pic:cNvPicPr>
+                          <a:picLocks noChangeAspect="1"/>
+                        </pic:cNvPicPr>
+                        <pic:nvPr/>
+                      </pic:nvPicPr>
+                      <pic:blipFill>
+                        <a:blip r:embed="rId16"/>
+                        <a:stretch/>
+                      </pic:blipFill>
+                      <pic:spPr bwMode="auto">
+                        <a:xfrm>
+                          <a:off x="0" y="0"/>
+                          <a:ext cx="5731509" cy="551178"/>
+                        </a:xfrm>
+                        <a:prstGeom prst="rect">
+                          <a:avLst/>
+                        </a:prstGeom>
+                      </pic:spPr>
+                    </pic:pic>
+                  </a:graphicData>
+                </a:graphic>
+              </wp:inline>
+            </w:drawing>
+          </mc:Choice>
+          <mc:Fallback>
+            <w:pict>
+              <v:shapetype id="_x0000_t75" coordsize="21600,21600" o:spt="75" o:preferrelative="t" path="m@4@5l@4@11@9@11@9@5xe" filled="f" stroked="f">
+                <v:stroke joinstyle="miter"/>
+                <v:formulas>
+                  <v:f eqn="if lineDrawn pixelLineWidth 0"/>
+                  <v:f eqn="sum @0 1 0"/>
+                  <v:f eqn="sum 0 0 @1"/>
+                  <v:f eqn="prod @2 1 2"/>
+                  <v:f eqn="prod @3 21600 pixelWidth"/>
+                  <v:f eqn="prod @3 21600 pixelHeight"/>
+                  <v:f eqn="sum @0 0 1"/>
+                  <v:f eqn="prod @6 1 2"/>
+                  <v:f eqn="prod @7 21600 pixelWidth"/>
+                  <v:f eqn="sum @8 21600 0"/>
+                  <v:f eqn="prod @7 21600 pixelHeight"/>
+                  <v:f eqn="sum @10 21600 0"/>
+                </v:formulas>
+                <v:path o:extrusionok="f" gradientshapeok="t" o:connecttype="rect"/>
+                <o:lock v:ext="edit" aspectratio="t"/>
+              </v:shapetype>
+              <v:shape id="_x0000_i7" o:spid="_x0000_s7" type="#_x0000_t75" style="width:451.30pt;height:43.40pt;mso-wrap-distance-left:0.00pt;mso-wrap-distance-top:0.00pt;mso-wrap-distance-right:0.00pt;mso-wrap-distance-bottom:0.00pt;z-index:1;" stroked="false">
+                <v:imagedata r:id="rId16" o:title=""/>
+                <o:lock v:ext="edit" rotation="t"/>
+              </v:shape>
+            </w:pict>
+          </mc:Fallback>
+        </mc:AlternateContent>
+      </w:r>
+      <w:r/>
+      <w:r>
+        <w:rPr>
+          <w:lang w:val="en-GB"/>
+        </w:rPr>
+        <w:br/>
+      </w:r>
+      <w:r/>
+      <w:r/>
+    </w:p>
+    <w:p>
+      <w:pPr>
+        <w:pBdr/>
+        <w:spacing/>
+        <w:ind/>
+        <w:rPr/>
+      </w:pPr>
       <w:r>
         <w:rPr>
           <w:highlight w:val="none"/>
@@ -1424,17 +2083,9 @@
         <w:pBdr/>
         <w:spacing/>
         <w:ind/>
-        <w:rPr/>
-      </w:pPr>
-      <w:r/>
-      <w:r/>
-    </w:p>
-    <w:p>
-      <w:pPr>
-        <w:pBdr/>
-        <w:spacing/>
-        <w:ind/>
-        <w:rPr/>
+        <w:rPr>
+          <w:highlight w:val="none"/>
+        </w:rPr>
       </w:pPr>
       <w:r>
         <w:t xml:space="preserve">Opdracht</w:t>
@@ -1473,8 +2124,159 @@
         <w:pBdr/>
         <w:spacing/>
         <w:ind/>
+        <w:rPr>
+          <w:rFonts w:ascii="Calibri" w:hAnsi="Calibri" w:cs="Calibri"/>
+          <w:color w:val="4472c4" w:themeColor="accent1"/>
+          <w:sz w:val="22"/>
+          <w:szCs w:val="22"/>
+        </w:rPr>
+      </w:pPr>
+      <w:r>
+        <w:rPr>
+          <w:rFonts w:ascii="Calibri" w:hAnsi="Calibri" w:eastAsia="Calibri" w:cs="Calibri"/>
+          <w:color w:val="4472c4" w:themeColor="accent1"/>
+          <w:sz w:val="22"/>
+          <w:szCs w:val="22"/>
+          <w:lang w:val="en-GB"/>
+        </w:rPr>
+        <w:t xml:space="preserve">Verander</w:t>
+      </w:r>
+      <w:r>
+        <w:rPr>
+          <w:rFonts w:ascii="Calibri" w:hAnsi="Calibri" w:eastAsia="Calibri" w:cs="Calibri"/>
+          <w:color w:val="4472c4" w:themeColor="accent1"/>
+          <w:sz w:val="22"/>
+          <w:szCs w:val="22"/>
+        </w:rPr>
+      </w:r>
+    </w:p>
+    <w:p>
+      <w:pPr>
+        <w:pBdr/>
+        <w:spacing/>
+        <w:ind/>
+        <w:rPr>
+          <w:rFonts w:ascii="Calibri" w:hAnsi="Calibri" w:cs="Calibri"/>
+          <w:color w:val="4472c4" w:themeColor="accent1"/>
+          <w:sz w:val="22"/>
+          <w:szCs w:val="22"/>
+        </w:rPr>
+      </w:pPr>
+      <w:r>
+        <w:rPr>
+          <w:rFonts w:ascii="Calibri" w:hAnsi="Calibri" w:eastAsia="Calibri" w:cs="Calibri"/>
+          <w:color w:val="4472c4" w:themeColor="accent1"/>
+          <w:sz w:val="22"/>
+          <w:szCs w:val="22"/>
+          <w:lang w:val="en-GB"/>
+        </w:rPr>
+      </w:r>
+      <w:r>
+        <w:rPr>
+          <w:rFonts w:ascii="Calibri" w:hAnsi="Calibri" w:eastAsia="Calibri" w:cs="Calibri"/>
+          <w:color w:val="4472c4" w:themeColor="accent1"/>
+          <w:sz w:val="22"/>
+          <w:szCs w:val="22"/>
+        </w:rPr>
+        <w:t xml:space="preserve">memcpy(klantnr, buffer2, sizeof(</w:t>
+      </w:r>
+      <w:r>
+        <w:rPr>
+          <w:rFonts w:ascii="Calibri" w:hAnsi="Calibri" w:eastAsia="Calibri" w:cs="Calibri"/>
+          <w:color w:val="4472c4" w:themeColor="accent1"/>
+          <w:sz w:val="22"/>
+          <w:szCs w:val="22"/>
+        </w:rPr>
+        <w:t xml:space="preserve">klantnr</w:t>
+      </w:r>
+      <w:r>
+        <w:rPr>
+          <w:rFonts w:ascii="Calibri" w:hAnsi="Calibri" w:eastAsia="Calibri" w:cs="Calibri"/>
+          <w:color w:val="4472c4" w:themeColor="accent1"/>
+          <w:sz w:val="22"/>
+          <w:szCs w:val="22"/>
+        </w:rPr>
+        <w:t xml:space="preserve">));  // BUG: copies 20 bytes into 16-byte buffer!</w:t>
+      </w:r>
+      <w:r>
+        <w:rPr>
+          <w:rFonts w:ascii="Calibri" w:hAnsi="Calibri" w:eastAsia="Calibri" w:cs="Calibri"/>
+          <w:color w:val="4472c4" w:themeColor="accent1"/>
+          <w:sz w:val="22"/>
+          <w:szCs w:val="22"/>
+          <w:lang w:val="en-GB"/>
+        </w:rPr>
+      </w:r>
+      <w:r>
+        <w:rPr>
+          <w:rFonts w:ascii="Calibri" w:hAnsi="Calibri" w:eastAsia="Calibri" w:cs="Calibri"/>
+          <w:color w:val="4472c4" w:themeColor="accent1"/>
+          <w:sz w:val="22"/>
+          <w:szCs w:val="22"/>
+        </w:rPr>
+      </w:r>
+    </w:p>
+    <w:p>
+      <w:pPr>
+        <w:pBdr/>
+        <w:spacing/>
+        <w:ind/>
         <w:rPr/>
       </w:pPr>
+      <w:r>
+        <w:rPr>
+          <w:rFonts w:ascii="Calibri" w:hAnsi="Calibri" w:eastAsia="Calibri" w:cs="Calibri"/>
+          <w:color w:val="4472c4" w:themeColor="accent1"/>
+          <w:sz w:val="22"/>
+          <w:szCs w:val="22"/>
+          <w:lang w:val="en-GB"/>
+        </w:rPr>
+        <w:t xml:space="preserve">to</w:t>
+        <w:br/>
+      </w:r>
+      <w:r>
+        <w:rPr>
+          <w:rFonts w:ascii="Calibri" w:hAnsi="Calibri" w:eastAsia="Calibri" w:cs="Calibri"/>
+          <w:color w:val="4472c4" w:themeColor="accent1"/>
+          <w:sz w:val="22"/>
+          <w:szCs w:val="22"/>
+        </w:rPr>
+        <w:t xml:space="preserve">strncpy(klantnr, buffer2, sizeof(klantnr) - 1); klantnr[sizeof(klantnr) - 1] = </w:t>
+      </w:r>
+      <w:r>
+        <w:rPr>
+          <w:rFonts w:ascii="Calibri" w:hAnsi="Calibri" w:eastAsia="Calibri" w:cs="Calibri"/>
+          <w:color w:val="4472c4" w:themeColor="accent1"/>
+          <w:sz w:val="22"/>
+          <w:szCs w:val="22"/>
+        </w:rPr>
+        <w:t xml:space="preserve">'\0'</w:t>
+      </w:r>
+      <w:r>
+        <w:rPr>
+          <w:rFonts w:ascii="Calibri" w:hAnsi="Calibri" w:eastAsia="Calibri" w:cs="Calibri"/>
+          <w:color w:val="4472c4" w:themeColor="accent1"/>
+          <w:sz w:val="22"/>
+          <w:szCs w:val="22"/>
+        </w:rPr>
+        <w:t xml:space="preserve">;</w:t>
+      </w:r>
+      <w:r>
+        <w:rPr>
+          <w:rFonts w:ascii="Calibri" w:hAnsi="Calibri" w:eastAsia="Calibri" w:cs="Calibri"/>
+          <w:color w:val="4472c4" w:themeColor="accent1"/>
+          <w:sz w:val="22"/>
+          <w:szCs w:val="22"/>
+          <w:lang w:val="en-GB"/>
+        </w:rPr>
+        <w:t xml:space="preserve"> </w:t>
+      </w:r>
+      <w:r>
+        <w:rPr>
+          <w:lang w:val="en-GB"/>
+        </w:rPr>
+        <w:br/>
+      </w:r>
       <w:r/>
       <w:r/>
     </w:p>
@@ -1530,13 +2332,15 @@
         </w:pBdr>
         <w:spacing w:after="240" w:before="0"/>
         <w:ind w:right="0" w:firstLine="0" w:left="0"/>
-        <w:rPr/>
+        <w:rPr>
+          <w:color w:val="4472c4" w:themeColor="accent1"/>
+        </w:rPr>
       </w:pPr>
       <w:r>
         <w:rPr>
           <w:rFonts w:ascii="Times New Roman" w:hAnsi="Times New Roman" w:eastAsia="Times New Roman" w:cs="Times New Roman"/>
           <w:b/>
-          <w:color w:val="000000"/>
+          <w:color w:val="4472c4" w:themeColor="accent1"/>
           <w:sz w:val="24"/>
         </w:rPr>
         <w:t xml:space="preserve">BUG GEVONDEN!</w:t>
@@ -1544,7 +2348,7 @@
       <w:r>
         <w:rPr>
           <w:rFonts w:ascii="Times New Roman" w:hAnsi="Times New Roman" w:eastAsia="Times New Roman" w:cs="Times New Roman"/>
-          <w:color w:val="000000"/>
+          <w:color w:val="4472c4" w:themeColor="accent1"/>
           <w:sz w:val="24"/>
         </w:rPr>
         <w:t xml:space="preserve"> Op regel 182-184:</w:t>
@@ -1552,107 +2356,183 @@
       <w:r>
         <w:rPr>
           <w:rFonts w:ascii="Times New Roman" w:hAnsi="Times New Roman" w:eastAsia="Times New Roman" w:cs="Times New Roman"/>
+          <w:color w:val="4472c4" w:themeColor="accent1"/>
           <w:sz w:val="24"/>
         </w:rPr>
       </w:r>
-      <w:r/>
+      <w:r>
+        <w:rPr>
+          <w:color w:val="4472c4" w:themeColor="accent1"/>
+        </w:rPr>
+      </w:r>
     </w:p>
     <w:p>
       <w:pPr>
         <w:pBdr/>
         <w:spacing/>
         <w:ind/>
-        <w:rPr/>
+        <w:rPr>
+          <w:color w:val="4472c4" w:themeColor="accent1"/>
+        </w:rPr>
       </w:pPr>
       <w:r>
+        <w:rPr>
+          <w:color w:val="4472c4" w:themeColor="accent1"/>
+        </w:rPr>
         <w:t xml:space="preserve">if (!klant_geverifieerd) {</w:t>
       </w:r>
-      <w:r/>
+      <w:r>
+        <w:rPr>
+          <w:color w:val="4472c4" w:themeColor="accent1"/>
+        </w:rPr>
+      </w:r>
     </w:p>
     <w:p>
       <w:pPr>
         <w:pBdr/>
         <w:spacing/>
         <w:ind/>
-        <w:rPr/>
+        <w:rPr>
+          <w:color w:val="4472c4" w:themeColor="accent1"/>
+        </w:rPr>
       </w:pPr>
       <w:r>
+        <w:rPr>
+          <w:color w:val="4472c4" w:themeColor="accent1"/>
+        </w:rPr>
         <w:t xml:space="preserve">    printf("Onbekende klant. Bestelling geannuleerd\n");</w:t>
       </w:r>
-      <w:r/>
+      <w:r>
+        <w:rPr>
+          <w:color w:val="4472c4" w:themeColor="accent1"/>
+        </w:rPr>
+      </w:r>
     </w:p>
     <w:p>
       <w:pPr>
         <w:pBdr/>
         <w:spacing/>
         <w:ind/>
-        <w:rPr/>
+        <w:rPr>
+          <w:color w:val="4472c4" w:themeColor="accent1"/>
+        </w:rPr>
       </w:pPr>
       <w:r>
-        <w:t xml:space="preserve">}</w:t>
-      </w:r>
-      <w:r/>
-    </w:p>
-    <w:p>
-      <w:pPr>
-        <w:pBdr/>
-        <w:spacing/>
-        <w:ind/>
-        <w:rPr/>
-      </w:pPr>
-      <w:r>
-        <w:t xml:space="preserve">else {</w:t>
-      </w:r>
-      <w:r/>
-    </w:p>
-    <w:p>
-      <w:pPr>
-        <w:pBdr/>
-        <w:spacing/>
-        <w:ind/>
-        <w:rPr/>
-      </w:pPr>
-      <w:r>
-        <w:t xml:space="preserve">    // Order wordt TOCH verwerkt!</w:t>
-      </w:r>
-      <w:r/>
-    </w:p>
-    <w:p>
-      <w:pPr>
-        <w:pBdr/>
-        <w:spacing/>
-        <w:ind/>
-        <w:rPr/>
-      </w:pPr>
-      <w:r>
-        <w:t xml:space="preserve">    int prijs = berekenPrijs(bestelling, ...);</w:t>
-      </w:r>
-      <w:r/>
-    </w:p>
-    <w:p>
-      <w:pPr>
-        <w:pBdr/>
-        <w:spacing/>
-        <w:ind/>
-        <w:rPr/>
-      </w:pPr>
-      <w:r>
-        <w:t xml:space="preserve">    printf("Order ok\n");</w:t>
-      </w:r>
-      <w:r/>
-    </w:p>
-    <w:p>
-      <w:pPr>
-        <w:pBdr/>
-        <w:spacing/>
-        <w:ind/>
-        <w:rPr/>
-      </w:pPr>
-      <w:r>
+        <w:rPr>
+          <w:color w:val="4472c4" w:themeColor="accent1"/>
+        </w:rPr>
         <w:t xml:space="preserve">}</w:t>
       </w:r>
       <w:r>
+        <w:rPr>
+          <w:color w:val="4472c4" w:themeColor="accent1"/>
+        </w:rPr>
+      </w:r>
+    </w:p>
+    <w:p>
+      <w:pPr>
+        <w:pBdr/>
+        <w:spacing/>
+        <w:ind/>
+        <w:rPr>
+          <w:color w:val="4472c4" w:themeColor="accent1"/>
+        </w:rPr>
+      </w:pPr>
+      <w:r>
+        <w:rPr>
+          <w:color w:val="4472c4" w:themeColor="accent1"/>
+        </w:rPr>
+        <w:t xml:space="preserve">else {</w:t>
+      </w:r>
+      <w:r>
+        <w:rPr>
+          <w:color w:val="4472c4" w:themeColor="accent1"/>
+        </w:rPr>
+      </w:r>
+    </w:p>
+    <w:p>
+      <w:pPr>
+        <w:pBdr/>
+        <w:spacing/>
+        <w:ind/>
+        <w:rPr>
+          <w:color w:val="4472c4" w:themeColor="accent1"/>
+        </w:rPr>
+      </w:pPr>
+      <w:r>
+        <w:rPr>
+          <w:color w:val="4472c4" w:themeColor="accent1"/>
+        </w:rPr>
+        <w:t xml:space="preserve">    // Order wordt TOCH verwerkt!</w:t>
+      </w:r>
+      <w:r>
+        <w:rPr>
+          <w:color w:val="4472c4" w:themeColor="accent1"/>
+        </w:rPr>
+      </w:r>
+    </w:p>
+    <w:p>
+      <w:pPr>
+        <w:pBdr/>
+        <w:spacing/>
+        <w:ind/>
+        <w:rPr>
+          <w:color w:val="4472c4" w:themeColor="accent1"/>
+        </w:rPr>
+      </w:pPr>
+      <w:r>
+        <w:rPr>
+          <w:color w:val="4472c4" w:themeColor="accent1"/>
+        </w:rPr>
+        <w:t xml:space="preserve">    int prijs = berekenPrijs(bestelling, ...);</w:t>
+      </w:r>
+      <w:r>
+        <w:rPr>
+          <w:color w:val="4472c4" w:themeColor="accent1"/>
+        </w:rPr>
+      </w:r>
+    </w:p>
+    <w:p>
+      <w:pPr>
+        <w:pBdr/>
+        <w:spacing/>
+        <w:ind/>
+        <w:rPr>
+          <w:color w:val="4472c4" w:themeColor="accent1"/>
+        </w:rPr>
+      </w:pPr>
+      <w:r>
+        <w:rPr>
+          <w:color w:val="4472c4" w:themeColor="accent1"/>
+        </w:rPr>
+        <w:t xml:space="preserve">    printf("Order ok\n");</w:t>
+      </w:r>
+      <w:r>
+        <w:rPr>
+          <w:color w:val="4472c4" w:themeColor="accent1"/>
+        </w:rPr>
+      </w:r>
+    </w:p>
+    <w:p>
+      <w:pPr>
+        <w:pBdr/>
+        <w:spacing/>
+        <w:ind/>
+        <w:rPr/>
+      </w:pPr>
+      <w:r>
+        <w:rPr>
+          <w:color w:val="4472c4" w:themeColor="accent1"/>
+        </w:rPr>
+        <w:t xml:space="preserve">}</w:t>
+      </w:r>
+      <w:r>
+        <w:rPr>
+          <w:color w:val="4472c4" w:themeColor="accent1"/>
+        </w:rPr>
         <w:br/>
+      </w:r>
+      <w:r>
         <w:br/>
       </w:r>
       <w:r>
@@ -1713,7 +2593,6 @@
         <w:t xml:space="preserve">if (!klant_geverifieerd) {</w:t>
       </w:r>
       <w:r/>
-      <w:r/>
     </w:p>
     <w:p>
       <w:pPr>
@@ -1748,7 +2627,6 @@
         <w:t xml:space="preserve">}</w:t>
       </w:r>
       <w:r/>
-      <w:r/>
     </w:p>
     <w:p>
       <w:pPr>
@@ -1761,7 +2639,6 @@
         <w:t xml:space="preserve">else {</w:t>
       </w:r>
       <w:r/>
-      <w:r/>
     </w:p>
     <w:p>
       <w:pPr>
@@ -1774,7 +2651,6 @@
         <w:t xml:space="preserve">    // Order wordt TOCH verwerkt!</w:t>
       </w:r>
       <w:r/>
-      <w:r/>
     </w:p>
     <w:p>
       <w:pPr>
@@ -1787,7 +2663,6 @@
         <w:t xml:space="preserve">    int prijs = berekenPrijs(bestelling, ...);</w:t>
       </w:r>
       <w:r/>
-      <w:r/>
     </w:p>
     <w:p>
       <w:pPr>
@@ -1799,7 +2674,6 @@
       <w:r>
         <w:t xml:space="preserve">    printf("Order ok\n");</w:t>
       </w:r>
-      <w:r/>
       <w:r/>
     </w:p>
     <w:p>
@@ -1833,31 +2707,6 @@
           <w:highlight w:val="none"/>
         </w:rPr>
       </w:r>
-      <w:r>
-        <w:rPr>
-          <w:highlight w:val="none"/>
-        </w:rPr>
-      </w:r>
-      <w:r>
-        <w:rPr>
-          <w:highlight w:val="none"/>
-        </w:rPr>
-      </w:r>
-      <w:r>
-        <w:rPr>
-          <w:highlight w:val="none"/>
-        </w:rPr>
-      </w:r>
-      <w:r>
-        <w:rPr>
-          <w:highlight w:val="none"/>
-        </w:rPr>
-      </w:r>
-      <w:r>
-        <w:rPr>
-          <w:highlight w:val="none"/>
-        </w:rPr>
-      </w:r>
     </w:p>
     <w:p>
       <w:pPr>
@@ -1876,11 +2725,213 @@
         <w:pBdr/>
         <w:spacing/>
         <w:ind/>
-        <w:rPr/>
+        <w:rPr>
+          <w:color w:val="4472c4" w:themeColor="accent1"/>
+        </w:rPr>
       </w:pPr>
       <w:r>
         <w:t xml:space="preserve">Laat zien dat je mbv een overflow een ander aantal kan bestellen dan in het bestand staat.</w:t>
+        <w:br/>
       </w:r>
+      <w:r>
+        <w:rPr>
+          <w:color w:val="4472c4" w:themeColor="accent1"/>
+        </w:rPr>
+        <w:t xml:space="preserve">Kwetsbaarheid: artikelnr[8] buffer overloopt naar adjacent int aantal via onbeveiligde fscanf:</w:t>
+        <w:br/>
+      </w:r>
+      <w:r>
+        <w:rPr>
+          <w:color w:val="4472c4" w:themeColor="accent1"/>
+        </w:rPr>
+        <w:t xml:space="preserve">while (fscanf(f, " %s %d", artikelnr, &amp;aantal) == 2) {  // Regel 107 - GEEN lengtelimiet!</w:t>
+      </w:r>
+      <w:r>
+        <w:rPr>
+          <w:color w:val="4472c4" w:themeColor="accent1"/>
+        </w:rPr>
+        <w:br/>
+      </w:r>
+      <w:r/>
+      <w:r>
+        <w:rPr>
+          <w:color w:val="4472c4" w:themeColor="accent1"/>
+        </w:rPr>
+      </w:r>
+      <w:r>
+        <w:rPr>
+          <w:color w:val="4472c4" w:themeColor="accent1"/>
+          <w:highlight w:val="none"/>
+        </w:rPr>
+      </w:r>
+      <w:r>
+        <w:rPr>
+          <w:color w:val="4472c4" w:themeColor="accent1"/>
+          <w:highlight w:val="none"/>
+        </w:rPr>
+        <w:t xml:space="preserve">Exploit - Schadelijk invoerbestand:</w:t>
+      </w:r>
+      <w:r>
+        <w:rPr>
+          <w:color w:val="4472c4" w:themeColor="accent1"/>
+        </w:rPr>
+      </w:r>
+      <w:r>
+        <w:rPr>
+          <w:color w:val="4472c4" w:themeColor="accent1"/>
+        </w:rPr>
+      </w:r>
+    </w:p>
+    <w:p>
+      <w:pPr>
+        <w:pBdr/>
+        <w:spacing/>
+        <w:ind/>
+        <w:rPr>
+          <w:color w:val="4472c4" w:themeColor="accent1"/>
+        </w:rPr>
+      </w:pPr>
+      <w:r>
+        <w:rPr>
+          <w:color w:val="4472c4" w:themeColor="accent1"/>
+          <w:highlight w:val="none"/>
+        </w:rPr>
+        <w:t xml:space="preserve">KLANT 12345</w:t>
+      </w:r>
+      <w:r>
+        <w:rPr>
+          <w:color w:val="4472c4" w:themeColor="accent1"/>
+        </w:rPr>
+      </w:r>
+    </w:p>
+    <w:p>
+      <w:pPr>
+        <w:pBdr/>
+        <w:spacing/>
+        <w:ind/>
+        <w:rPr>
+          <w:color w:val="4472c4" w:themeColor="accent1"/>
+        </w:rPr>
+      </w:pPr>
+      <w:r>
+        <w:rPr>
+          <w:color w:val="4472c4" w:themeColor="accent1"/>
+          <w:highlight w:val="none"/>
+        </w:rPr>
+        <w:t xml:space="preserve">DATUM HEADER</w:t>
+      </w:r>
+      <w:r>
+        <w:rPr>
+          <w:color w:val="4472c4" w:themeColor="accent1"/>
+        </w:rPr>
+      </w:r>
+    </w:p>
+    <w:p>
+      <w:pPr>
+        <w:pBdr/>
+        <w:spacing/>
+        <w:ind/>
+        <w:rPr>
+          <w:color w:val="4472c4" w:themeColor="accent1"/>
+        </w:rPr>
+      </w:pPr>
+      <w:r>
+        <w:rPr>
+          <w:color w:val="4472c4" w:themeColor="accent1"/>
+          <w:highlight w:val="none"/>
+        </w:rPr>
+        <w:t xml:space="preserve">AAAAAAAA\xFF\x0F\x00\x00 100</w:t>
+      </w:r>
+      <w:r>
+        <w:rPr>
+          <w:color w:val="4472c4" w:themeColor="accent1"/>
+          <w:highlight w:val="none"/>
+        </w:rPr>
+        <w:br/>
+      </w:r>
+      <w:r>
+        <w:rPr>
+          <w:color w:val="4472c4" w:themeColor="accent1"/>
+          <w:highlight w:val="none"/>
+        </w:rPr>
+        <w:t xml:space="preserve">De 8 A's vullen artikelnr[8], daarna overloopt \xFF\x0F\x00\x00 en stelt aantal = 4095 in plaats van 100.</w:t>
+      </w:r>
+      <w:r>
+        <w:rPr>
+          <w:color w:val="4472c4" w:themeColor="accent1"/>
+        </w:rPr>
+      </w:r>
+    </w:p>
+    <w:p>
+      <w:pPr>
+        <w:pBdr/>
+        <w:spacing/>
+        <w:ind/>
+        <w:rPr>
+          <w:color w:val="4472c4" w:themeColor="accent1"/>
+          <w:highlight w:val="none"/>
+        </w:rPr>
+      </w:pPr>
+      <w:r>
+        <w:rPr>
+          <w:color w:val="4472c4" w:themeColor="accent1"/>
+          <w:highlight w:val="none"/>
+        </w:rPr>
+        <w:t xml:space="preserve">Fix (1 regel wijziging):</w:t>
+      </w:r>
+      <w:r>
+        <w:rPr>
+          <w:color w:val="4472c4" w:themeColor="accent1"/>
+          <w:highlight w:val="none"/>
+        </w:rPr>
+        <w:br/>
+      </w:r>
+      <w:r>
+        <w:rPr>
+          <w:color w:val="4472c4" w:themeColor="accent1"/>
+          <w:highlight w:val="none"/>
+        </w:rPr>
+        <w:t xml:space="preserve">while (fscanf(f, " %7s %d", artikelnr, &amp;aantal) == 2) {</w:t>
+      </w:r>
+      <w:r>
+        <w:rPr>
+          <w:color w:val="4472c4" w:themeColor="accent1"/>
+          <w:highlight w:val="none"/>
+        </w:rPr>
+      </w:r>
+      <w:r>
+        <w:rPr>
+          <w:color w:val="4472c4" w:themeColor="accent1"/>
+        </w:rPr>
+      </w:r>
+    </w:p>
+    <w:p>
+      <w:pPr>
+        <w:pBdr/>
+        <w:spacing/>
+        <w:ind/>
+        <w:rPr/>
+      </w:pPr>
+      <w:r>
+        <w:rPr>
+          <w:color w:val="4472c4" w:themeColor="accent1"/>
+          <w:highlight w:val="none"/>
+        </w:rPr>
+      </w:r>
+      <w:r>
+        <w:rPr>
+          <w:color w:val="4472c4" w:themeColor="accent1"/>
+          <w:highlight w:val="none"/>
+        </w:rPr>
+        <w:t xml:space="preserve">Voeg 7 lengtespecificatie toe: %7s in plaats van %s</w:t>
+      </w:r>
+      <w:r>
+        <w:rPr>
+          <w:highlight w:val="none"/>
+        </w:rPr>
+        <w:br/>
+      </w:r>
+      <w:r/>
       <w:r/>
     </w:p>
     <w:p>
@@ -1888,7 +2939,9 @@
         <w:pBdr/>
         <w:spacing/>
         <w:ind/>
-        <w:rPr/>
+        <w:rPr>
+          <w:highlight w:val="none"/>
+        </w:rPr>
       </w:pPr>
       <w:r>
         <w:t xml:space="preserve">Uitdaging: geef het aantal een bewuste waarde. Bijvoorbeeld 100 ipv 5</w:t>
@@ -1917,8 +2970,6 @@
       <w:r>
         <w:t xml:space="preserve">niet een toets voor iedere byte waard</w:t>
       </w:r>
-      <w:r/>
-      <w:r/>
       <w:r/>
     </w:p>
     <w:p>
@@ -1935,7 +2986,7 @@
       <w:footnotePr/>
       <w:endnotePr/>
       <w:type w:val="nextPage"/>
-      <w:pgSz w:h="16838" w:orient="portrait" w:w="11906"/>
+      <w:pgSz w:h="16838" w:orient="landscape" w:w="11906"/>
       <w:pgMar w:top="1440" w:right="1440" w:bottom="1440" w:left="1440" w:header="708" w:footer="708" w:gutter="0"/>
       <w:cols w:num="1" w:sep="0" w:space="708" w:equalWidth="1"/>
     </w:sectPr>
@@ -2579,6 +3630,390 @@
       <w:suff w:val="tab"/>
     </w:lvl>
   </w:abstractNum>
+  <w:abstractNum w:abstractNumId="4">
+    <w:lvl w:ilvl="0">
+      <w:isLgl w:val="false"/>
+      <w:lvlJc w:val="left"/>
+      <w:lvlText w:val="%1)"/>
+      <w:numFmt w:val="upperLetter"/>
+      <w:pPr>
+        <w:pBdr/>
+        <w:spacing/>
+        <w:ind w:hanging="360" w:left="1429"/>
+      </w:pPr>
+      <w:rPr/>
+      <w:start w:val="1"/>
+      <w:suff w:val="tab"/>
+    </w:lvl>
+    <w:lvl w:ilvl="1">
+      <w:isLgl w:val="false"/>
+      <w:lvlJc w:val="left"/>
+      <w:lvlText w:val="%2."/>
+      <w:numFmt w:val="lowerLetter"/>
+      <w:pPr>
+        <w:pBdr/>
+        <w:spacing/>
+        <w:ind w:hanging="360" w:left="2149"/>
+      </w:pPr>
+      <w:rPr/>
+      <w:start w:val="1"/>
+      <w:suff w:val="tab"/>
+    </w:lvl>
+    <w:lvl w:ilvl="2">
+      <w:isLgl w:val="false"/>
+      <w:lvlJc w:val="right"/>
+      <w:lvlText w:val="%3."/>
+      <w:numFmt w:val="lowerRoman"/>
+      <w:pPr>
+        <w:pBdr/>
+        <w:spacing/>
+        <w:ind w:hanging="180" w:left="2869"/>
+      </w:pPr>
+      <w:rPr/>
+      <w:start w:val="1"/>
+      <w:suff w:val="tab"/>
+    </w:lvl>
+    <w:lvl w:ilvl="3">
+      <w:isLgl w:val="false"/>
+      <w:lvlJc w:val="left"/>
+      <w:lvlText w:val="%4."/>
+      <w:numFmt w:val="decimal"/>
+      <w:pPr>
+        <w:pBdr/>
+        <w:spacing/>
+        <w:ind w:hanging="360" w:left="3589"/>
+      </w:pPr>
+      <w:rPr/>
+      <w:start w:val="1"/>
+      <w:suff w:val="tab"/>
+    </w:lvl>
+    <w:lvl w:ilvl="4">
+      <w:isLgl w:val="false"/>
+      <w:lvlJc w:val="left"/>
+      <w:lvlText w:val="%5."/>
+      <w:numFmt w:val="lowerLetter"/>
+      <w:pPr>
+        <w:pBdr/>
+        <w:spacing/>
+        <w:ind w:hanging="360" w:left="4309"/>
+      </w:pPr>
+      <w:rPr/>
+      <w:start w:val="1"/>
+      <w:suff w:val="tab"/>
+    </w:lvl>
+    <w:lvl w:ilvl="5">
+      <w:isLgl w:val="false"/>
+      <w:lvlJc w:val="right"/>
+      <w:lvlText w:val="%6."/>
+      <w:numFmt w:val="lowerRoman"/>
+      <w:pPr>
+        <w:pBdr/>
+        <w:spacing/>
+        <w:ind w:hanging="180" w:left="5029"/>
+      </w:pPr>
+      <w:rPr/>
+      <w:start w:val="1"/>
+      <w:suff w:val="tab"/>
+    </w:lvl>
+    <w:lvl w:ilvl="6">
+      <w:isLgl w:val="false"/>
+      <w:lvlJc w:val="left"/>
+      <w:lvlText w:val="%7."/>
+      <w:numFmt w:val="decimal"/>
+      <w:pPr>
+        <w:pBdr/>
+        <w:spacing/>
+        <w:ind w:hanging="360" w:left="5749"/>
+      </w:pPr>
+      <w:rPr/>
+      <w:start w:val="1"/>
+      <w:suff w:val="tab"/>
+    </w:lvl>
+    <w:lvl w:ilvl="7">
+      <w:isLgl w:val="false"/>
+      <w:lvlJc w:val="left"/>
+      <w:lvlText w:val="%8."/>
+      <w:numFmt w:val="lowerLetter"/>
+      <w:pPr>
+        <w:pBdr/>
+        <w:spacing/>
+        <w:ind w:hanging="360" w:left="6469"/>
+      </w:pPr>
+      <w:rPr/>
+      <w:start w:val="1"/>
+      <w:suff w:val="tab"/>
+    </w:lvl>
+    <w:lvl w:ilvl="8">
+      <w:isLgl w:val="false"/>
+      <w:lvlJc w:val="right"/>
+      <w:lvlText w:val="%9."/>
+      <w:numFmt w:val="lowerRoman"/>
+      <w:pPr>
+        <w:pBdr/>
+        <w:spacing/>
+        <w:ind w:hanging="180" w:left="7189"/>
+      </w:pPr>
+      <w:rPr/>
+      <w:start w:val="1"/>
+      <w:suff w:val="tab"/>
+    </w:lvl>
+  </w:abstractNum>
+  <w:abstractNum w:abstractNumId="5">
+    <w:lvl w:ilvl="0">
+      <w:isLgl w:val="false"/>
+      <w:lvlJc w:val="left"/>
+      <w:lvlText w:val="%1)"/>
+      <w:numFmt w:val="upperLetter"/>
+      <w:pPr>
+        <w:pBdr/>
+        <w:spacing/>
+        <w:ind w:hanging="360" w:left="1429"/>
+      </w:pPr>
+      <w:rPr/>
+      <w:start w:val="1"/>
+      <w:suff w:val="tab"/>
+    </w:lvl>
+    <w:lvl w:ilvl="1">
+      <w:isLgl w:val="false"/>
+      <w:lvlJc w:val="left"/>
+      <w:lvlText w:val="%2."/>
+      <w:numFmt w:val="lowerLetter"/>
+      <w:pPr>
+        <w:pBdr/>
+        <w:spacing/>
+        <w:ind w:hanging="360" w:left="2149"/>
+      </w:pPr>
+      <w:rPr/>
+      <w:start w:val="1"/>
+      <w:suff w:val="tab"/>
+    </w:lvl>
+    <w:lvl w:ilvl="2">
+      <w:isLgl w:val="false"/>
+      <w:lvlJc w:val="right"/>
+      <w:lvlText w:val="%3."/>
+      <w:numFmt w:val="lowerRoman"/>
+      <w:pPr>
+        <w:pBdr/>
+        <w:spacing/>
+        <w:ind w:hanging="180" w:left="2869"/>
+      </w:pPr>
+      <w:rPr/>
+      <w:start w:val="1"/>
+      <w:suff w:val="tab"/>
+    </w:lvl>
+    <w:lvl w:ilvl="3">
+      <w:isLgl w:val="false"/>
+      <w:lvlJc w:val="left"/>
+      <w:lvlText w:val="%4."/>
+      <w:numFmt w:val="decimal"/>
+      <w:pPr>
+        <w:pBdr/>
+        <w:spacing/>
+        <w:ind w:hanging="360" w:left="3589"/>
+      </w:pPr>
+      <w:rPr/>
+      <w:start w:val="1"/>
+      <w:suff w:val="tab"/>
+    </w:lvl>
+    <w:lvl w:ilvl="4">
+      <w:isLgl w:val="false"/>
+      <w:lvlJc w:val="left"/>
+      <w:lvlText w:val="%5."/>
+      <w:numFmt w:val="lowerLetter"/>
+      <w:pPr>
+        <w:pBdr/>
+        <w:spacing/>
+        <w:ind w:hanging="360" w:left="4309"/>
+      </w:pPr>
+      <w:rPr/>
+      <w:start w:val="1"/>
+      <w:suff w:val="tab"/>
+    </w:lvl>
+    <w:lvl w:ilvl="5">
+      <w:isLgl w:val="false"/>
+      <w:lvlJc w:val="right"/>
+      <w:lvlText w:val="%6."/>
+      <w:numFmt w:val="lowerRoman"/>
+      <w:pPr>
+        <w:pBdr/>
+        <w:spacing/>
+        <w:ind w:hanging="180" w:left="5029"/>
+      </w:pPr>
+      <w:rPr/>
+      <w:start w:val="1"/>
+      <w:suff w:val="tab"/>
+    </w:lvl>
+    <w:lvl w:ilvl="6">
+      <w:isLgl w:val="false"/>
+      <w:lvlJc w:val="left"/>
+      <w:lvlText w:val="%7."/>
+      <w:numFmt w:val="decimal"/>
+      <w:pPr>
+        <w:pBdr/>
+        <w:spacing/>
+        <w:ind w:hanging="360" w:left="5749"/>
+      </w:pPr>
+      <w:rPr/>
+      <w:start w:val="1"/>
+      <w:suff w:val="tab"/>
+    </w:lvl>
+    <w:lvl w:ilvl="7">
+      <w:isLgl w:val="false"/>
+      <w:lvlJc w:val="left"/>
+      <w:lvlText w:val="%8."/>
+      <w:numFmt w:val="lowerLetter"/>
+      <w:pPr>
+        <w:pBdr/>
+        <w:spacing/>
+        <w:ind w:hanging="360" w:left="6469"/>
+      </w:pPr>
+      <w:rPr/>
+      <w:start w:val="1"/>
+      <w:suff w:val="tab"/>
+    </w:lvl>
+    <w:lvl w:ilvl="8">
+      <w:isLgl w:val="false"/>
+      <w:lvlJc w:val="right"/>
+      <w:lvlText w:val="%9."/>
+      <w:numFmt w:val="lowerRoman"/>
+      <w:pPr>
+        <w:pBdr/>
+        <w:spacing/>
+        <w:ind w:hanging="180" w:left="7189"/>
+      </w:pPr>
+      <w:rPr/>
+      <w:start w:val="1"/>
+      <w:suff w:val="tab"/>
+    </w:lvl>
+  </w:abstractNum>
+  <w:abstractNum w:abstractNumId="6">
+    <w:lvl w:ilvl="0">
+      <w:isLgl w:val="false"/>
+      <w:lvlJc w:val="left"/>
+      <w:lvlText w:val="%1)"/>
+      <w:numFmt w:val="lowerLetter"/>
+      <w:pPr>
+        <w:pBdr/>
+        <w:spacing/>
+        <w:ind w:hanging="360" w:left="709"/>
+      </w:pPr>
+      <w:rPr/>
+      <w:start w:val="1"/>
+      <w:suff w:val="tab"/>
+    </w:lvl>
+    <w:lvl w:ilvl="1">
+      <w:isLgl w:val="false"/>
+      <w:lvlJc w:val="left"/>
+      <w:lvlText w:val="%2."/>
+      <w:numFmt w:val="lowerLetter"/>
+      <w:pPr>
+        <w:pBdr/>
+        <w:spacing/>
+        <w:ind w:hanging="360" w:left="1429"/>
+      </w:pPr>
+      <w:rPr/>
+      <w:start w:val="1"/>
+      <w:suff w:val="tab"/>
+    </w:lvl>
+    <w:lvl w:ilvl="2">
+      <w:isLgl w:val="false"/>
+      <w:lvlJc w:val="right"/>
+      <w:lvlText w:val="%3."/>
+      <w:numFmt w:val="lowerRoman"/>
+      <w:pPr>
+        <w:pBdr/>
+        <w:spacing/>
+        <w:ind w:hanging="180" w:left="2149"/>
+      </w:pPr>
+      <w:rPr/>
+      <w:start w:val="1"/>
+      <w:suff w:val="tab"/>
+    </w:lvl>
+    <w:lvl w:ilvl="3">
+      <w:isLgl w:val="false"/>
+      <w:lvlJc w:val="left"/>
+      <w:lvlText w:val="%4."/>
+      <w:numFmt w:val="decimal"/>
+      <w:pPr>
+        <w:pBdr/>
+        <w:spacing/>
+        <w:ind w:hanging="360" w:left="2869"/>
+      </w:pPr>
+      <w:rPr/>
+      <w:start w:val="1"/>
+      <w:suff w:val="tab"/>
+    </w:lvl>
+    <w:lvl w:ilvl="4">
+      <w:isLgl w:val="false"/>
+      <w:lvlJc w:val="left"/>
+      <w:lvlText w:val="%5."/>
+      <w:numFmt w:val="lowerLetter"/>
+      <w:pPr>
+        <w:pBdr/>
+        <w:spacing/>
+        <w:ind w:hanging="360" w:left="3589"/>
+      </w:pPr>
+      <w:rPr/>
+      <w:start w:val="1"/>
+      <w:suff w:val="tab"/>
+    </w:lvl>
+    <w:lvl w:ilvl="5">
+      <w:isLgl w:val="false"/>
+      <w:lvlJc w:val="right"/>
+      <w:lvlText w:val="%6."/>
+      <w:numFmt w:val="lowerRoman"/>
+      <w:pPr>
+        <w:pBdr/>
+        <w:spacing/>
+        <w:ind w:hanging="180" w:left="4309"/>
+      </w:pPr>
+      <w:rPr/>
+      <w:start w:val="1"/>
+      <w:suff w:val="tab"/>
+    </w:lvl>
+    <w:lvl w:ilvl="6">
+      <w:isLgl w:val="false"/>
+      <w:lvlJc w:val="left"/>
+      <w:lvlText w:val="%7."/>
+      <w:numFmt w:val="decimal"/>
+      <w:pPr>
+        <w:pBdr/>
+        <w:spacing/>
+        <w:ind w:hanging="360" w:left="5029"/>
+      </w:pPr>
+      <w:rPr/>
+      <w:start w:val="1"/>
+      <w:suff w:val="tab"/>
+    </w:lvl>
+    <w:lvl w:ilvl="7">
+      <w:isLgl w:val="false"/>
+      <w:lvlJc w:val="left"/>
+      <w:lvlText w:val="%8."/>
+      <w:numFmt w:val="lowerLetter"/>
+      <w:pPr>
+        <w:pBdr/>
+        <w:spacing/>
+        <w:ind w:hanging="360" w:left="5749"/>
+      </w:pPr>
+      <w:rPr/>
+      <w:start w:val="1"/>
+      <w:suff w:val="tab"/>
+    </w:lvl>
+    <w:lvl w:ilvl="8">
+      <w:isLgl w:val="false"/>
+      <w:lvlJc w:val="right"/>
+      <w:lvlText w:val="%9."/>
+      <w:numFmt w:val="lowerRoman"/>
+      <w:pPr>
+        <w:pBdr/>
+        <w:spacing/>
+        <w:ind w:hanging="180" w:left="6469"/>
+      </w:pPr>
+      <w:rPr/>
+      <w:start w:val="1"/>
+      <w:suff w:val="tab"/>
+    </w:lvl>
+  </w:abstractNum>
   <w:num w:numId="1">
     <w:abstractNumId w:val="2"/>
   </w:num>
@@ -2590,6 +4025,15 @@
   </w:num>
   <w:num w:numId="4">
     <w:abstractNumId w:val="3"/>
+  </w:num>
+  <w:num w:numId="5">
+    <w:abstractNumId w:val="4"/>
+  </w:num>
+  <w:num w:numId="6">
+    <w:abstractNumId w:val="5"/>
+  </w:num>
+  <w:num w:numId="7">
+    <w:abstractNumId w:val="6"/>
   </w:num>
 </w:numbering>
 </file>
@@ -2753,9 +4197,9 @@
     <w:lsdException w:name="Bibliography" w:uiPriority="37"/>
     <w:lsdException w:name="TOC Heading" w:uiPriority="39" w:qFormat="1"/>
   </w:latentStyles>
-  <w:style w:type="character" w:styleId="709">
+  <w:style w:type="character" w:styleId="662">
     <w:name w:val="Intense Emphasis"/>
-    <w:basedOn w:val="896"/>
+    <w:basedOn w:val="849"/>
     <w:uiPriority w:val="21"/>
     <w:qFormat/>
     <w:pPr>
@@ -2769,9 +4213,9 @@
       <w:color w:val="0f4761" w:themeColor="accent1" w:themeShade="BF"/>
     </w:rPr>
   </w:style>
-  <w:style w:type="character" w:styleId="710">
+  <w:style w:type="character" w:styleId="663">
     <w:name w:val="Intense Reference"/>
-    <w:basedOn w:val="896"/>
+    <w:basedOn w:val="849"/>
     <w:uiPriority w:val="32"/>
     <w:qFormat/>
     <w:pPr>
@@ -2787,9 +4231,9 @@
       <w:spacing w:val="5"/>
     </w:rPr>
   </w:style>
-  <w:style w:type="character" w:styleId="711">
+  <w:style w:type="character" w:styleId="664">
     <w:name w:val="Subtle Emphasis"/>
-    <w:basedOn w:val="896"/>
+    <w:basedOn w:val="849"/>
     <w:uiPriority w:val="19"/>
     <w:qFormat/>
     <w:pPr>
@@ -2803,9 +4247,9 @@
       <w:color w:val="404040" w:themeColor="text1" w:themeTint="BF"/>
     </w:rPr>
   </w:style>
-  <w:style w:type="character" w:styleId="712">
+  <w:style w:type="character" w:styleId="665">
     <w:name w:val="Emphasis"/>
-    <w:basedOn w:val="896"/>
+    <w:basedOn w:val="849"/>
     <w:uiPriority w:val="20"/>
     <w:qFormat/>
     <w:pPr>
@@ -2818,9 +4262,9 @@
       <w:iCs/>
     </w:rPr>
   </w:style>
-  <w:style w:type="character" w:styleId="713">
+  <w:style w:type="character" w:styleId="666">
     <w:name w:val="Strong"/>
-    <w:basedOn w:val="896"/>
+    <w:basedOn w:val="849"/>
     <w:uiPriority w:val="22"/>
     <w:qFormat/>
     <w:pPr>
@@ -2833,9 +4277,9 @@
       <w:bCs/>
     </w:rPr>
   </w:style>
-  <w:style w:type="character" w:styleId="714">
+  <w:style w:type="character" w:styleId="667">
     <w:name w:val="Subtle Reference"/>
-    <w:basedOn w:val="896"/>
+    <w:basedOn w:val="849"/>
     <w:uiPriority w:val="31"/>
     <w:qFormat/>
     <w:pPr>
@@ -2848,9 +4292,9 @@
       <w:color w:val="5a5a5a" w:themeColor="text1" w:themeTint="A5"/>
     </w:rPr>
   </w:style>
-  <w:style w:type="character" w:styleId="715">
+  <w:style w:type="character" w:styleId="668">
     <w:name w:val="Book Title"/>
-    <w:basedOn w:val="896"/>
+    <w:basedOn w:val="849"/>
     <w:uiPriority w:val="33"/>
     <w:qFormat/>
     <w:pPr>
@@ -2866,9 +4310,9 @@
       <w:spacing w:val="5"/>
     </w:rPr>
   </w:style>
-  <w:style w:type="character" w:styleId="716">
+  <w:style w:type="character" w:styleId="669">
     <w:name w:val="FollowedHyperlink"/>
-    <w:basedOn w:val="896"/>
+    <w:basedOn w:val="849"/>
     <w:uiPriority w:val="99"/>
     <w:semiHidden/>
     <w:unhideWhenUsed/>
@@ -2882,9 +4326,9 @@
       <w:u w:val="single"/>
     </w:rPr>
   </w:style>
-  <w:style w:type="character" w:styleId="717">
+  <w:style w:type="character" w:styleId="670">
     <w:name w:val="Placeholder Text"/>
-    <w:basedOn w:val="896"/>
+    <w:basedOn w:val="849"/>
     <w:uiPriority w:val="99"/>
     <w:semiHidden/>
     <w:pPr>
@@ -2896,10 +4340,10 @@
       <w:color w:val="666666"/>
     </w:rPr>
   </w:style>
-  <w:style w:type="character" w:styleId="718">
+  <w:style w:type="character" w:styleId="671">
     <w:name w:val="Heading 1 Char"/>
-    <w:basedOn w:val="896"/>
-    <w:link w:val="895"/>
+    <w:basedOn w:val="849"/>
+    <w:link w:val="848"/>
     <w:uiPriority w:val="9"/>
     <w:pPr>
       <w:pBdr/>
@@ -2912,11 +4356,11 @@
       <w:szCs w:val="40"/>
     </w:rPr>
   </w:style>
-  <w:style w:type="paragraph" w:styleId="719">
+  <w:style w:type="paragraph" w:styleId="672">
     <w:name w:val="Heading 2"/>
-    <w:basedOn w:val="894"/>
-    <w:next w:val="894"/>
-    <w:link w:val="720"/>
+    <w:basedOn w:val="847"/>
+    <w:next w:val="847"/>
+    <w:link w:val="673"/>
     <w:uiPriority w:val="9"/>
     <w:unhideWhenUsed/>
     <w:qFormat/>
@@ -2933,10 +4377,10 @@
       <w:sz w:val="34"/>
     </w:rPr>
   </w:style>
-  <w:style w:type="character" w:styleId="720">
+  <w:style w:type="character" w:styleId="673">
     <w:name w:val="Heading 2 Char"/>
-    <w:basedOn w:val="896"/>
-    <w:link w:val="719"/>
+    <w:basedOn w:val="849"/>
+    <w:link w:val="672"/>
     <w:uiPriority w:val="9"/>
     <w:pPr>
       <w:pBdr/>
@@ -2948,11 +4392,11 @@
       <w:sz w:val="34"/>
     </w:rPr>
   </w:style>
-  <w:style w:type="paragraph" w:styleId="721">
+  <w:style w:type="paragraph" w:styleId="674">
     <w:name w:val="Heading 3"/>
-    <w:basedOn w:val="894"/>
-    <w:next w:val="894"/>
-    <w:link w:val="722"/>
+    <w:basedOn w:val="847"/>
+    <w:next w:val="847"/>
+    <w:link w:val="675"/>
     <w:uiPriority w:val="9"/>
     <w:unhideWhenUsed/>
     <w:qFormat/>
@@ -2970,10 +4414,10 @@
       <w:szCs w:val="30"/>
     </w:rPr>
   </w:style>
-  <w:style w:type="character" w:styleId="722">
+  <w:style w:type="character" w:styleId="675">
     <w:name w:val="Heading 3 Char"/>
-    <w:basedOn w:val="896"/>
-    <w:link w:val="721"/>
+    <w:basedOn w:val="849"/>
+    <w:link w:val="674"/>
     <w:uiPriority w:val="9"/>
     <w:pPr>
       <w:pBdr/>
@@ -2986,11 +4430,11 @@
       <w:szCs w:val="30"/>
     </w:rPr>
   </w:style>
-  <w:style w:type="paragraph" w:styleId="723">
+  <w:style w:type="paragraph" w:styleId="676">
     <w:name w:val="Heading 4"/>
-    <w:basedOn w:val="894"/>
-    <w:next w:val="894"/>
-    <w:link w:val="724"/>
+    <w:basedOn w:val="847"/>
+    <w:next w:val="847"/>
+    <w:link w:val="677"/>
     <w:uiPriority w:val="9"/>
     <w:unhideWhenUsed/>
     <w:qFormat/>
@@ -3010,10 +4454,10 @@
       <w:szCs w:val="26"/>
     </w:rPr>
   </w:style>
-  <w:style w:type="character" w:styleId="724">
+  <w:style w:type="character" w:styleId="677">
     <w:name w:val="Heading 4 Char"/>
-    <w:basedOn w:val="896"/>
-    <w:link w:val="723"/>
+    <w:basedOn w:val="849"/>
+    <w:link w:val="676"/>
     <w:uiPriority w:val="9"/>
     <w:pPr>
       <w:pBdr/>
@@ -3028,11 +4472,11 @@
       <w:szCs w:val="26"/>
     </w:rPr>
   </w:style>
-  <w:style w:type="paragraph" w:styleId="725">
+  <w:style w:type="paragraph" w:styleId="678">
     <w:name w:val="Heading 5"/>
-    <w:basedOn w:val="894"/>
-    <w:next w:val="894"/>
-    <w:link w:val="726"/>
+    <w:basedOn w:val="847"/>
+    <w:next w:val="847"/>
+    <w:link w:val="679"/>
     <w:uiPriority w:val="9"/>
     <w:unhideWhenUsed/>
     <w:qFormat/>
@@ -3052,10 +4496,10 @@
       <w:szCs w:val="24"/>
     </w:rPr>
   </w:style>
-  <w:style w:type="character" w:styleId="726">
+  <w:style w:type="character" w:styleId="679">
     <w:name w:val="Heading 5 Char"/>
-    <w:basedOn w:val="896"/>
-    <w:link w:val="725"/>
+    <w:basedOn w:val="849"/>
+    <w:link w:val="678"/>
     <w:uiPriority w:val="9"/>
     <w:pPr>
       <w:pBdr/>
@@ -3070,11 +4514,11 @@
       <w:szCs w:val="24"/>
     </w:rPr>
   </w:style>
-  <w:style w:type="paragraph" w:styleId="727">
+  <w:style w:type="paragraph" w:styleId="680">
     <w:name w:val="Heading 6"/>
-    <w:basedOn w:val="894"/>
-    <w:next w:val="894"/>
-    <w:link w:val="728"/>
+    <w:basedOn w:val="847"/>
+    <w:next w:val="847"/>
+    <w:link w:val="681"/>
     <w:uiPriority w:val="9"/>
     <w:unhideWhenUsed/>
     <w:qFormat/>
@@ -3094,10 +4538,10 @@
       <w:szCs w:val="22"/>
     </w:rPr>
   </w:style>
-  <w:style w:type="character" w:styleId="728">
+  <w:style w:type="character" w:styleId="681">
     <w:name w:val="Heading 6 Char"/>
-    <w:basedOn w:val="896"/>
-    <w:link w:val="727"/>
+    <w:basedOn w:val="849"/>
+    <w:link w:val="680"/>
     <w:uiPriority w:val="9"/>
     <w:pPr>
       <w:pBdr/>
@@ -3112,11 +4556,11 @@
       <w:szCs w:val="22"/>
     </w:rPr>
   </w:style>
-  <w:style w:type="paragraph" w:styleId="729">
+  <w:style w:type="paragraph" w:styleId="682">
     <w:name w:val="Heading 7"/>
-    <w:basedOn w:val="894"/>
-    <w:next w:val="894"/>
-    <w:link w:val="730"/>
+    <w:basedOn w:val="847"/>
+    <w:next w:val="847"/>
+    <w:link w:val="683"/>
     <w:uiPriority w:val="9"/>
     <w:unhideWhenUsed/>
     <w:qFormat/>
@@ -3138,10 +4582,10 @@
       <w:szCs w:val="22"/>
     </w:rPr>
   </w:style>
-  <w:style w:type="character" w:styleId="730">
+  <w:style w:type="character" w:styleId="683">
     <w:name w:val="Heading 7 Char"/>
-    <w:basedOn w:val="896"/>
-    <w:link w:val="729"/>
+    <w:basedOn w:val="849"/>
+    <w:link w:val="682"/>
     <w:uiPriority w:val="9"/>
     <w:pPr>
       <w:pBdr/>
@@ -3158,11 +4602,11 @@
       <w:szCs w:val="22"/>
     </w:rPr>
   </w:style>
-  <w:style w:type="paragraph" w:styleId="731">
+  <w:style w:type="paragraph" w:styleId="684">
     <w:name w:val="Heading 8"/>
-    <w:basedOn w:val="894"/>
-    <w:next w:val="894"/>
-    <w:link w:val="732"/>
+    <w:basedOn w:val="847"/>
+    <w:next w:val="847"/>
+    <w:link w:val="685"/>
     <w:uiPriority w:val="9"/>
     <w:unhideWhenUsed/>
     <w:qFormat/>
@@ -3182,10 +4626,10 @@
       <w:szCs w:val="22"/>
     </w:rPr>
   </w:style>
-  <w:style w:type="character" w:styleId="732">
+  <w:style w:type="character" w:styleId="685">
     <w:name w:val="Heading 8 Char"/>
-    <w:basedOn w:val="896"/>
-    <w:link w:val="731"/>
+    <w:basedOn w:val="849"/>
+    <w:link w:val="684"/>
     <w:uiPriority w:val="9"/>
     <w:pPr>
       <w:pBdr/>
@@ -3200,11 +4644,11 @@
       <w:szCs w:val="22"/>
     </w:rPr>
   </w:style>
-  <w:style w:type="paragraph" w:styleId="733">
+  <w:style w:type="paragraph" w:styleId="686">
     <w:name w:val="Heading 9"/>
-    <w:basedOn w:val="894"/>
-    <w:next w:val="894"/>
-    <w:link w:val="734"/>
+    <w:basedOn w:val="847"/>
+    <w:next w:val="847"/>
+    <w:link w:val="687"/>
     <w:uiPriority w:val="9"/>
     <w:unhideWhenUsed/>
     <w:qFormat/>
@@ -3224,10 +4668,10 @@
       <w:szCs w:val="21"/>
     </w:rPr>
   </w:style>
-  <w:style w:type="character" w:styleId="734">
+  <w:style w:type="character" w:styleId="687">
     <w:name w:val="Heading 9 Char"/>
-    <w:basedOn w:val="896"/>
-    <w:link w:val="733"/>
+    <w:basedOn w:val="849"/>
+    <w:link w:val="686"/>
     <w:uiPriority w:val="9"/>
     <w:pPr>
       <w:pBdr/>
@@ -3242,7 +4686,7 @@
       <w:szCs w:val="21"/>
     </w:rPr>
   </w:style>
-  <w:style w:type="paragraph" w:styleId="735">
+  <w:style w:type="paragraph" w:styleId="688">
     <w:name w:val="No Spacing"/>
     <w:uiPriority w:val="1"/>
     <w:qFormat/>
@@ -3252,11 +4696,11 @@
       <w:ind/>
     </w:pPr>
   </w:style>
-  <w:style w:type="paragraph" w:styleId="736">
+  <w:style w:type="paragraph" w:styleId="689">
     <w:name w:val="Title"/>
-    <w:basedOn w:val="894"/>
-    <w:next w:val="894"/>
-    <w:link w:val="737"/>
+    <w:basedOn w:val="847"/>
+    <w:next w:val="847"/>
+    <w:link w:val="690"/>
     <w:uiPriority w:val="10"/>
     <w:qFormat/>
     <w:pPr>
@@ -3270,10 +4714,10 @@
       <w:szCs w:val="48"/>
     </w:rPr>
   </w:style>
-  <w:style w:type="character" w:styleId="737">
+  <w:style w:type="character" w:styleId="690">
     <w:name w:val="Title Char"/>
-    <w:basedOn w:val="896"/>
-    <w:link w:val="736"/>
+    <w:basedOn w:val="849"/>
+    <w:link w:val="689"/>
     <w:uiPriority w:val="10"/>
     <w:pPr>
       <w:pBdr/>
@@ -3285,11 +4729,11 @@
       <w:szCs w:val="48"/>
     </w:rPr>
   </w:style>
-  <w:style w:type="paragraph" w:styleId="738">
+  <w:style w:type="paragraph" w:styleId="691">
     <w:name w:val="Subtitle"/>
-    <w:basedOn w:val="894"/>
-    <w:next w:val="894"/>
-    <w:link w:val="739"/>
+    <w:basedOn w:val="847"/>
+    <w:next w:val="847"/>
+    <w:link w:val="692"/>
     <w:uiPriority w:val="11"/>
     <w:qFormat/>
     <w:pPr>
@@ -3302,10 +4746,10 @@
       <w:szCs w:val="24"/>
     </w:rPr>
   </w:style>
-  <w:style w:type="character" w:styleId="739">
+  <w:style w:type="character" w:styleId="692">
     <w:name w:val="Subtitle Char"/>
-    <w:basedOn w:val="896"/>
-    <w:link w:val="738"/>
+    <w:basedOn w:val="849"/>
+    <w:link w:val="691"/>
     <w:uiPriority w:val="11"/>
     <w:pPr>
       <w:pBdr/>
@@ -3317,11 +4761,11 @@
       <w:szCs w:val="24"/>
     </w:rPr>
   </w:style>
-  <w:style w:type="paragraph" w:styleId="740">
+  <w:style w:type="paragraph" w:styleId="693">
     <w:name w:val="Quote"/>
-    <w:basedOn w:val="894"/>
-    <w:next w:val="894"/>
-    <w:link w:val="741"/>
+    <w:basedOn w:val="847"/>
+    <w:next w:val="847"/>
+    <w:link w:val="694"/>
     <w:uiPriority w:val="29"/>
     <w:qFormat/>
     <w:pPr>
@@ -3333,9 +4777,9 @@
       <w:i/>
     </w:rPr>
   </w:style>
-  <w:style w:type="character" w:styleId="741">
+  <w:style w:type="character" w:styleId="694">
     <w:name w:val="Quote Char"/>
-    <w:link w:val="740"/>
+    <w:link w:val="693"/>
     <w:uiPriority w:val="29"/>
     <w:pPr>
       <w:pBdr/>
@@ -3346,11 +4790,11 @@
       <w:i/>
     </w:rPr>
   </w:style>
-  <w:style w:type="paragraph" w:styleId="742">
+  <w:style w:type="paragraph" w:styleId="695">
     <w:name w:val="Intense Quote"/>
-    <w:basedOn w:val="894"/>
-    <w:next w:val="894"/>
-    <w:link w:val="743"/>
+    <w:basedOn w:val="847"/>
+    <w:next w:val="847"/>
+    <w:link w:val="696"/>
     <w:uiPriority w:val="30"/>
     <w:qFormat/>
     <w:pPr>
@@ -3369,9 +4813,9 @@
       <w:i/>
     </w:rPr>
   </w:style>
-  <w:style w:type="character" w:styleId="743">
+  <w:style w:type="character" w:styleId="696">
     <w:name w:val="Intense Quote Char"/>
-    <w:link w:val="742"/>
+    <w:link w:val="695"/>
     <w:uiPriority w:val="30"/>
     <w:pPr>
       <w:pBdr/>
@@ -3382,10 +4826,10 @@
       <w:i/>
     </w:rPr>
   </w:style>
-  <w:style w:type="paragraph" w:styleId="744">
+  <w:style w:type="paragraph" w:styleId="697">
     <w:name w:val="Header"/>
-    <w:basedOn w:val="894"/>
-    <w:link w:val="745"/>
+    <w:basedOn w:val="847"/>
+    <w:link w:val="698"/>
     <w:uiPriority w:val="99"/>
     <w:unhideWhenUsed/>
     <w:pPr>
@@ -3398,10 +4842,10 @@
       <w:ind/>
     </w:pPr>
   </w:style>
-  <w:style w:type="character" w:styleId="745">
+  <w:style w:type="character" w:styleId="698">
     <w:name w:val="Header Char"/>
-    <w:basedOn w:val="896"/>
-    <w:link w:val="744"/>
+    <w:basedOn w:val="849"/>
+    <w:link w:val="697"/>
     <w:uiPriority w:val="99"/>
     <w:pPr>
       <w:pBdr/>
@@ -3409,10 +4853,10 @@
       <w:ind/>
     </w:pPr>
   </w:style>
-  <w:style w:type="paragraph" w:styleId="746">
+  <w:style w:type="paragraph" w:styleId="699">
     <w:name w:val="Footer"/>
-    <w:basedOn w:val="894"/>
-    <w:link w:val="749"/>
+    <w:basedOn w:val="847"/>
+    <w:link w:val="702"/>
     <w:uiPriority w:val="99"/>
     <w:unhideWhenUsed/>
     <w:pPr>
@@ -3425,10 +4869,10 @@
       <w:ind/>
     </w:pPr>
   </w:style>
-  <w:style w:type="character" w:styleId="747">
+  <w:style w:type="character" w:styleId="700">
     <w:name w:val="Footer Char"/>
-    <w:basedOn w:val="896"/>
-    <w:link w:val="746"/>
+    <w:basedOn w:val="849"/>
+    <w:link w:val="699"/>
     <w:uiPriority w:val="99"/>
     <w:pPr>
       <w:pBdr/>
@@ -3436,10 +4880,10 @@
       <w:ind/>
     </w:pPr>
   </w:style>
-  <w:style w:type="paragraph" w:styleId="748">
+  <w:style w:type="paragraph" w:styleId="701">
     <w:name w:val="Caption"/>
-    <w:basedOn w:val="894"/>
-    <w:next w:val="894"/>
+    <w:basedOn w:val="847"/>
+    <w:next w:val="847"/>
     <w:uiPriority w:val="35"/>
     <w:semiHidden/>
     <w:unhideWhenUsed/>
@@ -3457,10 +4901,10 @@
       <w:szCs w:val="18"/>
     </w:rPr>
   </w:style>
-  <w:style w:type="character" w:styleId="749">
+  <w:style w:type="character" w:styleId="702">
     <w:name w:val="Caption Char"/>
-    <w:basedOn w:val="748"/>
-    <w:link w:val="746"/>
+    <w:basedOn w:val="701"/>
+    <w:link w:val="699"/>
     <w:uiPriority w:val="99"/>
     <w:pPr>
       <w:pBdr/>
@@ -3468,9 +4912,9 @@
       <w:ind/>
     </w:pPr>
   </w:style>
-  <w:style w:type="table" w:styleId="750">
+  <w:style w:type="table" w:styleId="703">
     <w:name w:val="Table Grid"/>
-    <w:basedOn w:val="897"/>
+    <w:basedOn w:val="850"/>
     <w:uiPriority w:val="59"/>
     <w:pPr>
       <w:pBdr/>
@@ -3479,12 +4923,6 @@
     </w:pPr>
     <w:tblPr>
       <w:tblInd w:w="0" w:type="dxa"/>
-      <w:tblCellMar>
-        <w:left w:w="108" w:type="dxa"/>
-        <w:top w:w="0" w:type="dxa"/>
-        <w:right w:w="108" w:type="dxa"/>
-        <w:bottom w:w="0" w:type="dxa"/>
-      </w:tblCellMar>
       <w:tblBorders>
         <w:top w:val="single" w:color="000000" w:sz="4" w:space="0"/>
         <w:left w:val="single" w:color="000000" w:sz="4" w:space="0"/>
@@ -3493,6 +4931,12 @@
         <w:insideH w:val="single" w:color="000000" w:sz="4" w:space="0"/>
         <w:insideV w:val="single" w:color="000000" w:sz="4" w:space="0"/>
       </w:tblBorders>
+      <w:tblCellMar>
+        <w:left w:w="108" w:type="dxa"/>
+        <w:top w:w="0" w:type="dxa"/>
+        <w:right w:w="108" w:type="dxa"/>
+        <w:bottom w:w="0" w:type="dxa"/>
+      </w:tblCellMar>
     </w:tblPr>
     <w:tcPr>
       <w:tcBorders/>
@@ -3667,9 +5111,9 @@
       </w:tcPr>
     </w:tblStylePr>
   </w:style>
-  <w:style w:type="table" w:styleId="751">
+  <w:style w:type="table" w:styleId="704">
     <w:name w:val="Table Grid Light"/>
-    <w:basedOn w:val="897"/>
+    <w:basedOn w:val="850"/>
     <w:uiPriority w:val="59"/>
     <w:pPr>
       <w:pBdr/>
@@ -3678,12 +5122,6 @@
     </w:pPr>
     <w:tblPr>
       <w:tblInd w:w="0" w:type="dxa"/>
-      <w:tblCellMar>
-        <w:left w:w="108" w:type="dxa"/>
-        <w:top w:w="0" w:type="dxa"/>
-        <w:right w:w="108" w:type="dxa"/>
-        <w:bottom w:w="0" w:type="dxa"/>
-      </w:tblCellMar>
       <w:tblBorders>
         <w:top w:val="single" w:color="000000" w:themeColor="text1" w:themeTint="50" w:sz="4" w:space="0"/>
         <w:left w:val="single" w:color="000000" w:themeColor="text1" w:themeTint="50" w:sz="4" w:space="0"/>
@@ -3692,6 +5130,12 @@
         <w:insideH w:val="single" w:color="000000" w:themeColor="text1" w:themeTint="50" w:sz="4" w:space="0"/>
         <w:insideV w:val="single" w:color="000000" w:themeColor="text1" w:themeTint="50" w:sz="4" w:space="0"/>
       </w:tblBorders>
+      <w:tblCellMar>
+        <w:left w:w="108" w:type="dxa"/>
+        <w:top w:w="0" w:type="dxa"/>
+        <w:right w:w="108" w:type="dxa"/>
+        <w:bottom w:w="0" w:type="dxa"/>
+      </w:tblCellMar>
     </w:tblPr>
     <w:tcPr>
       <w:tcBorders/>
@@ -3866,9 +5310,9 @@
       </w:tcPr>
     </w:tblStylePr>
   </w:style>
-  <w:style w:type="table" w:styleId="752">
+  <w:style w:type="table" w:styleId="705">
     <w:name w:val="Plain Table 1"/>
-    <w:basedOn w:val="897"/>
+    <w:basedOn w:val="850"/>
     <w:uiPriority w:val="59"/>
     <w:pPr>
       <w:pBdr/>
@@ -3877,12 +5321,6 @@
     </w:pPr>
     <w:tblPr>
       <w:tblInd w:w="0" w:type="dxa"/>
-      <w:tblCellMar>
-        <w:left w:w="108" w:type="dxa"/>
-        <w:top w:w="0" w:type="dxa"/>
-        <w:right w:w="108" w:type="dxa"/>
-        <w:bottom w:w="0" w:type="dxa"/>
-      </w:tblCellMar>
       <w:tblBorders>
         <w:top w:val="single" w:color="000000" w:themeColor="text1" w:themeTint="50" w:sz="4" w:space="0"/>
         <w:left w:val="single" w:color="000000" w:themeColor="text1" w:themeTint="50" w:sz="4" w:space="0"/>
@@ -3891,6 +5329,12 @@
         <w:insideH w:val="single" w:color="000000" w:themeColor="text1" w:themeTint="50" w:sz="4" w:space="0"/>
         <w:insideV w:val="single" w:color="000000" w:themeColor="text1" w:themeTint="50" w:sz="4" w:space="0"/>
       </w:tblBorders>
+      <w:tblCellMar>
+        <w:left w:w="108" w:type="dxa"/>
+        <w:top w:w="0" w:type="dxa"/>
+        <w:right w:w="108" w:type="dxa"/>
+        <w:bottom w:w="0" w:type="dxa"/>
+      </w:tblCellMar>
     </w:tblPr>
     <w:tcPr>
       <w:tcBorders/>
@@ -4091,9 +5535,9 @@
       </w:tcPr>
     </w:tblStylePr>
   </w:style>
-  <w:style w:type="table" w:styleId="753">
+  <w:style w:type="table" w:styleId="706">
     <w:name w:val="Plain Table 2"/>
-    <w:basedOn w:val="897"/>
+    <w:basedOn w:val="850"/>
     <w:uiPriority w:val="59"/>
     <w:pPr>
       <w:pBdr/>
@@ -4102,18 +5546,18 @@
     </w:pPr>
     <w:tblPr>
       <w:tblInd w:w="0" w:type="dxa"/>
+      <w:tblBorders>
+        <w:top w:val="single" w:color="000000" w:themeColor="text1" w:sz="4" w:space="0"/>
+        <w:left w:val="none" w:color="000000" w:themeColor="text1" w:sz="4" w:space="0"/>
+        <w:bottom w:val="single" w:color="000000" w:themeColor="text1" w:sz="4" w:space="0"/>
+        <w:right w:val="none" w:color="000000" w:themeColor="text1" w:sz="4" w:space="0"/>
+      </w:tblBorders>
       <w:tblCellMar>
         <w:left w:w="108" w:type="dxa"/>
         <w:top w:w="0" w:type="dxa"/>
         <w:right w:w="108" w:type="dxa"/>
         <w:bottom w:w="0" w:type="dxa"/>
       </w:tblCellMar>
-      <w:tblBorders>
-        <w:top w:val="single" w:color="000000" w:themeColor="text1" w:sz="4" w:space="0"/>
-        <w:left w:val="none" w:color="000000" w:themeColor="text1" w:sz="4" w:space="0"/>
-        <w:bottom w:val="single" w:color="000000" w:themeColor="text1" w:sz="4" w:space="0"/>
-        <w:right w:val="none" w:color="000000" w:themeColor="text1" w:sz="4" w:space="0"/>
-      </w:tblBorders>
     </w:tblPr>
     <w:tcPr>
       <w:tcBorders/>
@@ -4324,9 +5768,9 @@
       </w:tcPr>
     </w:tblStylePr>
   </w:style>
-  <w:style w:type="table" w:styleId="754">
+  <w:style w:type="table" w:styleId="707">
     <w:name w:val="Plain Table 3"/>
-    <w:basedOn w:val="897"/>
+    <w:basedOn w:val="850"/>
     <w:uiPriority w:val="99"/>
     <w:pPr>
       <w:pBdr/>
@@ -4554,9 +5998,9 @@
       </w:tcPr>
     </w:tblStylePr>
   </w:style>
-  <w:style w:type="table" w:styleId="755">
+  <w:style w:type="table" w:styleId="708">
     <w:name w:val="Plain Table 4"/>
-    <w:basedOn w:val="897"/>
+    <w:basedOn w:val="850"/>
     <w:uiPriority w:val="99"/>
     <w:pPr>
       <w:pBdr/>
@@ -4770,9 +6214,9 @@
       </w:tcPr>
     </w:tblStylePr>
   </w:style>
-  <w:style w:type="table" w:styleId="756">
+  <w:style w:type="table" w:styleId="709">
     <w:name w:val="Plain Table 5"/>
-    <w:basedOn w:val="897"/>
+    <w:basedOn w:val="850"/>
     <w:uiPriority w:val="99"/>
     <w:pPr>
       <w:pBdr/>
@@ -5003,9 +6447,9 @@
       </w:tcPr>
     </w:tblStylePr>
   </w:style>
-  <w:style w:type="table" w:styleId="757">
+  <w:style w:type="table" w:styleId="710">
     <w:name w:val="Grid Table 1 Light"/>
-    <w:basedOn w:val="897"/>
+    <w:basedOn w:val="850"/>
     <w:uiPriority w:val="99"/>
     <w:pPr>
       <w:pBdr/>
@@ -5226,9 +6670,9 @@
       </w:tcPr>
     </w:tblStylePr>
   </w:style>
-  <w:style w:type="table" w:styleId="758">
+  <w:style w:type="table" w:styleId="711">
     <w:name w:val="Grid Table 1 Light - Accent 1"/>
-    <w:basedOn w:val="897"/>
+    <w:basedOn w:val="850"/>
     <w:uiPriority w:val="99"/>
     <w:pPr>
       <w:pBdr/>
@@ -5449,9 +6893,9 @@
       </w:tcPr>
     </w:tblStylePr>
   </w:style>
-  <w:style w:type="table" w:styleId="759">
+  <w:style w:type="table" w:styleId="712">
     <w:name w:val="Grid Table 1 Light - Accent 2"/>
-    <w:basedOn w:val="897"/>
+    <w:basedOn w:val="850"/>
     <w:uiPriority w:val="99"/>
     <w:pPr>
       <w:pBdr/>
@@ -5672,9 +7116,9 @@
       </w:tcPr>
     </w:tblStylePr>
   </w:style>
-  <w:style w:type="table" w:styleId="760">
+  <w:style w:type="table" w:styleId="713">
     <w:name w:val="Grid Table 1 Light - Accent 3"/>
-    <w:basedOn w:val="897"/>
+    <w:basedOn w:val="850"/>
     <w:uiPriority w:val="99"/>
     <w:pPr>
       <w:pBdr/>
@@ -5895,9 +7339,9 @@
       </w:tcPr>
     </w:tblStylePr>
   </w:style>
-  <w:style w:type="table" w:styleId="761">
+  <w:style w:type="table" w:styleId="714">
     <w:name w:val="Grid Table 1 Light - Accent 4"/>
-    <w:basedOn w:val="897"/>
+    <w:basedOn w:val="850"/>
     <w:uiPriority w:val="99"/>
     <w:pPr>
       <w:pBdr/>
@@ -6118,9 +7562,9 @@
       </w:tcPr>
     </w:tblStylePr>
   </w:style>
-  <w:style w:type="table" w:styleId="762">
+  <w:style w:type="table" w:styleId="715">
     <w:name w:val="Grid Table 1 Light - Accent 5"/>
-    <w:basedOn w:val="897"/>
+    <w:basedOn w:val="850"/>
     <w:uiPriority w:val="99"/>
     <w:pPr>
       <w:pBdr/>
@@ -6341,9 +7785,9 @@
       </w:tcPr>
     </w:tblStylePr>
   </w:style>
-  <w:style w:type="table" w:styleId="763">
+  <w:style w:type="table" w:styleId="716">
     <w:name w:val="Grid Table 1 Light - Accent 6"/>
-    <w:basedOn w:val="897"/>
+    <w:basedOn w:val="850"/>
     <w:uiPriority w:val="99"/>
     <w:pPr>
       <w:pBdr/>
@@ -6564,9 +8008,9 @@
       </w:tcPr>
     </w:tblStylePr>
   </w:style>
-  <w:style w:type="table" w:styleId="764">
+  <w:style w:type="table" w:styleId="717">
     <w:name w:val="Grid Table 2"/>
-    <w:basedOn w:val="897"/>
+    <w:basedOn w:val="850"/>
     <w:uiPriority w:val="99"/>
     <w:pPr>
       <w:pBdr/>
@@ -6796,9 +8240,9 @@
       </w:tcPr>
     </w:tblStylePr>
   </w:style>
-  <w:style w:type="table" w:styleId="765">
+  <w:style w:type="table" w:styleId="718">
     <w:name w:val="Grid Table 2 - Accent 1"/>
-    <w:basedOn w:val="897"/>
+    <w:basedOn w:val="850"/>
     <w:uiPriority w:val="99"/>
     <w:pPr>
       <w:pBdr/>
@@ -7028,9 +8472,9 @@
       </w:tcPr>
     </w:tblStylePr>
   </w:style>
-  <w:style w:type="table" w:styleId="766">
+  <w:style w:type="table" w:styleId="719">
     <w:name w:val="Grid Table 2 - Accent 2"/>
-    <w:basedOn w:val="897"/>
+    <w:basedOn w:val="850"/>
     <w:uiPriority w:val="99"/>
     <w:pPr>
       <w:pBdr/>
@@ -7260,9 +8704,9 @@
       </w:tcPr>
     </w:tblStylePr>
   </w:style>
-  <w:style w:type="table" w:styleId="767">
+  <w:style w:type="table" w:styleId="720">
     <w:name w:val="Grid Table 2 - Accent 3"/>
-    <w:basedOn w:val="897"/>
+    <w:basedOn w:val="850"/>
     <w:uiPriority w:val="99"/>
     <w:pPr>
       <w:pBdr/>
@@ -7492,9 +8936,9 @@
       </w:tcPr>
     </w:tblStylePr>
   </w:style>
-  <w:style w:type="table" w:styleId="768">
+  <w:style w:type="table" w:styleId="721">
     <w:name w:val="Grid Table 2 - Accent 4"/>
-    <w:basedOn w:val="897"/>
+    <w:basedOn w:val="850"/>
     <w:uiPriority w:val="99"/>
     <w:pPr>
       <w:pBdr/>
@@ -7724,9 +9168,9 @@
       </w:tcPr>
     </w:tblStylePr>
   </w:style>
-  <w:style w:type="table" w:styleId="769">
+  <w:style w:type="table" w:styleId="722">
     <w:name w:val="Grid Table 2 - Accent 5"/>
-    <w:basedOn w:val="897"/>
+    <w:basedOn w:val="850"/>
     <w:uiPriority w:val="99"/>
     <w:pPr>
       <w:pBdr/>
@@ -7956,9 +9400,9 @@
       </w:tcPr>
     </w:tblStylePr>
   </w:style>
-  <w:style w:type="table" w:styleId="770">
+  <w:style w:type="table" w:styleId="723">
     <w:name w:val="Grid Table 2 - Accent 6"/>
-    <w:basedOn w:val="897"/>
+    <w:basedOn w:val="850"/>
     <w:uiPriority w:val="99"/>
     <w:pPr>
       <w:pBdr/>
@@ -8188,9 +9632,9 @@
       </w:tcPr>
     </w:tblStylePr>
   </w:style>
-  <w:style w:type="table" w:styleId="771">
+  <w:style w:type="table" w:styleId="724">
     <w:name w:val="Grid Table 3"/>
-    <w:basedOn w:val="897"/>
+    <w:basedOn w:val="850"/>
     <w:uiPriority w:val="99"/>
     <w:pPr>
       <w:pBdr/>
@@ -8433,9 +9877,9 @@
       </w:tcPr>
     </w:tblStylePr>
   </w:style>
-  <w:style w:type="table" w:styleId="772">
+  <w:style w:type="table" w:styleId="725">
     <w:name w:val="Grid Table 3 - Accent 1"/>
-    <w:basedOn w:val="897"/>
+    <w:basedOn w:val="850"/>
     <w:uiPriority w:val="99"/>
     <w:pPr>
       <w:pBdr/>
@@ -8678,9 +10122,9 @@
       </w:tcPr>
     </w:tblStylePr>
   </w:style>
-  <w:style w:type="table" w:styleId="773">
+  <w:style w:type="table" w:styleId="726">
     <w:name w:val="Grid Table 3 - Accent 2"/>
-    <w:basedOn w:val="897"/>
+    <w:basedOn w:val="850"/>
     <w:uiPriority w:val="99"/>
     <w:pPr>
       <w:pBdr/>
@@ -8923,9 +10367,9 @@
       </w:tcPr>
     </w:tblStylePr>
   </w:style>
-  <w:style w:type="table" w:styleId="774">
+  <w:style w:type="table" w:styleId="727">
     <w:name w:val="Grid Table 3 - Accent 3"/>
-    <w:basedOn w:val="897"/>
+    <w:basedOn w:val="850"/>
     <w:uiPriority w:val="99"/>
     <w:pPr>
       <w:pBdr/>
@@ -9168,9 +10612,9 @@
       </w:tcPr>
     </w:tblStylePr>
   </w:style>
-  <w:style w:type="table" w:styleId="775">
+  <w:style w:type="table" w:styleId="728">
     <w:name w:val="Grid Table 3 - Accent 4"/>
-    <w:basedOn w:val="897"/>
+    <w:basedOn w:val="850"/>
     <w:uiPriority w:val="99"/>
     <w:pPr>
       <w:pBdr/>
@@ -9413,9 +10857,9 @@
       </w:tcPr>
     </w:tblStylePr>
   </w:style>
-  <w:style w:type="table" w:styleId="776">
+  <w:style w:type="table" w:styleId="729">
     <w:name w:val="Grid Table 3 - Accent 5"/>
-    <w:basedOn w:val="897"/>
+    <w:basedOn w:val="850"/>
     <w:uiPriority w:val="99"/>
     <w:pPr>
       <w:pBdr/>
@@ -9658,9 +11102,9 @@
       </w:tcPr>
     </w:tblStylePr>
   </w:style>
-  <w:style w:type="table" w:styleId="777">
+  <w:style w:type="table" w:styleId="730">
     <w:name w:val="Grid Table 3 - Accent 6"/>
-    <w:basedOn w:val="897"/>
+    <w:basedOn w:val="850"/>
     <w:uiPriority w:val="99"/>
     <w:pPr>
       <w:pBdr/>
@@ -9903,9 +11347,9 @@
       </w:tcPr>
     </w:tblStylePr>
   </w:style>
-  <w:style w:type="table" w:styleId="778">
+  <w:style w:type="table" w:styleId="731">
     <w:name w:val="Grid Table 4"/>
-    <w:basedOn w:val="897"/>
+    <w:basedOn w:val="850"/>
     <w:uiPriority w:val="59"/>
     <w:pPr>
       <w:pBdr/>
@@ -10136,9 +11580,9 @@
       </w:tcPr>
     </w:tblStylePr>
   </w:style>
-  <w:style w:type="table" w:styleId="779">
+  <w:style w:type="table" w:styleId="732">
     <w:name w:val="Grid Table 4 - Accent 1"/>
-    <w:basedOn w:val="897"/>
+    <w:basedOn w:val="850"/>
     <w:uiPriority w:val="59"/>
     <w:pPr>
       <w:pBdr/>
@@ -10369,9 +11813,9 @@
       </w:tcPr>
     </w:tblStylePr>
   </w:style>
-  <w:style w:type="table" w:styleId="780">
+  <w:style w:type="table" w:styleId="733">
     <w:name w:val="Grid Table 4 - Accent 2"/>
-    <w:basedOn w:val="897"/>
+    <w:basedOn w:val="850"/>
     <w:uiPriority w:val="59"/>
     <w:pPr>
       <w:pBdr/>
@@ -10602,9 +12046,9 @@
       </w:tcPr>
     </w:tblStylePr>
   </w:style>
-  <w:style w:type="table" w:styleId="781">
+  <w:style w:type="table" w:styleId="734">
     <w:name w:val="Grid Table 4 - Accent 3"/>
-    <w:basedOn w:val="897"/>
+    <w:basedOn w:val="850"/>
     <w:uiPriority w:val="59"/>
     <w:pPr>
       <w:pBdr/>
@@ -10835,9 +12279,9 @@
       </w:tcPr>
     </w:tblStylePr>
   </w:style>
-  <w:style w:type="table" w:styleId="782">
+  <w:style w:type="table" w:styleId="735">
     <w:name w:val="Grid Table 4 - Accent 4"/>
-    <w:basedOn w:val="897"/>
+    <w:basedOn w:val="850"/>
     <w:uiPriority w:val="59"/>
     <w:pPr>
       <w:pBdr/>
@@ -11068,9 +12512,9 @@
       </w:tcPr>
     </w:tblStylePr>
   </w:style>
-  <w:style w:type="table" w:styleId="783">
+  <w:style w:type="table" w:styleId="736">
     <w:name w:val="Grid Table 4 - Accent 5"/>
-    <w:basedOn w:val="897"/>
+    <w:basedOn w:val="850"/>
     <w:uiPriority w:val="59"/>
     <w:pPr>
       <w:pBdr/>
@@ -11301,9 +12745,9 @@
       </w:tcPr>
     </w:tblStylePr>
   </w:style>
-  <w:style w:type="table" w:styleId="784">
+  <w:style w:type="table" w:styleId="737">
     <w:name w:val="Grid Table 4 - Accent 6"/>
-    <w:basedOn w:val="897"/>
+    <w:basedOn w:val="850"/>
     <w:uiPriority w:val="59"/>
     <w:pPr>
       <w:pBdr/>
@@ -11534,9 +12978,9 @@
       </w:tcPr>
     </w:tblStylePr>
   </w:style>
-  <w:style w:type="table" w:styleId="785">
+  <w:style w:type="table" w:styleId="738">
     <w:name w:val="Grid Table 5 Dark"/>
-    <w:basedOn w:val="897"/>
+    <w:basedOn w:val="850"/>
     <w:uiPriority w:val="99"/>
     <w:pPr>
       <w:pBdr/>
@@ -11762,9 +13206,9 @@
       </w:tcPr>
     </w:tblStylePr>
   </w:style>
-  <w:style w:type="table" w:styleId="786">
+  <w:style w:type="table" w:styleId="739">
     <w:name w:val="Grid Table 5 Dark- Accent 1"/>
-    <w:basedOn w:val="897"/>
+    <w:basedOn w:val="850"/>
     <w:uiPriority w:val="99"/>
     <w:pPr>
       <w:pBdr/>
@@ -11990,9 +13434,9 @@
       </w:tcPr>
     </w:tblStylePr>
   </w:style>
-  <w:style w:type="table" w:styleId="787">
+  <w:style w:type="table" w:styleId="740">
     <w:name w:val="Grid Table 5 Dark - Accent 2"/>
-    <w:basedOn w:val="897"/>
+    <w:basedOn w:val="850"/>
     <w:uiPriority w:val="99"/>
     <w:pPr>
       <w:pBdr/>
@@ -12218,9 +13662,9 @@
       </w:tcPr>
     </w:tblStylePr>
   </w:style>
-  <w:style w:type="table" w:styleId="788">
+  <w:style w:type="table" w:styleId="741">
     <w:name w:val="Grid Table 5 Dark - Accent 3"/>
-    <w:basedOn w:val="897"/>
+    <w:basedOn w:val="850"/>
     <w:uiPriority w:val="99"/>
     <w:pPr>
       <w:pBdr/>
@@ -12446,9 +13890,9 @@
       </w:tcPr>
     </w:tblStylePr>
   </w:style>
-  <w:style w:type="table" w:styleId="789">
+  <w:style w:type="table" w:styleId="742">
     <w:name w:val="Grid Table 5 Dark- Accent 4"/>
-    <w:basedOn w:val="897"/>
+    <w:basedOn w:val="850"/>
     <w:uiPriority w:val="99"/>
     <w:pPr>
       <w:pBdr/>
@@ -12674,9 +14118,9 @@
       </w:tcPr>
     </w:tblStylePr>
   </w:style>
-  <w:style w:type="table" w:styleId="790">
+  <w:style w:type="table" w:styleId="743">
     <w:name w:val="Grid Table 5 Dark - Accent 5"/>
-    <w:basedOn w:val="897"/>
+    <w:basedOn w:val="850"/>
     <w:uiPriority w:val="99"/>
     <w:pPr>
       <w:pBdr/>
@@ -12902,9 +14346,9 @@
       </w:tcPr>
     </w:tblStylePr>
   </w:style>
-  <w:style w:type="table" w:styleId="791">
+  <w:style w:type="table" w:styleId="744">
     <w:name w:val="Grid Table 5 Dark - Accent 6"/>
-    <w:basedOn w:val="897"/>
+    <w:basedOn w:val="850"/>
     <w:uiPriority w:val="99"/>
     <w:pPr>
       <w:pBdr/>
@@ -13130,9 +14574,9 @@
       </w:tcPr>
     </w:tblStylePr>
   </w:style>
-  <w:style w:type="table" w:styleId="792">
+  <w:style w:type="table" w:styleId="745">
     <w:name w:val="Grid Table 6 Colorful"/>
-    <w:basedOn w:val="897"/>
+    <w:basedOn w:val="850"/>
     <w:uiPriority w:val="99"/>
     <w:pPr>
       <w:pBdr/>
@@ -13360,9 +14804,9 @@
       </w:tcPr>
     </w:tblStylePr>
   </w:style>
-  <w:style w:type="table" w:styleId="793">
+  <w:style w:type="table" w:styleId="746">
     <w:name w:val="Grid Table 6 Colorful - Accent 1"/>
-    <w:basedOn w:val="897"/>
+    <w:basedOn w:val="850"/>
     <w:uiPriority w:val="99"/>
     <w:pPr>
       <w:pBdr/>
@@ -13590,9 +15034,9 @@
       </w:tcPr>
     </w:tblStylePr>
   </w:style>
-  <w:style w:type="table" w:styleId="794">
+  <w:style w:type="table" w:styleId="747">
     <w:name w:val="Grid Table 6 Colorful - Accent 2"/>
-    <w:basedOn w:val="897"/>
+    <w:basedOn w:val="850"/>
     <w:uiPriority w:val="99"/>
     <w:pPr>
       <w:pBdr/>
@@ -13820,9 +15264,9 @@
       </w:tcPr>
     </w:tblStylePr>
   </w:style>
-  <w:style w:type="table" w:styleId="795">
+  <w:style w:type="table" w:styleId="748">
     <w:name w:val="Grid Table 6 Colorful - Accent 3"/>
-    <w:basedOn w:val="897"/>
+    <w:basedOn w:val="850"/>
     <w:uiPriority w:val="99"/>
     <w:pPr>
       <w:pBdr/>
@@ -14050,9 +15494,9 @@
       </w:tcPr>
     </w:tblStylePr>
   </w:style>
-  <w:style w:type="table" w:styleId="796">
+  <w:style w:type="table" w:styleId="749">
     <w:name w:val="Grid Table 6 Colorful - Accent 4"/>
-    <w:basedOn w:val="897"/>
+    <w:basedOn w:val="850"/>
     <w:uiPriority w:val="99"/>
     <w:pPr>
       <w:pBdr/>
@@ -14280,9 +15724,9 @@
       </w:tcPr>
     </w:tblStylePr>
   </w:style>
-  <w:style w:type="table" w:styleId="797">
+  <w:style w:type="table" w:styleId="750">
     <w:name w:val="Grid Table 6 Colorful - Accent 5"/>
-    <w:basedOn w:val="897"/>
+    <w:basedOn w:val="850"/>
     <w:uiPriority w:val="99"/>
     <w:pPr>
       <w:pBdr/>
@@ -14510,9 +15954,9 @@
       </w:tcPr>
     </w:tblStylePr>
   </w:style>
-  <w:style w:type="table" w:styleId="798">
+  <w:style w:type="table" w:styleId="751">
     <w:name w:val="Grid Table 6 Colorful - Accent 6"/>
-    <w:basedOn w:val="897"/>
+    <w:basedOn w:val="850"/>
     <w:uiPriority w:val="99"/>
     <w:pPr>
       <w:pBdr/>
@@ -14740,9 +16184,9 @@
       </w:tcPr>
     </w:tblStylePr>
   </w:style>
-  <w:style w:type="table" w:styleId="799">
+  <w:style w:type="table" w:styleId="752">
     <w:name w:val="Grid Table 7 Colorful"/>
-    <w:basedOn w:val="897"/>
+    <w:basedOn w:val="850"/>
     <w:uiPriority w:val="99"/>
     <w:pPr>
       <w:pBdr/>
@@ -14994,9 +16438,9 @@
       </w:tcPr>
     </w:tblStylePr>
   </w:style>
-  <w:style w:type="table" w:styleId="800">
+  <w:style w:type="table" w:styleId="753">
     <w:name w:val="Grid Table 7 Colorful - Accent 1"/>
-    <w:basedOn w:val="897"/>
+    <w:basedOn w:val="850"/>
     <w:uiPriority w:val="99"/>
     <w:pPr>
       <w:pBdr/>
@@ -15248,9 +16692,9 @@
       </w:tcPr>
     </w:tblStylePr>
   </w:style>
-  <w:style w:type="table" w:styleId="801">
+  <w:style w:type="table" w:styleId="754">
     <w:name w:val="Grid Table 7 Colorful - Accent 2"/>
-    <w:basedOn w:val="897"/>
+    <w:basedOn w:val="850"/>
     <w:uiPriority w:val="99"/>
     <w:pPr>
       <w:pBdr/>
@@ -15502,9 +16946,9 @@
       </w:tcPr>
     </w:tblStylePr>
   </w:style>
-  <w:style w:type="table" w:styleId="802">
+  <w:style w:type="table" w:styleId="755">
     <w:name w:val="Grid Table 7 Colorful - Accent 3"/>
-    <w:basedOn w:val="897"/>
+    <w:basedOn w:val="850"/>
     <w:uiPriority w:val="99"/>
     <w:pPr>
       <w:pBdr/>
@@ -15756,9 +17200,9 @@
       </w:tcPr>
     </w:tblStylePr>
   </w:style>
-  <w:style w:type="table" w:styleId="803">
+  <w:style w:type="table" w:styleId="756">
     <w:name w:val="Grid Table 7 Colorful - Accent 4"/>
-    <w:basedOn w:val="897"/>
+    <w:basedOn w:val="850"/>
     <w:uiPriority w:val="99"/>
     <w:pPr>
       <w:pBdr/>
@@ -16010,9 +17454,9 @@
       </w:tcPr>
     </w:tblStylePr>
   </w:style>
-  <w:style w:type="table" w:styleId="804">
+  <w:style w:type="table" w:styleId="757">
     <w:name w:val="Grid Table 7 Colorful - Accent 5"/>
-    <w:basedOn w:val="897"/>
+    <w:basedOn w:val="850"/>
     <w:uiPriority w:val="99"/>
     <w:pPr>
       <w:pBdr/>
@@ -16264,9 +17708,9 @@
       </w:tcPr>
     </w:tblStylePr>
   </w:style>
-  <w:style w:type="table" w:styleId="805">
+  <w:style w:type="table" w:styleId="758">
     <w:name w:val="Grid Table 7 Colorful - Accent 6"/>
-    <w:basedOn w:val="897"/>
+    <w:basedOn w:val="850"/>
     <w:uiPriority w:val="99"/>
     <w:pPr>
       <w:pBdr/>
@@ -16518,9 +17962,9 @@
       </w:tcPr>
     </w:tblStylePr>
   </w:style>
-  <w:style w:type="table" w:styleId="806">
+  <w:style w:type="table" w:styleId="759">
     <w:name w:val="List Table 1 Light"/>
-    <w:basedOn w:val="897"/>
+    <w:basedOn w:val="850"/>
     <w:uiPriority w:val="99"/>
     <w:pPr>
       <w:pBdr/>
@@ -16734,9 +18178,9 @@
       </w:tcPr>
     </w:tblStylePr>
   </w:style>
-  <w:style w:type="table" w:styleId="807">
+  <w:style w:type="table" w:styleId="760">
     <w:name w:val="List Table 1 Light - Accent 1"/>
-    <w:basedOn w:val="897"/>
+    <w:basedOn w:val="850"/>
     <w:uiPriority w:val="99"/>
     <w:pPr>
       <w:pBdr/>
@@ -16950,9 +18394,9 @@
       </w:tcPr>
     </w:tblStylePr>
   </w:style>
-  <w:style w:type="table" w:styleId="808">
+  <w:style w:type="table" w:styleId="761">
     <w:name w:val="List Table 1 Light - Accent 2"/>
-    <w:basedOn w:val="897"/>
+    <w:basedOn w:val="850"/>
     <w:uiPriority w:val="99"/>
     <w:pPr>
       <w:pBdr/>
@@ -17166,9 +18610,9 @@
       </w:tcPr>
     </w:tblStylePr>
   </w:style>
-  <w:style w:type="table" w:styleId="809">
+  <w:style w:type="table" w:styleId="762">
     <w:name w:val="List Table 1 Light - Accent 3"/>
-    <w:basedOn w:val="897"/>
+    <w:basedOn w:val="850"/>
     <w:uiPriority w:val="99"/>
     <w:pPr>
       <w:pBdr/>
@@ -17382,9 +18826,9 @@
       </w:tcPr>
     </w:tblStylePr>
   </w:style>
-  <w:style w:type="table" w:styleId="810">
+  <w:style w:type="table" w:styleId="763">
     <w:name w:val="List Table 1 Light - Accent 4"/>
-    <w:basedOn w:val="897"/>
+    <w:basedOn w:val="850"/>
     <w:uiPriority w:val="99"/>
     <w:pPr>
       <w:pBdr/>
@@ -17598,9 +19042,9 @@
       </w:tcPr>
     </w:tblStylePr>
   </w:style>
-  <w:style w:type="table" w:styleId="811">
+  <w:style w:type="table" w:styleId="764">
     <w:name w:val="List Table 1 Light - Accent 5"/>
-    <w:basedOn w:val="897"/>
+    <w:basedOn w:val="850"/>
     <w:uiPriority w:val="99"/>
     <w:pPr>
       <w:pBdr/>
@@ -17814,9 +19258,9 @@
       </w:tcPr>
     </w:tblStylePr>
   </w:style>
-  <w:style w:type="table" w:styleId="812">
+  <w:style w:type="table" w:styleId="765">
     <w:name w:val="List Table 1 Light - Accent 6"/>
-    <w:basedOn w:val="897"/>
+    <w:basedOn w:val="850"/>
     <w:uiPriority w:val="99"/>
     <w:pPr>
       <w:pBdr/>
@@ -18030,9 +19474,9 @@
       </w:tcPr>
     </w:tblStylePr>
   </w:style>
-  <w:style w:type="table" w:styleId="813">
+  <w:style w:type="table" w:styleId="766">
     <w:name w:val="List Table 2"/>
-    <w:basedOn w:val="897"/>
+    <w:basedOn w:val="850"/>
     <w:uiPriority w:val="99"/>
     <w:pPr>
       <w:pBdr/>
@@ -18268,9 +19712,9 @@
       </w:tcPr>
     </w:tblStylePr>
   </w:style>
-  <w:style w:type="table" w:styleId="814">
+  <w:style w:type="table" w:styleId="767">
     <w:name w:val="List Table 2 - Accent 1"/>
-    <w:basedOn w:val="897"/>
+    <w:basedOn w:val="850"/>
     <w:uiPriority w:val="99"/>
     <w:pPr>
       <w:pBdr/>
@@ -18506,9 +19950,9 @@
       </w:tcPr>
     </w:tblStylePr>
   </w:style>
-  <w:style w:type="table" w:styleId="815">
+  <w:style w:type="table" w:styleId="768">
     <w:name w:val="List Table 2 - Accent 2"/>
-    <w:basedOn w:val="897"/>
+    <w:basedOn w:val="850"/>
     <w:uiPriority w:val="99"/>
     <w:pPr>
       <w:pBdr/>
@@ -18744,9 +20188,9 @@
       </w:tcPr>
     </w:tblStylePr>
   </w:style>
-  <w:style w:type="table" w:styleId="816">
+  <w:style w:type="table" w:styleId="769">
     <w:name w:val="List Table 2 - Accent 3"/>
-    <w:basedOn w:val="897"/>
+    <w:basedOn w:val="850"/>
     <w:uiPriority w:val="99"/>
     <w:pPr>
       <w:pBdr/>
@@ -18982,9 +20426,9 @@
       </w:tcPr>
     </w:tblStylePr>
   </w:style>
-  <w:style w:type="table" w:styleId="817">
+  <w:style w:type="table" w:styleId="770">
     <w:name w:val="List Table 2 - Accent 4"/>
-    <w:basedOn w:val="897"/>
+    <w:basedOn w:val="850"/>
     <w:uiPriority w:val="99"/>
     <w:pPr>
       <w:pBdr/>
@@ -19220,9 +20664,9 @@
       </w:tcPr>
     </w:tblStylePr>
   </w:style>
-  <w:style w:type="table" w:styleId="818">
+  <w:style w:type="table" w:styleId="771">
     <w:name w:val="List Table 2 - Accent 5"/>
-    <w:basedOn w:val="897"/>
+    <w:basedOn w:val="850"/>
     <w:uiPriority w:val="99"/>
     <w:pPr>
       <w:pBdr/>
@@ -19458,9 +20902,9 @@
       </w:tcPr>
     </w:tblStylePr>
   </w:style>
-  <w:style w:type="table" w:styleId="819">
+  <w:style w:type="table" w:styleId="772">
     <w:name w:val="List Table 2 - Accent 6"/>
-    <w:basedOn w:val="897"/>
+    <w:basedOn w:val="850"/>
     <w:uiPriority w:val="99"/>
     <w:pPr>
       <w:pBdr/>
@@ -19696,9 +21140,9 @@
       </w:tcPr>
     </w:tblStylePr>
   </w:style>
-  <w:style w:type="table" w:styleId="820">
+  <w:style w:type="table" w:styleId="773">
     <w:name w:val="List Table 3"/>
-    <w:basedOn w:val="897"/>
+    <w:basedOn w:val="850"/>
     <w:uiPriority w:val="99"/>
     <w:pPr>
       <w:pBdr/>
@@ -19924,9 +21368,9 @@
       </w:tcPr>
     </w:tblStylePr>
   </w:style>
-  <w:style w:type="table" w:styleId="821">
+  <w:style w:type="table" w:styleId="774">
     <w:name w:val="List Table 3 - Accent 1"/>
-    <w:basedOn w:val="897"/>
+    <w:basedOn w:val="850"/>
     <w:uiPriority w:val="99"/>
     <w:pPr>
       <w:pBdr/>
@@ -20152,9 +21596,9 @@
       </w:tcPr>
     </w:tblStylePr>
   </w:style>
-  <w:style w:type="table" w:styleId="822">
+  <w:style w:type="table" w:styleId="775">
     <w:name w:val="List Table 3 - Accent 2"/>
-    <w:basedOn w:val="897"/>
+    <w:basedOn w:val="850"/>
     <w:uiPriority w:val="99"/>
     <w:pPr>
       <w:pBdr/>
@@ -20380,9 +21824,9 @@
       </w:tcPr>
     </w:tblStylePr>
   </w:style>
-  <w:style w:type="table" w:styleId="823">
+  <w:style w:type="table" w:styleId="776">
     <w:name w:val="List Table 3 - Accent 3"/>
-    <w:basedOn w:val="897"/>
+    <w:basedOn w:val="850"/>
     <w:uiPriority w:val="99"/>
     <w:pPr>
       <w:pBdr/>
@@ -20608,9 +22052,9 @@
       </w:tcPr>
     </w:tblStylePr>
   </w:style>
-  <w:style w:type="table" w:styleId="824">
+  <w:style w:type="table" w:styleId="777">
     <w:name w:val="List Table 3 - Accent 4"/>
-    <w:basedOn w:val="897"/>
+    <w:basedOn w:val="850"/>
     <w:uiPriority w:val="99"/>
     <w:pPr>
       <w:pBdr/>
@@ -20836,9 +22280,9 @@
       </w:tcPr>
     </w:tblStylePr>
   </w:style>
-  <w:style w:type="table" w:styleId="825">
+  <w:style w:type="table" w:styleId="778">
     <w:name w:val="List Table 3 - Accent 5"/>
-    <w:basedOn w:val="897"/>
+    <w:basedOn w:val="850"/>
     <w:uiPriority w:val="99"/>
     <w:pPr>
       <w:pBdr/>
@@ -21064,9 +22508,9 @@
       </w:tcPr>
     </w:tblStylePr>
   </w:style>
-  <w:style w:type="table" w:styleId="826">
+  <w:style w:type="table" w:styleId="779">
     <w:name w:val="List Table 3 - Accent 6"/>
-    <w:basedOn w:val="897"/>
+    <w:basedOn w:val="850"/>
     <w:uiPriority w:val="99"/>
     <w:pPr>
       <w:pBdr/>
@@ -21292,9 +22736,9 @@
       </w:tcPr>
     </w:tblStylePr>
   </w:style>
-  <w:style w:type="table" w:styleId="827">
+  <w:style w:type="table" w:styleId="780">
     <w:name w:val="List Table 4"/>
-    <w:basedOn w:val="897"/>
+    <w:basedOn w:val="850"/>
     <w:uiPriority w:val="99"/>
     <w:pPr>
       <w:pBdr/>
@@ -21517,9 +22961,9 @@
       </w:tcPr>
     </w:tblStylePr>
   </w:style>
-  <w:style w:type="table" w:styleId="828">
+  <w:style w:type="table" w:styleId="781">
     <w:name w:val="List Table 4 - Accent 1"/>
-    <w:basedOn w:val="897"/>
+    <w:basedOn w:val="850"/>
     <w:uiPriority w:val="99"/>
     <w:pPr>
       <w:pBdr/>
@@ -21742,9 +23186,9 @@
       </w:tcPr>
     </w:tblStylePr>
   </w:style>
-  <w:style w:type="table" w:styleId="829">
+  <w:style w:type="table" w:styleId="782">
     <w:name w:val="List Table 4 - Accent 2"/>
-    <w:basedOn w:val="897"/>
+    <w:basedOn w:val="850"/>
     <w:uiPriority w:val="99"/>
     <w:pPr>
       <w:pBdr/>
@@ -21967,9 +23411,9 @@
       </w:tcPr>
     </w:tblStylePr>
   </w:style>
-  <w:style w:type="table" w:styleId="830">
+  <w:style w:type="table" w:styleId="783">
     <w:name w:val="List Table 4 - Accent 3"/>
-    <w:basedOn w:val="897"/>
+    <w:basedOn w:val="850"/>
     <w:uiPriority w:val="99"/>
     <w:pPr>
       <w:pBdr/>
@@ -22192,9 +23636,9 @@
       </w:tcPr>
     </w:tblStylePr>
   </w:style>
-  <w:style w:type="table" w:styleId="831">
+  <w:style w:type="table" w:styleId="784">
     <w:name w:val="List Table 4 - Accent 4"/>
-    <w:basedOn w:val="897"/>
+    <w:basedOn w:val="850"/>
     <w:uiPriority w:val="99"/>
     <w:pPr>
       <w:pBdr/>
@@ -22417,9 +23861,9 @@
       </w:tcPr>
     </w:tblStylePr>
   </w:style>
-  <w:style w:type="table" w:styleId="832">
+  <w:style w:type="table" w:styleId="785">
     <w:name w:val="List Table 4 - Accent 5"/>
-    <w:basedOn w:val="897"/>
+    <w:basedOn w:val="850"/>
     <w:uiPriority w:val="99"/>
     <w:pPr>
       <w:pBdr/>
@@ -22642,9 +24086,9 @@
       </w:tcPr>
     </w:tblStylePr>
   </w:style>
-  <w:style w:type="table" w:styleId="833">
+  <w:style w:type="table" w:styleId="786">
     <w:name w:val="List Table 4 - Accent 6"/>
-    <w:basedOn w:val="897"/>
+    <w:basedOn w:val="850"/>
     <w:uiPriority w:val="99"/>
     <w:pPr>
       <w:pBdr/>
@@ -22867,9 +24311,9 @@
       </w:tcPr>
     </w:tblStylePr>
   </w:style>
-  <w:style w:type="table" w:styleId="834">
+  <w:style w:type="table" w:styleId="787">
     <w:name w:val="List Table 5 Dark"/>
-    <w:basedOn w:val="897"/>
+    <w:basedOn w:val="850"/>
     <w:uiPriority w:val="99"/>
     <w:pPr>
       <w:pBdr/>
@@ -23109,9 +24553,9 @@
       </w:tcPr>
     </w:tblStylePr>
   </w:style>
-  <w:style w:type="table" w:styleId="835">
+  <w:style w:type="table" w:styleId="788">
     <w:name w:val="List Table 5 Dark - Accent 1"/>
-    <w:basedOn w:val="897"/>
+    <w:basedOn w:val="850"/>
     <w:uiPriority w:val="99"/>
     <w:pPr>
       <w:pBdr/>
@@ -23351,9 +24795,9 @@
       </w:tcPr>
     </w:tblStylePr>
   </w:style>
-  <w:style w:type="table" w:styleId="836">
+  <w:style w:type="table" w:styleId="789">
     <w:name w:val="List Table 5 Dark - Accent 2"/>
-    <w:basedOn w:val="897"/>
+    <w:basedOn w:val="850"/>
     <w:uiPriority w:val="99"/>
     <w:pPr>
       <w:pBdr/>
@@ -23593,9 +25037,9 @@
       </w:tcPr>
     </w:tblStylePr>
   </w:style>
-  <w:style w:type="table" w:styleId="837">
+  <w:style w:type="table" w:styleId="790">
     <w:name w:val="List Table 5 Dark - Accent 3"/>
-    <w:basedOn w:val="897"/>
+    <w:basedOn w:val="850"/>
     <w:uiPriority w:val="99"/>
     <w:pPr>
       <w:pBdr/>
@@ -23835,9 +25279,9 @@
       </w:tcPr>
     </w:tblStylePr>
   </w:style>
-  <w:style w:type="table" w:styleId="838">
+  <w:style w:type="table" w:styleId="791">
     <w:name w:val="List Table 5 Dark - Accent 4"/>
-    <w:basedOn w:val="897"/>
+    <w:basedOn w:val="850"/>
     <w:uiPriority w:val="99"/>
     <w:pPr>
       <w:pBdr/>
@@ -24077,9 +25521,9 @@
       </w:tcPr>
     </w:tblStylePr>
   </w:style>
-  <w:style w:type="table" w:styleId="839">
+  <w:style w:type="table" w:styleId="792">
     <w:name w:val="List Table 5 Dark - Accent 5"/>
-    <w:basedOn w:val="897"/>
+    <w:basedOn w:val="850"/>
     <w:uiPriority w:val="99"/>
     <w:pPr>
       <w:pBdr/>
@@ -24319,9 +25763,9 @@
       </w:tcPr>
     </w:tblStylePr>
   </w:style>
-  <w:style w:type="table" w:styleId="840">
+  <w:style w:type="table" w:styleId="793">
     <w:name w:val="List Table 5 Dark - Accent 6"/>
-    <w:basedOn w:val="897"/>
+    <w:basedOn w:val="850"/>
     <w:uiPriority w:val="99"/>
     <w:pPr>
       <w:pBdr/>
@@ -24561,9 +26005,9 @@
       </w:tcPr>
     </w:tblStylePr>
   </w:style>
-  <w:style w:type="table" w:styleId="841">
+  <w:style w:type="table" w:styleId="794">
     <w:name w:val="List Table 6 Colorful"/>
-    <w:basedOn w:val="897"/>
+    <w:basedOn w:val="850"/>
     <w:uiPriority w:val="99"/>
     <w:pPr>
       <w:pBdr/>
@@ -24784,9 +26228,9 @@
       </w:tcPr>
     </w:tblStylePr>
   </w:style>
-  <w:style w:type="table" w:styleId="842">
+  <w:style w:type="table" w:styleId="795">
     <w:name w:val="List Table 6 Colorful - Accent 1"/>
-    <w:basedOn w:val="897"/>
+    <w:basedOn w:val="850"/>
     <w:uiPriority w:val="99"/>
     <w:pPr>
       <w:pBdr/>
@@ -25007,9 +26451,9 @@
       </w:tcPr>
     </w:tblStylePr>
   </w:style>
-  <w:style w:type="table" w:styleId="843">
+  <w:style w:type="table" w:styleId="796">
     <w:name w:val="List Table 6 Colorful - Accent 2"/>
-    <w:basedOn w:val="897"/>
+    <w:basedOn w:val="850"/>
     <w:uiPriority w:val="99"/>
     <w:pPr>
       <w:pBdr/>
@@ -25230,9 +26674,9 @@
       </w:tcPr>
     </w:tblStylePr>
   </w:style>
-  <w:style w:type="table" w:styleId="844">
+  <w:style w:type="table" w:styleId="797">
     <w:name w:val="List Table 6 Colorful - Accent 3"/>
-    <w:basedOn w:val="897"/>
+    <w:basedOn w:val="850"/>
     <w:uiPriority w:val="99"/>
     <w:pPr>
       <w:pBdr/>
@@ -25453,9 +26897,9 @@
       </w:tcPr>
     </w:tblStylePr>
   </w:style>
-  <w:style w:type="table" w:styleId="845">
+  <w:style w:type="table" w:styleId="798">
     <w:name w:val="List Table 6 Colorful - Accent 4"/>
-    <w:basedOn w:val="897"/>
+    <w:basedOn w:val="850"/>
     <w:uiPriority w:val="99"/>
     <w:pPr>
       <w:pBdr/>
@@ -25676,9 +27120,9 @@
       </w:tcPr>
     </w:tblStylePr>
   </w:style>
-  <w:style w:type="table" w:styleId="846">
+  <w:style w:type="table" w:styleId="799">
     <w:name w:val="List Table 6 Colorful - Accent 5"/>
-    <w:basedOn w:val="897"/>
+    <w:basedOn w:val="850"/>
     <w:uiPriority w:val="99"/>
     <w:pPr>
       <w:pBdr/>
@@ -25899,9 +27343,9 @@
       </w:tcPr>
     </w:tblStylePr>
   </w:style>
-  <w:style w:type="table" w:styleId="847">
+  <w:style w:type="table" w:styleId="800">
     <w:name w:val="List Table 6 Colorful - Accent 6"/>
-    <w:basedOn w:val="897"/>
+    <w:basedOn w:val="850"/>
     <w:uiPriority w:val="99"/>
     <w:pPr>
       <w:pBdr/>
@@ -26122,9 +27566,9 @@
       </w:tcPr>
     </w:tblStylePr>
   </w:style>
-  <w:style w:type="table" w:styleId="848">
+  <w:style w:type="table" w:styleId="801">
     <w:name w:val="List Table 7 Colorful"/>
-    <w:basedOn w:val="897"/>
+    <w:basedOn w:val="850"/>
     <w:uiPriority w:val="99"/>
     <w:pPr>
       <w:pBdr/>
@@ -26378,9 +27822,9 @@
       </w:tcPr>
     </w:tblStylePr>
   </w:style>
-  <w:style w:type="table" w:styleId="849">
+  <w:style w:type="table" w:styleId="802">
     <w:name w:val="List Table 7 Colorful - Accent 1"/>
-    <w:basedOn w:val="897"/>
+    <w:basedOn w:val="850"/>
     <w:uiPriority w:val="99"/>
     <w:pPr>
       <w:pBdr/>
@@ -26634,9 +28078,9 @@
       </w:tcPr>
     </w:tblStylePr>
   </w:style>
-  <w:style w:type="table" w:styleId="850">
+  <w:style w:type="table" w:styleId="803">
     <w:name w:val="List Table 7 Colorful - Accent 2"/>
-    <w:basedOn w:val="897"/>
+    <w:basedOn w:val="850"/>
     <w:uiPriority w:val="99"/>
     <w:pPr>
       <w:pBdr/>
@@ -26890,9 +28334,9 @@
       </w:tcPr>
     </w:tblStylePr>
   </w:style>
-  <w:style w:type="table" w:styleId="851">
+  <w:style w:type="table" w:styleId="804">
     <w:name w:val="List Table 7 Colorful - Accent 3"/>
-    <w:basedOn w:val="897"/>
+    <w:basedOn w:val="850"/>
     <w:uiPriority w:val="99"/>
     <w:pPr>
       <w:pBdr/>
@@ -27146,9 +28590,9 @@
       </w:tcPr>
     </w:tblStylePr>
   </w:style>
-  <w:style w:type="table" w:styleId="852">
+  <w:style w:type="table" w:styleId="805">
     <w:name w:val="List Table 7 Colorful - Accent 4"/>
-    <w:basedOn w:val="897"/>
+    <w:basedOn w:val="850"/>
     <w:uiPriority w:val="99"/>
     <w:pPr>
       <w:pBdr/>
@@ -27402,9 +28846,9 @@
       </w:tcPr>
     </w:tblStylePr>
   </w:style>
-  <w:style w:type="table" w:styleId="853">
+  <w:style w:type="table" w:styleId="806">
     <w:name w:val="List Table 7 Colorful - Accent 5"/>
-    <w:basedOn w:val="897"/>
+    <w:basedOn w:val="850"/>
     <w:uiPriority w:val="99"/>
     <w:pPr>
       <w:pBdr/>
@@ -27658,9 +29102,9 @@
       </w:tcPr>
     </w:tblStylePr>
   </w:style>
-  <w:style w:type="table" w:styleId="854">
+  <w:style w:type="table" w:styleId="807">
     <w:name w:val="List Table 7 Colorful - Accent 6"/>
-    <w:basedOn w:val="897"/>
+    <w:basedOn w:val="850"/>
     <w:uiPriority w:val="99"/>
     <w:pPr>
       <w:pBdr/>
@@ -27914,9 +29358,9 @@
       </w:tcPr>
     </w:tblStylePr>
   </w:style>
-  <w:style w:type="table" w:styleId="855">
+  <w:style w:type="table" w:styleId="808">
     <w:name w:val="Lined - Accent"/>
-    <w:basedOn w:val="897"/>
+    <w:basedOn w:val="850"/>
     <w:uiPriority w:val="99"/>
     <w:pPr>
       <w:pBdr/>
@@ -28151,9 +29595,9 @@
       </w:tcPr>
     </w:tblStylePr>
   </w:style>
-  <w:style w:type="table" w:styleId="856">
+  <w:style w:type="table" w:styleId="809">
     <w:name w:val="Lined - Accent 1"/>
-    <w:basedOn w:val="897"/>
+    <w:basedOn w:val="850"/>
     <w:uiPriority w:val="99"/>
     <w:pPr>
       <w:pBdr/>
@@ -28388,9 +29832,9 @@
       </w:tcPr>
     </w:tblStylePr>
   </w:style>
-  <w:style w:type="table" w:styleId="857">
+  <w:style w:type="table" w:styleId="810">
     <w:name w:val="Lined - Accent 2"/>
-    <w:basedOn w:val="897"/>
+    <w:basedOn w:val="850"/>
     <w:uiPriority w:val="99"/>
     <w:pPr>
       <w:pBdr/>
@@ -28625,9 +30069,9 @@
       </w:tcPr>
     </w:tblStylePr>
   </w:style>
-  <w:style w:type="table" w:styleId="858">
+  <w:style w:type="table" w:styleId="811">
     <w:name w:val="Lined - Accent 3"/>
-    <w:basedOn w:val="897"/>
+    <w:basedOn w:val="850"/>
     <w:uiPriority w:val="99"/>
     <w:pPr>
       <w:pBdr/>
@@ -28862,9 +30306,9 @@
       </w:tcPr>
     </w:tblStylePr>
   </w:style>
-  <w:style w:type="table" w:styleId="859">
+  <w:style w:type="table" w:styleId="812">
     <w:name w:val="Lined - Accent 4"/>
-    <w:basedOn w:val="897"/>
+    <w:basedOn w:val="850"/>
     <w:uiPriority w:val="99"/>
     <w:pPr>
       <w:pBdr/>
@@ -29099,9 +30543,9 @@
       </w:tcPr>
     </w:tblStylePr>
   </w:style>
-  <w:style w:type="table" w:styleId="860">
+  <w:style w:type="table" w:styleId="813">
     <w:name w:val="Lined - Accent 5"/>
-    <w:basedOn w:val="897"/>
+    <w:basedOn w:val="850"/>
     <w:uiPriority w:val="99"/>
     <w:pPr>
       <w:pBdr/>
@@ -29336,9 +30780,9 @@
       </w:tcPr>
     </w:tblStylePr>
   </w:style>
-  <w:style w:type="table" w:styleId="861">
+  <w:style w:type="table" w:styleId="814">
     <w:name w:val="Lined - Accent 6"/>
-    <w:basedOn w:val="897"/>
+    <w:basedOn w:val="850"/>
     <w:uiPriority w:val="99"/>
     <w:pPr>
       <w:pBdr/>
@@ -29573,9 +31017,9 @@
       </w:tcPr>
     </w:tblStylePr>
   </w:style>
-  <w:style w:type="table" w:styleId="862">
+  <w:style w:type="table" w:styleId="815">
     <w:name w:val="Bordered &amp; Lined - Accent"/>
-    <w:basedOn w:val="897"/>
+    <w:basedOn w:val="850"/>
     <w:uiPriority w:val="99"/>
     <w:pPr>
       <w:pBdr/>
@@ -29817,9 +31261,9 @@
       </w:tcPr>
     </w:tblStylePr>
   </w:style>
-  <w:style w:type="table" w:styleId="863">
+  <w:style w:type="table" w:styleId="816">
     <w:name w:val="Bordered &amp; Lined - Accent 1"/>
-    <w:basedOn w:val="897"/>
+    <w:basedOn w:val="850"/>
     <w:uiPriority w:val="99"/>
     <w:pPr>
       <w:pBdr/>
@@ -30061,9 +31505,9 @@
       </w:tcPr>
     </w:tblStylePr>
   </w:style>
-  <w:style w:type="table" w:styleId="864">
+  <w:style w:type="table" w:styleId="817">
     <w:name w:val="Bordered &amp; Lined - Accent 2"/>
-    <w:basedOn w:val="897"/>
+    <w:basedOn w:val="850"/>
     <w:uiPriority w:val="99"/>
     <w:pPr>
       <w:pBdr/>
@@ -30305,9 +31749,9 @@
       </w:tcPr>
     </w:tblStylePr>
   </w:style>
-  <w:style w:type="table" w:styleId="865">
+  <w:style w:type="table" w:styleId="818">
     <w:name w:val="Bordered &amp; Lined - Accent 3"/>
-    <w:basedOn w:val="897"/>
+    <w:basedOn w:val="850"/>
     <w:uiPriority w:val="99"/>
     <w:pPr>
       <w:pBdr/>
@@ -30549,9 +31993,9 @@
       </w:tcPr>
     </w:tblStylePr>
   </w:style>
-  <w:style w:type="table" w:styleId="866">
+  <w:style w:type="table" w:styleId="819">
     <w:name w:val="Bordered &amp; Lined - Accent 4"/>
-    <w:basedOn w:val="897"/>
+    <w:basedOn w:val="850"/>
     <w:uiPriority w:val="99"/>
     <w:pPr>
       <w:pBdr/>
@@ -30793,9 +32237,9 @@
       </w:tcPr>
     </w:tblStylePr>
   </w:style>
-  <w:style w:type="table" w:styleId="867">
+  <w:style w:type="table" w:styleId="820">
     <w:name w:val="Bordered &amp; Lined - Accent 5"/>
-    <w:basedOn w:val="897"/>
+    <w:basedOn w:val="850"/>
     <w:uiPriority w:val="99"/>
     <w:pPr>
       <w:pBdr/>
@@ -31037,9 +32481,9 @@
       </w:tcPr>
     </w:tblStylePr>
   </w:style>
-  <w:style w:type="table" w:styleId="868">
+  <w:style w:type="table" w:styleId="821">
     <w:name w:val="Bordered &amp; Lined - Accent 6"/>
-    <w:basedOn w:val="897"/>
+    <w:basedOn w:val="850"/>
     <w:uiPriority w:val="99"/>
     <w:pPr>
       <w:pBdr/>
@@ -31281,9 +32725,9 @@
       </w:tcPr>
     </w:tblStylePr>
   </w:style>
-  <w:style w:type="table" w:styleId="869">
+  <w:style w:type="table" w:styleId="822">
     <w:name w:val="Bordered"/>
-    <w:basedOn w:val="897"/>
+    <w:basedOn w:val="850"/>
     <w:uiPriority w:val="99"/>
     <w:pPr>
       <w:pBdr/>
@@ -31512,9 +32956,9 @@
       </w:tcPr>
     </w:tblStylePr>
   </w:style>
-  <w:style w:type="table" w:styleId="870">
+  <w:style w:type="table" w:styleId="823">
     <w:name w:val="Bordered - Accent 1"/>
-    <w:basedOn w:val="897"/>
+    <w:basedOn w:val="850"/>
     <w:uiPriority w:val="99"/>
     <w:pPr>
       <w:pBdr/>
@@ -31743,9 +33187,9 @@
       </w:tcPr>
     </w:tblStylePr>
   </w:style>
-  <w:style w:type="table" w:styleId="871">
+  <w:style w:type="table" w:styleId="824">
     <w:name w:val="Bordered - Accent 2"/>
-    <w:basedOn w:val="897"/>
+    <w:basedOn w:val="850"/>
     <w:uiPriority w:val="99"/>
     <w:pPr>
       <w:pBdr/>
@@ -31974,9 +33418,9 @@
       </w:tcPr>
     </w:tblStylePr>
   </w:style>
-  <w:style w:type="table" w:styleId="872">
+  <w:style w:type="table" w:styleId="825">
     <w:name w:val="Bordered - Accent 3"/>
-    <w:basedOn w:val="897"/>
+    <w:basedOn w:val="850"/>
     <w:uiPriority w:val="99"/>
     <w:pPr>
       <w:pBdr/>
@@ -32205,9 +33649,9 @@
       </w:tcPr>
     </w:tblStylePr>
   </w:style>
-  <w:style w:type="table" w:styleId="873">
+  <w:style w:type="table" w:styleId="826">
     <w:name w:val="Bordered - Accent 4"/>
-    <w:basedOn w:val="897"/>
+    <w:basedOn w:val="850"/>
     <w:uiPriority w:val="99"/>
     <w:pPr>
       <w:pBdr/>
@@ -32436,9 +33880,9 @@
       </w:tcPr>
     </w:tblStylePr>
   </w:style>
-  <w:style w:type="table" w:styleId="874">
+  <w:style w:type="table" w:styleId="827">
     <w:name w:val="Bordered - Accent 5"/>
-    <w:basedOn w:val="897"/>
+    <w:basedOn w:val="850"/>
     <w:uiPriority w:val="99"/>
     <w:pPr>
       <w:pBdr/>
@@ -32667,9 +34111,9 @@
       </w:tcPr>
     </w:tblStylePr>
   </w:style>
-  <w:style w:type="table" w:styleId="875">
+  <w:style w:type="table" w:styleId="828">
     <w:name w:val="Bordered - Accent 6"/>
-    <w:basedOn w:val="897"/>
+    <w:basedOn w:val="850"/>
     <w:uiPriority w:val="99"/>
     <w:pPr>
       <w:pBdr/>
@@ -32898,7 +34342,7 @@
       </w:tcPr>
     </w:tblStylePr>
   </w:style>
-  <w:style w:type="character" w:styleId="876">
+  <w:style w:type="character" w:styleId="829">
     <w:name w:val="Hyperlink"/>
     <w:uiPriority w:val="99"/>
     <w:unhideWhenUsed/>
@@ -32912,10 +34356,10 @@
       <w:u w:val="single"/>
     </w:rPr>
   </w:style>
-  <w:style w:type="paragraph" w:styleId="877">
+  <w:style w:type="paragraph" w:styleId="830">
     <w:name w:val="footnote text"/>
-    <w:basedOn w:val="894"/>
-    <w:link w:val="878"/>
+    <w:basedOn w:val="847"/>
+    <w:link w:val="831"/>
     <w:uiPriority w:val="99"/>
     <w:semiHidden/>
     <w:unhideWhenUsed/>
@@ -32928,9 +34372,9 @@
       <w:sz w:val="18"/>
     </w:rPr>
   </w:style>
-  <w:style w:type="character" w:styleId="878">
+  <w:style w:type="character" w:styleId="831">
     <w:name w:val="Footnote Text Char"/>
-    <w:link w:val="877"/>
+    <w:link w:val="830"/>
     <w:uiPriority w:val="99"/>
     <w:pPr>
       <w:pBdr/>
@@ -32941,9 +34385,9 @@
       <w:sz w:val="18"/>
     </w:rPr>
   </w:style>
-  <w:style w:type="character" w:styleId="879">
+  <w:style w:type="character" w:styleId="832">
     <w:name w:val="footnote reference"/>
-    <w:basedOn w:val="896"/>
+    <w:basedOn w:val="849"/>
     <w:uiPriority w:val="99"/>
     <w:unhideWhenUsed/>
     <w:pPr>
@@ -32955,10 +34399,10 @@
       <w:vertAlign w:val="superscript"/>
     </w:rPr>
   </w:style>
-  <w:style w:type="paragraph" w:styleId="880">
+  <w:style w:type="paragraph" w:styleId="833">
     <w:name w:val="endnote text"/>
-    <w:basedOn w:val="894"/>
-    <w:link w:val="881"/>
+    <w:basedOn w:val="847"/>
+    <w:link w:val="834"/>
     <w:uiPriority w:val="99"/>
     <w:semiHidden/>
     <w:unhideWhenUsed/>
@@ -32971,9 +34415,9 @@
       <w:sz w:val="20"/>
     </w:rPr>
   </w:style>
-  <w:style w:type="character" w:styleId="881">
+  <w:style w:type="character" w:styleId="834">
     <w:name w:val="Endnote Text Char"/>
-    <w:link w:val="880"/>
+    <w:link w:val="833"/>
     <w:uiPriority w:val="99"/>
     <w:pPr>
       <w:pBdr/>
@@ -32984,9 +34428,9 @@
       <w:sz w:val="20"/>
     </w:rPr>
   </w:style>
-  <w:style w:type="character" w:styleId="882">
+  <w:style w:type="character" w:styleId="835">
     <w:name w:val="endnote reference"/>
-    <w:basedOn w:val="896"/>
+    <w:basedOn w:val="849"/>
     <w:uiPriority w:val="99"/>
     <w:semiHidden/>
     <w:unhideWhenUsed/>
@@ -32999,10 +34443,10 @@
       <w:vertAlign w:val="superscript"/>
     </w:rPr>
   </w:style>
-  <w:style w:type="paragraph" w:styleId="883">
+  <w:style w:type="paragraph" w:styleId="836">
     <w:name w:val="toc 1"/>
-    <w:basedOn w:val="894"/>
-    <w:next w:val="894"/>
+    <w:basedOn w:val="847"/>
+    <w:next w:val="847"/>
     <w:uiPriority w:val="39"/>
     <w:unhideWhenUsed/>
     <w:pPr>
@@ -33011,10 +34455,10 @@
       <w:ind w:right="0" w:firstLine="0" w:left="0"/>
     </w:pPr>
   </w:style>
-  <w:style w:type="paragraph" w:styleId="884">
+  <w:style w:type="paragraph" w:styleId="837">
     <w:name w:val="toc 2"/>
-    <w:basedOn w:val="894"/>
-    <w:next w:val="894"/>
+    <w:basedOn w:val="847"/>
+    <w:next w:val="847"/>
     <w:uiPriority w:val="39"/>
     <w:unhideWhenUsed/>
     <w:pPr>
@@ -33023,10 +34467,10 @@
       <w:ind w:right="0" w:firstLine="0" w:left="283"/>
     </w:pPr>
   </w:style>
-  <w:style w:type="paragraph" w:styleId="885">
+  <w:style w:type="paragraph" w:styleId="838">
     <w:name w:val="toc 3"/>
-    <w:basedOn w:val="894"/>
-    <w:next w:val="894"/>
+    <w:basedOn w:val="847"/>
+    <w:next w:val="847"/>
     <w:uiPriority w:val="39"/>
     <w:unhideWhenUsed/>
     <w:pPr>
@@ -33035,10 +34479,10 @@
       <w:ind w:right="0" w:firstLine="0" w:left="567"/>
     </w:pPr>
   </w:style>
-  <w:style w:type="paragraph" w:styleId="886">
+  <w:style w:type="paragraph" w:styleId="839">
     <w:name w:val="toc 4"/>
-    <w:basedOn w:val="894"/>
-    <w:next w:val="894"/>
+    <w:basedOn w:val="847"/>
+    <w:next w:val="847"/>
     <w:uiPriority w:val="39"/>
     <w:unhideWhenUsed/>
     <w:pPr>
@@ -33047,10 +34491,10 @@
       <w:ind w:right="0" w:firstLine="0" w:left="850"/>
     </w:pPr>
   </w:style>
-  <w:style w:type="paragraph" w:styleId="887">
+  <w:style w:type="paragraph" w:styleId="840">
     <w:name w:val="toc 5"/>
-    <w:basedOn w:val="894"/>
-    <w:next w:val="894"/>
+    <w:basedOn w:val="847"/>
+    <w:next w:val="847"/>
     <w:uiPriority w:val="39"/>
     <w:unhideWhenUsed/>
     <w:pPr>
@@ -33059,10 +34503,10 @@
       <w:ind w:right="0" w:firstLine="0" w:left="1134"/>
     </w:pPr>
   </w:style>
-  <w:style w:type="paragraph" w:styleId="888">
+  <w:style w:type="paragraph" w:styleId="841">
     <w:name w:val="toc 6"/>
-    <w:basedOn w:val="894"/>
-    <w:next w:val="894"/>
+    <w:basedOn w:val="847"/>
+    <w:next w:val="847"/>
     <w:uiPriority w:val="39"/>
     <w:unhideWhenUsed/>
     <w:pPr>
@@ -33071,10 +34515,10 @@
       <w:ind w:right="0" w:firstLine="0" w:left="1417"/>
     </w:pPr>
   </w:style>
-  <w:style w:type="paragraph" w:styleId="889">
+  <w:style w:type="paragraph" w:styleId="842">
     <w:name w:val="toc 7"/>
-    <w:basedOn w:val="894"/>
-    <w:next w:val="894"/>
+    <w:basedOn w:val="847"/>
+    <w:next w:val="847"/>
     <w:uiPriority w:val="39"/>
     <w:unhideWhenUsed/>
     <w:pPr>
@@ -33083,10 +34527,10 @@
       <w:ind w:right="0" w:firstLine="0" w:left="1701"/>
     </w:pPr>
   </w:style>
-  <w:style w:type="paragraph" w:styleId="890">
+  <w:style w:type="paragraph" w:styleId="843">
     <w:name w:val="toc 8"/>
-    <w:basedOn w:val="894"/>
-    <w:next w:val="894"/>
+    <w:basedOn w:val="847"/>
+    <w:next w:val="847"/>
     <w:uiPriority w:val="39"/>
     <w:unhideWhenUsed/>
     <w:pPr>
@@ -33095,10 +34539,10 @@
       <w:ind w:right="0" w:firstLine="0" w:left="1984"/>
     </w:pPr>
   </w:style>
-  <w:style w:type="paragraph" w:styleId="891">
+  <w:style w:type="paragraph" w:styleId="844">
     <w:name w:val="toc 9"/>
-    <w:basedOn w:val="894"/>
-    <w:next w:val="894"/>
+    <w:basedOn w:val="847"/>
+    <w:next w:val="847"/>
     <w:uiPriority w:val="39"/>
     <w:unhideWhenUsed/>
     <w:pPr>
@@ -33107,7 +34551,7 @@
       <w:ind w:right="0" w:firstLine="0" w:left="2268"/>
     </w:pPr>
   </w:style>
-  <w:style w:type="paragraph" w:styleId="892">
+  <w:style w:type="paragraph" w:styleId="845">
     <w:name w:val="TOC Heading"/>
     <w:uiPriority w:val="39"/>
     <w:unhideWhenUsed/>
@@ -33117,10 +34561,10 @@
       <w:ind/>
     </w:pPr>
   </w:style>
-  <w:style w:type="paragraph" w:styleId="893">
+  <w:style w:type="paragraph" w:styleId="846">
     <w:name w:val="table of figures"/>
-    <w:basedOn w:val="894"/>
-    <w:next w:val="894"/>
+    <w:basedOn w:val="847"/>
+    <w:next w:val="847"/>
     <w:uiPriority w:val="99"/>
     <w:unhideWhenUsed/>
     <w:pPr>
@@ -33129,7 +34573,7 @@
       <w:ind/>
     </w:pPr>
   </w:style>
-  <w:style w:type="paragraph" w:styleId="894" w:default="1">
+  <w:style w:type="paragraph" w:styleId="847" w:default="1">
     <w:name w:val="Normal"/>
     <w:qFormat/>
     <w:pPr>
@@ -33138,11 +34582,11 @@
       <w:ind/>
     </w:pPr>
   </w:style>
-  <w:style w:type="paragraph" w:styleId="895">
+  <w:style w:type="paragraph" w:styleId="848">
     <w:name w:val="Heading 1"/>
-    <w:basedOn w:val="894"/>
-    <w:next w:val="894"/>
-    <w:link w:val="899"/>
+    <w:basedOn w:val="847"/>
+    <w:next w:val="847"/>
+    <w:link w:val="852"/>
     <w:uiPriority w:val="9"/>
     <w:qFormat/>
     <w:pPr>
@@ -33160,7 +34604,7 @@
       <w:szCs w:val="32"/>
     </w:rPr>
   </w:style>
-  <w:style w:type="character" w:styleId="896" w:default="1">
+  <w:style w:type="character" w:styleId="849" w:default="1">
     <w:name w:val="Default Paragraph Font"/>
     <w:uiPriority w:val="1"/>
     <w:semiHidden/>
@@ -33171,7 +34615,7 @@
       <w:ind/>
     </w:pPr>
   </w:style>
-  <w:style w:type="table" w:styleId="897" w:default="1">
+  <w:style w:type="table" w:styleId="850" w:default="1">
     <w:name w:val="Normal Table"/>
     <w:uiPriority w:val="99"/>
     <w:semiHidden/>
@@ -33183,13 +34627,13 @@
     </w:pPr>
     <w:tblPr>
       <w:tblInd w:w="0" w:type="dxa"/>
+      <w:tblBorders/>
       <w:tblCellMar>
         <w:left w:w="108" w:type="dxa"/>
         <w:top w:w="0" w:type="dxa"/>
         <w:right w:w="108" w:type="dxa"/>
         <w:bottom w:w="0" w:type="dxa"/>
       </w:tblCellMar>
-      <w:tblBorders/>
     </w:tblPr>
     <w:tcPr>
       <w:tcBorders/>
@@ -33364,7 +34808,7 @@
       </w:tcPr>
     </w:tblStylePr>
   </w:style>
-  <w:style w:type="numbering" w:styleId="898" w:default="1">
+  <w:style w:type="numbering" w:styleId="851" w:default="1">
     <w:name w:val="No List"/>
     <w:uiPriority w:val="99"/>
     <w:semiHidden/>
@@ -33375,10 +34819,10 @@
       <w:ind/>
     </w:pPr>
   </w:style>
-  <w:style w:type="character" w:styleId="899" w:customStyle="1">
+  <w:style w:type="character" w:styleId="852" w:customStyle="1">
     <w:name w:val="Kop 1 Char"/>
-    <w:basedOn w:val="896"/>
-    <w:link w:val="895"/>
+    <w:basedOn w:val="849"/>
+    <w:link w:val="848"/>
     <w:uiPriority w:val="9"/>
     <w:pPr>
       <w:pBdr/>
@@ -33392,9 +34836,9 @@
       <w:szCs w:val="32"/>
     </w:rPr>
   </w:style>
-  <w:style w:type="paragraph" w:styleId="900">
+  <w:style w:type="paragraph" w:styleId="853">
     <w:name w:val="List Paragraph"/>
-    <w:basedOn w:val="894"/>
+    <w:basedOn w:val="847"/>
     <w:uiPriority w:val="34"/>
     <w:qFormat/>
     <w:pPr>

</xml_diff>

<commit_message>
fixed opd 1 and added opd 2
</commit_message>
<xml_diff>
--- a/Sec-Week-1/C security practicum 1.docx
+++ b/Sec-Week-1/C security practicum 1.docx
@@ -208,97 +208,13 @@
       <w:r>
         <w:t xml:space="preserve">Laat zien met welke “string” van de strcpy welke variabele wel of niet worden aangepast. Bereken de lengte van deze “string” waarbij iets wordt aangepast</w:t>
         <w:br/>
-        <w:br/>
-      </w:r>
-      <w:r>
-        <w:t xml:space="preserve">De functie strcpy kopieert een string naar een buffer totdat ook de nulterminator (\0) is meegekopieerd. Als de string langer is dan de buffer, worden ook gegevens op de stack van variabelen ernaast overschreven.</w:t>
-      </w:r>
-      <w:r>
-        <w:br/>
-      </w:r>
-      <w:r>
-        <w:t xml:space="preserve">Volgorde op stack (laag naar hoog adres):</w:t>
-      </w:r>
-      <w:r>
-        <w:br/>
-      </w:r>
-      <w:r>
-        <w:t xml:space="preserve">filename[128]           (bytes 0-127)</w:t>
-      </w:r>
-      <w:r/>
-    </w:p>
-    <w:p>
-      <w:pPr>
-        <w:pStyle w:val="906"/>
-        <w:pBdr/>
-        <w:spacing/>
-        <w:ind/>
-        <w:rPr/>
-      </w:pPr>
-      <w:r>
-        <w:t xml:space="preserve">buffer[20]              (bytes 128-147)</w:t>
-      </w:r>
-      <w:r/>
-    </w:p>
-    <w:p>
-      <w:pPr>
-        <w:pStyle w:val="906"/>
-        <w:pBdr/>
-        <w:spacing/>
-        <w:ind/>
-        <w:rPr/>
-      </w:pPr>
-      <w:r>
-        <w:t xml:space="preserve">buffer2[20]             (bytes 148-167)</w:t>
-      </w:r>
-      <w:r/>
-    </w:p>
-    <w:p>
-      <w:pPr>
-        <w:pStyle w:val="906"/>
-        <w:pBdr/>
-        <w:spacing/>
-        <w:ind/>
-        <w:rPr/>
-      </w:pPr>
-      <w:r>
-        <w:t xml:space="preserve">klant_geverifieerd[4]   (bytes 168-171)</w:t>
-      </w:r>
-      <w:r/>
-    </w:p>
-    <w:p>
-      <w:pPr>
-        <w:pStyle w:val="906"/>
-        <w:pBdr/>
-        <w:spacing/>
-        <w:ind/>
-        <w:rPr/>
-      </w:pPr>
-      <w:r>
-        <w:t xml:space="preserve">klantnr[16]             (bytes 172-187)</w:t>
-      </w:r>
-      <w:r/>
-    </w:p>
-    <w:p>
-      <w:pPr>
-        <w:pStyle w:val="906"/>
-        <w:pBdr/>
-        <w:spacing/>
-        <w:ind/>
-        <w:rPr/>
-      </w:pPr>
-      <w:r>
-        <w:t xml:space="preserve">incassorekening[10]     (bytes 188-197)</w:t>
-      </w:r>
-      <w:r>
-        <w:br/>
       </w:r>
       <w:r>
         <mc:AlternateContent>
           <mc:Choice Requires="wpg">
             <w:drawing>
               <wp:inline xmlns:wp="http://schemas.openxmlformats.org/drawingml/2006/wordprocessingDrawing" distT="0" distB="0" distL="0" distR="0">
-                <wp:extent cx="3857625" cy="1419225"/>
+                <wp:extent cx="5705475" cy="2219325"/>
                 <wp:effectExtent l="0" t="0" r="0" b="0"/>
                 <wp:docPr id="2" name=""/>
                 <wp:cNvGraphicFramePr>
@@ -308,7 +224,7 @@
                   <a:graphicData uri="http://schemas.openxmlformats.org/drawingml/2006/picture">
                     <pic:pic xmlns:pic="http://schemas.openxmlformats.org/drawingml/2006/picture">
                       <pic:nvPicPr>
-                        <pic:cNvPr id="1235626125" name=""/>
+                        <pic:cNvPr id="319661513" name=""/>
                         <pic:cNvPicPr>
                           <a:picLocks noChangeAspect="1"/>
                         </pic:cNvPicPr>
@@ -321,7 +237,7 @@
                       <pic:spPr bwMode="auto">
                         <a:xfrm>
                           <a:off x="0" y="0"/>
-                          <a:ext cx="3857625" cy="1419223"/>
+                          <a:ext cx="5705474" cy="2219324"/>
                         </a:xfrm>
                         <a:prstGeom prst="rect">
                           <a:avLst/>
@@ -354,7 +270,7 @@
                 <v:path o:extrusionok="f" gradientshapeok="t" o:connecttype="rect"/>
                 <o:lock v:ext="edit" aspectratio="t"/>
               </v:shapetype>
-              <v:shape id="_x0000_i1" o:spid="_x0000_s1" type="#_x0000_t75" style="width:303.75pt;height:111.75pt;mso-wrap-distance-left:0.00pt;mso-wrap-distance-top:0.00pt;mso-wrap-distance-right:0.00pt;mso-wrap-distance-bottom:0.00pt;z-index:1;" stroked="false">
+              <v:shape id="_x0000_i1" o:spid="_x0000_s1" type="#_x0000_t75" style="width:449.25pt;height:174.75pt;mso-wrap-distance-left:0.00pt;mso-wrap-distance-top:0.00pt;mso-wrap-distance-right:0.00pt;mso-wrap-distance-bottom:0.00pt;z-index:1;" stroked="false">
                 <v:imagedata r:id="rId10" o:title=""/>
                 <o:lock v:ext="edit" rotation="t"/>
               </v:shape>
@@ -362,288 +278,162 @@
           </mc:Fallback>
         </mc:AlternateContent>
       </w:r>
+      <w:r/>
+      <w:r/>
       <w:r>
+        <w:br/>
         <w:br/>
       </w:r>
       <w:r>
-        <w:t xml:space="preserve">Tabel - String lengte vs aangepaste variabelen:</w:t>
+        <mc:AlternateContent>
+          <mc:Choice Requires="wpg">
+            <w:drawing>
+              <wp:inline xmlns:wp="http://schemas.openxmlformats.org/drawingml/2006/wordprocessingDrawing" distT="0" distB="0" distL="0" distR="0">
+                <wp:extent cx="5731510" cy="898983"/>
+                <wp:effectExtent l="0" t="0" r="0" b="0"/>
+                <wp:docPr id="3" name=""/>
+                <wp:cNvGraphicFramePr>
+                  <a:graphicFrameLocks xmlns:a="http://schemas.openxmlformats.org/drawingml/2006/main" noChangeAspect="1"/>
+                </wp:cNvGraphicFramePr>
+                <a:graphic xmlns:a="http://schemas.openxmlformats.org/drawingml/2006/main">
+                  <a:graphicData uri="http://schemas.openxmlformats.org/drawingml/2006/picture">
+                    <pic:pic xmlns:pic="http://schemas.openxmlformats.org/drawingml/2006/picture">
+                      <pic:nvPicPr>
+                        <pic:cNvPr id="2087553928" name=""/>
+                        <pic:cNvPicPr>
+                          <a:picLocks noChangeAspect="1"/>
+                        </pic:cNvPicPr>
+                        <pic:nvPr/>
+                      </pic:nvPicPr>
+                      <pic:blipFill rotWithShape="1">
+                        <a:blip r:embed="rId11"/>
+                        <a:stretch/>
+                      </pic:blipFill>
+                      <pic:spPr bwMode="auto">
+                        <a:xfrm>
+                          <a:off x="0" y="0"/>
+                          <a:ext cx="5731509" cy="898983"/>
+                        </a:xfrm>
+                        <a:prstGeom prst="rect">
+                          <a:avLst/>
+                        </a:prstGeom>
+                      </pic:spPr>
+                    </pic:pic>
+                  </a:graphicData>
+                </a:graphic>
+              </wp:inline>
+            </w:drawing>
+          </mc:Choice>
+          <mc:Fallback>
+            <w:pict>
+              <v:shapetype id="_x0000_t75" coordsize="21600,21600" o:spt="75" o:preferrelative="t" path="m@4@5l@4@11@9@11@9@5xe" filled="f" stroked="f">
+                <v:stroke joinstyle="miter"/>
+                <v:formulas>
+                  <v:f eqn="if lineDrawn pixelLineWidth 0"/>
+                  <v:f eqn="sum @0 1 0"/>
+                  <v:f eqn="sum 0 0 @1"/>
+                  <v:f eqn="prod @2 1 2"/>
+                  <v:f eqn="prod @3 21600 pixelWidth"/>
+                  <v:f eqn="prod @3 21600 pixelHeight"/>
+                  <v:f eqn="sum @0 0 1"/>
+                  <v:f eqn="prod @6 1 2"/>
+                  <v:f eqn="prod @7 21600 pixelWidth"/>
+                  <v:f eqn="sum @8 21600 0"/>
+                  <v:f eqn="prod @7 21600 pixelHeight"/>
+                  <v:f eqn="sum @10 21600 0"/>
+                </v:formulas>
+                <v:path o:extrusionok="f" gradientshapeok="t" o:connecttype="rect"/>
+                <o:lock v:ext="edit" aspectratio="t"/>
+              </v:shapetype>
+              <v:shape id="_x0000_i2" o:spid="_x0000_s2" type="#_x0000_t75" style="width:451.30pt;height:70.79pt;mso-wrap-distance-left:0.00pt;mso-wrap-distance-top:0.00pt;mso-wrap-distance-right:0.00pt;mso-wrap-distance-bottom:0.00pt;z-index:1;" stroked="false">
+                <v:imagedata r:id="rId11" o:title=""/>
+                <o:lock v:ext="edit" rotation="t"/>
+              </v:shape>
+            </w:pict>
+          </mc:Fallback>
+        </mc:AlternateContent>
       </w:r>
+      <w:r/>
       <w:r/>
     </w:p>
     <w:p>
       <w:pPr>
-        <w:pStyle w:val="906"/>
-        <w:pBdr/>
-        <w:spacing/>
-        <w:ind/>
+        <w:pBdr/>
+        <w:spacing/>
+        <w:ind w:firstLine="0" w:left="0"/>
         <w:rPr/>
       </w:pPr>
+      <w:r/>
       <w:r>
-        <w:t xml:space="preserve">String lengte</w:t>
-        <w:tab/>
-        <w:t xml:space="preserve">Null-terminator op byte</w:t>
-        <w:tab/>
-        <w:t xml:space="preserve">Variabelen aangepast</w:t>
-      </w:r>
-      <w:r/>
-    </w:p>
-    <w:p>
-      <w:pPr>
-        <w:pStyle w:val="906"/>
-        <w:pBdr/>
-        <w:spacing/>
-        <w:ind/>
-        <w:rPr/>
-      </w:pPr>
-      <w:r>
-        <w:t xml:space="preserve">≤ 128</w:t>
-        <w:tab/>
-        <w:t xml:space="preserve">Binnen filename</w:t>
-        <w:tab/>
-        <w:t xml:space="preserve">Geen</w:t>
-      </w:r>
-      <w:r/>
-    </w:p>
-    <w:p>
-      <w:pPr>
-        <w:pStyle w:val="906"/>
-        <w:pBdr/>
-        <w:spacing/>
-        <w:ind/>
-        <w:rPr/>
-      </w:pPr>
-      <w:r>
-        <w:t xml:space="preserve">129</w:t>
-        <w:tab/>
-        <w:t xml:space="preserve">129 (buffer[1])</w:t>
-        <w:tab/>
-        <w:t xml:space="preserve">buffer</w:t>
-      </w:r>
-      <w:r/>
-    </w:p>
-    <w:p>
-      <w:pPr>
-        <w:pStyle w:val="906"/>
-        <w:pBdr/>
-        <w:spacing/>
-        <w:ind/>
-        <w:rPr/>
-      </w:pPr>
-      <w:r>
-        <w:t xml:space="preserve">148</w:t>
-        <w:tab/>
-        <w:t xml:space="preserve">148 (buffer[20])</w:t>
-        <w:tab/>
-        <w:t xml:space="preserve">buffer</w:t>
-      </w:r>
-      <w:r/>
-    </w:p>
-    <w:p>
-      <w:pPr>
-        <w:pStyle w:val="906"/>
-        <w:pBdr/>
-        <w:spacing/>
-        <w:ind/>
-        <w:rPr/>
-      </w:pPr>
-      <w:r>
-        <w:t xml:space="preserve">149</w:t>
-        <w:tab/>
-        <w:t xml:space="preserve">149 (buffer2[1])</w:t>
-        <w:tab/>
-        <w:t xml:space="preserve">buffer + buffer2</w:t>
-      </w:r>
-      <w:r/>
-    </w:p>
-    <w:p>
-      <w:pPr>
-        <w:pStyle w:val="906"/>
-        <w:pBdr/>
-        <w:spacing/>
-        <w:ind/>
-        <w:rPr/>
-      </w:pPr>
-      <w:r>
-        <w:t xml:space="preserve">168</w:t>
-        <w:tab/>
-        <w:t xml:space="preserve">168 (buffer2[20])</w:t>
-        <w:tab/>
-        <w:t xml:space="preserve">buffer + buffer2</w:t>
-      </w:r>
-      <w:r/>
-    </w:p>
-    <w:p>
-      <w:pPr>
-        <w:pStyle w:val="906"/>
-        <w:pBdr/>
-        <w:spacing/>
-        <w:ind/>
-        <w:rPr/>
-      </w:pPr>
-      <w:r>
-        <w:t xml:space="preserve">169</w:t>
-        <w:tab/>
-        <w:t xml:space="preserve">169 (klant_geverifieerd[1])</w:t>
-        <w:tab/>
-        <w:t xml:space="preserve">buffer + buffer2 + klant_geverifieerd</w:t>
-      </w:r>
-      <w:r/>
-    </w:p>
-    <w:p>
-      <w:pPr>
-        <w:pStyle w:val="906"/>
-        <w:pBdr/>
-        <w:spacing/>
-        <w:ind/>
-        <w:rPr/>
-      </w:pPr>
-      <w:r>
-        <w:t xml:space="preserve">172</w:t>
-        <w:tab/>
-        <w:t xml:space="preserve">172 (klant_geverifieerd[4])</w:t>
-        <w:tab/>
-        <w:t xml:space="preserve">buffer + buffer2 + klant_geverifieerd</w:t>
-      </w:r>
-      <w:r/>
-    </w:p>
-    <w:p>
-      <w:pPr>
-        <w:pStyle w:val="906"/>
-        <w:pBdr/>
-        <w:spacing/>
-        <w:ind/>
-        <w:rPr/>
-      </w:pPr>
-      <w:r>
-        <w:t xml:space="preserve">173</w:t>
-        <w:tab/>
-        <w:t xml:space="preserve">173 (klantnr[1])</w:t>
-        <w:tab/>
-        <w:t xml:space="preserve">buffer + buffer2 + klant_geverifieerd + klantnr</w:t>
-      </w:r>
-      <w:r/>
-    </w:p>
-    <w:p>
-      <w:pPr>
-        <w:pStyle w:val="906"/>
-        <w:pBdr/>
-        <w:spacing/>
-        <w:ind/>
-        <w:rPr/>
-      </w:pPr>
-      <w:r>
-        <w:t xml:space="preserve">188</w:t>
-        <w:tab/>
-        <w:t xml:space="preserve">188 (klantnr[16])</w:t>
-        <w:tab/>
-        <w:t xml:space="preserve">buffer + buffer2 + klant_geverifieerd + klantnr</w:t>
-      </w:r>
-      <w:r/>
-    </w:p>
-    <w:p>
-      <w:pPr>
-        <w:pStyle w:val="906"/>
-        <w:pBdr/>
-        <w:spacing/>
-        <w:ind/>
-        <w:rPr/>
-      </w:pPr>
-      <w:r>
-        <w:t xml:space="preserve">189</w:t>
-        <w:tab/>
-        <w:t xml:space="preserve">189 (incassorekening[1])</w:t>
-        <w:tab/>
-        <w:t xml:space="preserve">buffer + buffer2 + klant_geverifieerd + klantnr + incassorekening</w:t>
-      </w:r>
-      <w:r/>
-    </w:p>
-    <w:p>
-      <w:pPr>
-        <w:pStyle w:val="906"/>
-        <w:pBdr/>
-        <w:spacing/>
-        <w:ind/>
-        <w:rPr/>
-      </w:pPr>
-      <w:r>
-        <w:t xml:space="preserve">Minimale lengte voor overflow naar volgende variabele:</w:t>
-      </w:r>
-      <w:r/>
-    </w:p>
-    <w:p>
-      <w:pPr>
-        <w:pStyle w:val="906"/>
-        <w:pBdr/>
-        <w:spacing/>
-        <w:ind/>
-        <w:rPr/>
-      </w:pPr>
-      <w:r>
-        <w:t xml:space="preserve">•</w:t>
-        <w:tab/>
-        <w:t xml:space="preserve">129 bytes: buffer aangepast</w:t>
-      </w:r>
-      <w:r/>
-    </w:p>
-    <w:p>
-      <w:pPr>
-        <w:pStyle w:val="906"/>
-        <w:pBdr/>
-        <w:spacing/>
-        <w:ind/>
-        <w:rPr/>
-      </w:pPr>
-      <w:r>
-        <w:t xml:space="preserve">•</w:t>
-        <w:tab/>
-        <w:t xml:space="preserve">149 bytes: buffer2 aangepast</w:t>
-      </w:r>
-      <w:r/>
-    </w:p>
-    <w:p>
-      <w:pPr>
-        <w:pStyle w:val="906"/>
-        <w:pBdr/>
-        <w:spacing/>
-        <w:ind/>
-        <w:rPr/>
-      </w:pPr>
-      <w:r>
-        <w:t xml:space="preserve">•</w:t>
-        <w:tab/>
-        <w:t xml:space="preserve">169 bytes: klant_geverifieerd aangepast</w:t>
-      </w:r>
-      <w:r/>
-    </w:p>
-    <w:p>
-      <w:pPr>
-        <w:pStyle w:val="906"/>
-        <w:pBdr/>
-        <w:spacing/>
-        <w:ind/>
-        <w:rPr/>
-      </w:pPr>
-      <w:r>
-        <w:t xml:space="preserve">•</w:t>
-        <w:tab/>
-        <w:t xml:space="preserve">173 bytes: klantnr aangepast</w:t>
-      </w:r>
-      <w:r/>
-    </w:p>
-    <w:p>
-      <w:pPr>
-        <w:pBdr/>
-        <w:spacing/>
-        <w:ind w:firstLine="0" w:left="720"/>
-        <w:rPr/>
-      </w:pPr>
-      <w:r>
-        <w:t xml:space="preserve">•</w:t>
-        <w:tab/>
-        <w:t xml:space="preserve">189 bytes: incassorekening aangepast</w:t>
+        <mc:AlternateContent>
+          <mc:Choice Requires="wpg">
+            <w:drawing>
+              <wp:inline xmlns:wp="http://schemas.openxmlformats.org/drawingml/2006/wordprocessingDrawing" distT="0" distB="0" distL="0" distR="0">
+                <wp:extent cx="5731510" cy="898983"/>
+                <wp:effectExtent l="0" t="0" r="0" b="0"/>
+                <wp:docPr id="4" name=""/>
+                <wp:cNvGraphicFramePr>
+                  <a:graphicFrameLocks xmlns:a="http://schemas.openxmlformats.org/drawingml/2006/main" noChangeAspect="1"/>
+                </wp:cNvGraphicFramePr>
+                <a:graphic xmlns:a="http://schemas.openxmlformats.org/drawingml/2006/main">
+                  <a:graphicData uri="http://schemas.openxmlformats.org/drawingml/2006/picture">
+                    <pic:pic xmlns:pic="http://schemas.openxmlformats.org/drawingml/2006/picture">
+                      <pic:nvPicPr>
+                        <pic:cNvPr id="1834148816" name=""/>
+                        <pic:cNvPicPr>
+                          <a:picLocks noChangeAspect="1"/>
+                        </pic:cNvPicPr>
+                        <pic:nvPr/>
+                      </pic:nvPicPr>
+                      <pic:blipFill rotWithShape="1">
+                        <a:blip r:embed="rId12"/>
+                        <a:stretch/>
+                      </pic:blipFill>
+                      <pic:spPr bwMode="auto">
+                        <a:xfrm>
+                          <a:off x="0" y="0"/>
+                          <a:ext cx="5731509" cy="898983"/>
+                        </a:xfrm>
+                        <a:prstGeom prst="rect">
+                          <a:avLst/>
+                        </a:prstGeom>
+                      </pic:spPr>
+                    </pic:pic>
+                  </a:graphicData>
+                </a:graphic>
+              </wp:inline>
+            </w:drawing>
+          </mc:Choice>
+          <mc:Fallback>
+            <w:pict>
+              <v:shapetype id="_x0000_t75" coordsize="21600,21600" o:spt="75" o:preferrelative="t" path="m@4@5l@4@11@9@11@9@5xe" filled="f" stroked="f">
+                <v:stroke joinstyle="miter"/>
+                <v:formulas>
+                  <v:f eqn="if lineDrawn pixelLineWidth 0"/>
+                  <v:f eqn="sum @0 1 0"/>
+                  <v:f eqn="sum 0 0 @1"/>
+                  <v:f eqn="prod @2 1 2"/>
+                  <v:f eqn="prod @3 21600 pixelWidth"/>
+                  <v:f eqn="prod @3 21600 pixelHeight"/>
+                  <v:f eqn="sum @0 0 1"/>
+                  <v:f eqn="prod @6 1 2"/>
+                  <v:f eqn="prod @7 21600 pixelWidth"/>
+                  <v:f eqn="sum @8 21600 0"/>
+                  <v:f eqn="prod @7 21600 pixelHeight"/>
+                  <v:f eqn="sum @10 21600 0"/>
+                </v:formulas>
+                <v:path o:extrusionok="f" gradientshapeok="t" o:connecttype="rect"/>
+                <o:lock v:ext="edit" aspectratio="t"/>
+              </v:shapetype>
+              <v:shape id="_x0000_i3" o:spid="_x0000_s3" type="#_x0000_t75" style="width:451.30pt;height:70.79pt;mso-wrap-distance-left:0.00pt;mso-wrap-distance-top:0.00pt;mso-wrap-distance-right:0.00pt;mso-wrap-distance-bottom:0.00pt;z-index:1;" stroked="false">
+                <v:imagedata r:id="rId12" o:title=""/>
+                <o:lock v:ext="edit" rotation="t"/>
+              </v:shape>
+            </w:pict>
+          </mc:Fallback>
+        </mc:AlternateContent>
       </w:r>
       <w:r>
-        <w:br/>
         <w:br/>
       </w:r>
       <w:r/>
@@ -675,7 +465,14 @@
           <w:color w:val="ed7d31" w:themeColor="accent2"/>
           <w:lang w:val="en-US"/>
         </w:rPr>
-        <w:t xml:space="preserve">De functie strcpy(filename, argv[1]) kopieert de ingevoerde string naar filename. Deze array is 128 bytes groot, dus als de string langer is dan 127 tekens, past de nulterminator \0 niet meer binnen de array. Daardoor wordt dan ook een volgende variabele op</w:t>
+        <w:t xml:space="preserve">D</w:t>
+      </w:r>
+      <w:r>
+        <w:rPr>
+          <w:color w:val="ed7d31" w:themeColor="accent2"/>
+          <w:lang w:val="en-US"/>
+        </w:rPr>
+        <w:t xml:space="preserve">e functie strcpy(filename, argv[1]) kopieert de ingevoerde string naar filename. Deze array is 128 bytes groot, dus als de string langer is dan 127 tekens, past de nulterminator \0 niet meer binnen de array. Daardoor wordt dan ook een volgende variabele op</w:t>
       </w:r>
       <w:r>
         <w:rPr>
@@ -701,7 +498,7 @@
               <wp:inline xmlns:wp="http://schemas.openxmlformats.org/drawingml/2006/wordprocessingDrawing" distT="0" distB="0" distL="0" distR="0">
                 <wp:extent cx="3848100" cy="2190750"/>
                 <wp:effectExtent l="0" t="0" r="0" b="0"/>
-                <wp:docPr id="3" name=""/>
+                <wp:docPr id="5" name=""/>
                 <wp:cNvGraphicFramePr>
                   <a:graphicFrameLocks xmlns:a="http://schemas.openxmlformats.org/drawingml/2006/main" noChangeAspect="1"/>
                 </wp:cNvGraphicFramePr>
@@ -716,7 +513,7 @@
                         <pic:nvPr/>
                       </pic:nvPicPr>
                       <pic:blipFill rotWithShape="1">
-                        <a:blip r:embed="rId11"/>
+                        <a:blip r:embed="rId13"/>
                         <a:stretch/>
                       </pic:blipFill>
                       <pic:spPr bwMode="auto">
@@ -755,8 +552,8 @@
                 <v:path o:extrusionok="f" gradientshapeok="t" o:connecttype="rect"/>
                 <o:lock v:ext="edit" aspectratio="t"/>
               </v:shapetype>
-              <v:shape id="_x0000_i2" o:spid="_x0000_s2" type="#_x0000_t75" style="width:303.00pt;height:172.50pt;mso-wrap-distance-left:0.00pt;mso-wrap-distance-top:0.00pt;mso-wrap-distance-right:0.00pt;mso-wrap-distance-bottom:0.00pt;z-index:1;" stroked="false">
-                <v:imagedata r:id="rId11" o:title=""/>
+              <v:shape id="_x0000_i4" o:spid="_x0000_s4" type="#_x0000_t75" style="width:303.00pt;height:172.50pt;mso-wrap-distance-left:0.00pt;mso-wrap-distance-top:0.00pt;mso-wrap-distance-right:0.00pt;mso-wrap-distance-bottom:0.00pt;z-index:1;" stroked="false">
+                <v:imagedata r:id="rId13" o:title=""/>
                 <o:lock v:ext="edit" rotation="t"/>
               </v:shape>
             </w:pict>
@@ -771,7 +568,7 @@
               <wp:inline xmlns:wp="http://schemas.openxmlformats.org/drawingml/2006/wordprocessingDrawing" distT="0" distB="0" distL="0" distR="0">
                 <wp:extent cx="3267075" cy="1285875"/>
                 <wp:effectExtent l="0" t="0" r="0" b="0"/>
-                <wp:docPr id="4" name=""/>
+                <wp:docPr id="6" name=""/>
                 <wp:cNvGraphicFramePr>
                   <a:graphicFrameLocks xmlns:a="http://schemas.openxmlformats.org/drawingml/2006/main" noChangeAspect="1"/>
                 </wp:cNvGraphicFramePr>
@@ -786,7 +583,7 @@
                         <pic:nvPr/>
                       </pic:nvPicPr>
                       <pic:blipFill rotWithShape="1">
-                        <a:blip r:embed="rId12"/>
+                        <a:blip r:embed="rId14"/>
                         <a:stretch/>
                       </pic:blipFill>
                       <pic:spPr bwMode="auto">
@@ -825,8 +622,8 @@
                 <v:path o:extrusionok="f" gradientshapeok="t" o:connecttype="rect"/>
                 <o:lock v:ext="edit" aspectratio="t"/>
               </v:shapetype>
-              <v:shape id="_x0000_i3" o:spid="_x0000_s3" type="#_x0000_t75" style="width:257.25pt;height:101.25pt;mso-wrap-distance-left:0.00pt;mso-wrap-distance-top:0.00pt;mso-wrap-distance-right:0.00pt;mso-wrap-distance-bottom:0.00pt;z-index:1;" stroked="false">
-                <v:imagedata r:id="rId12" o:title=""/>
+              <v:shape id="_x0000_i5" o:spid="_x0000_s5" type="#_x0000_t75" style="width:257.25pt;height:101.25pt;mso-wrap-distance-left:0.00pt;mso-wrap-distance-top:0.00pt;mso-wrap-distance-right:0.00pt;mso-wrap-distance-bottom:0.00pt;z-index:1;" stroked="false">
+                <v:imagedata r:id="rId14" o:title=""/>
                 <o:lock v:ext="edit" rotation="t"/>
               </v:shape>
             </w:pict>
@@ -894,7 +691,7 @@
               <wp:inline xmlns:wp="http://schemas.openxmlformats.org/drawingml/2006/wordprocessingDrawing" distT="0" distB="0" distL="0" distR="0">
                 <wp:extent cx="5731510" cy="1018374"/>
                 <wp:effectExtent l="0" t="0" r="0" b="0"/>
-                <wp:docPr id="5" name=""/>
+                <wp:docPr id="7" name=""/>
                 <wp:cNvGraphicFramePr>
                   <a:graphicFrameLocks xmlns:a="http://schemas.openxmlformats.org/drawingml/2006/main" noChangeAspect="1"/>
                 </wp:cNvGraphicFramePr>
@@ -909,7 +706,7 @@
                         <pic:nvPr/>
                       </pic:nvPicPr>
                       <pic:blipFill rotWithShape="1">
-                        <a:blip r:embed="rId13"/>
+                        <a:blip r:embed="rId15"/>
                         <a:stretch/>
                       </pic:blipFill>
                       <pic:spPr bwMode="auto">
@@ -948,8 +745,8 @@
                 <v:path o:extrusionok="f" gradientshapeok="t" o:connecttype="rect"/>
                 <o:lock v:ext="edit" aspectratio="t"/>
               </v:shapetype>
-              <v:shape id="_x0000_i4" o:spid="_x0000_s4" type="#_x0000_t75" style="width:451.30pt;height:80.19pt;mso-wrap-distance-left:0.00pt;mso-wrap-distance-top:0.00pt;mso-wrap-distance-right:0.00pt;mso-wrap-distance-bottom:0.00pt;z-index:1;" stroked="false">
-                <v:imagedata r:id="rId13" o:title=""/>
+              <v:shape id="_x0000_i6" o:spid="_x0000_s6" type="#_x0000_t75" style="width:451.30pt;height:80.19pt;mso-wrap-distance-left:0.00pt;mso-wrap-distance-top:0.00pt;mso-wrap-distance-right:0.00pt;mso-wrap-distance-bottom:0.00pt;z-index:1;" stroked="false">
+                <v:imagedata r:id="rId15" o:title=""/>
                 <o:lock v:ext="edit" rotation="t"/>
               </v:shape>
             </w:pict>
@@ -985,6 +782,103 @@
     </w:p>
     <w:p>
       <w:pPr>
+        <w:pBdr/>
+        <w:spacing/>
+        <w:ind w:firstLine="0" w:left="720"/>
+        <w:rPr/>
+      </w:pPr>
+      <w:r>
+        <w:rPr>
+          <w:highlight w:val="none"/>
+        </w:rPr>
+      </w:r>
+      <w:r>
+        <w:rPr>
+          <w:highlight w:val="none"/>
+        </w:rPr>
+      </w:r>
+      <w:r>
+        <mc:AlternateContent>
+          <mc:Choice Requires="wpg">
+            <w:drawing>
+              <wp:inline xmlns:wp="http://schemas.openxmlformats.org/drawingml/2006/wordprocessingDrawing" distT="0" distB="0" distL="0" distR="0">
+                <wp:extent cx="5731510" cy="2342699"/>
+                <wp:effectExtent l="0" t="0" r="0" b="0"/>
+                <wp:docPr id="8" name=""/>
+                <wp:cNvGraphicFramePr>
+                  <a:graphicFrameLocks xmlns:a="http://schemas.openxmlformats.org/drawingml/2006/main" noChangeAspect="1"/>
+                </wp:cNvGraphicFramePr>
+                <a:graphic xmlns:a="http://schemas.openxmlformats.org/drawingml/2006/main">
+                  <a:graphicData uri="http://schemas.openxmlformats.org/drawingml/2006/picture">
+                    <pic:pic xmlns:pic="http://schemas.openxmlformats.org/drawingml/2006/picture">
+                      <pic:nvPicPr>
+                        <pic:cNvPr id="583117169" name=""/>
+                        <pic:cNvPicPr>
+                          <a:picLocks noChangeAspect="1"/>
+                        </pic:cNvPicPr>
+                        <pic:nvPr/>
+                      </pic:nvPicPr>
+                      <pic:blipFill rotWithShape="1">
+                        <a:blip r:embed="rId16"/>
+                        <a:stretch/>
+                      </pic:blipFill>
+                      <pic:spPr bwMode="auto">
+                        <a:xfrm>
+                          <a:off x="0" y="0"/>
+                          <a:ext cx="5731509" cy="2342699"/>
+                        </a:xfrm>
+                        <a:prstGeom prst="rect">
+                          <a:avLst/>
+                        </a:prstGeom>
+                      </pic:spPr>
+                    </pic:pic>
+                  </a:graphicData>
+                </a:graphic>
+              </wp:inline>
+            </w:drawing>
+          </mc:Choice>
+          <mc:Fallback>
+            <w:pict>
+              <v:shapetype id="_x0000_t75" coordsize="21600,21600" o:spt="75" o:preferrelative="t" path="m@4@5l@4@11@9@11@9@5xe" filled="f" stroked="f">
+                <v:stroke joinstyle="miter"/>
+                <v:formulas>
+                  <v:f eqn="if lineDrawn pixelLineWidth 0"/>
+                  <v:f eqn="sum @0 1 0"/>
+                  <v:f eqn="sum 0 0 @1"/>
+                  <v:f eqn="prod @2 1 2"/>
+                  <v:f eqn="prod @3 21600 pixelWidth"/>
+                  <v:f eqn="prod @3 21600 pixelHeight"/>
+                  <v:f eqn="sum @0 0 1"/>
+                  <v:f eqn="prod @6 1 2"/>
+                  <v:f eqn="prod @7 21600 pixelWidth"/>
+                  <v:f eqn="sum @8 21600 0"/>
+                  <v:f eqn="prod @7 21600 pixelHeight"/>
+                  <v:f eqn="sum @10 21600 0"/>
+                </v:formulas>
+                <v:path o:extrusionok="f" gradientshapeok="t" o:connecttype="rect"/>
+                <o:lock v:ext="edit" aspectratio="t"/>
+              </v:shapetype>
+              <v:shape id="_x0000_i7" o:spid="_x0000_s7" type="#_x0000_t75" style="width:451.30pt;height:184.46pt;mso-wrap-distance-left:0.00pt;mso-wrap-distance-top:0.00pt;mso-wrap-distance-right:0.00pt;mso-wrap-distance-bottom:0.00pt;z-index:1;" stroked="false">
+                <v:imagedata r:id="rId16" o:title=""/>
+                <o:lock v:ext="edit" rotation="t"/>
+              </v:shape>
+            </w:pict>
+          </mc:Fallback>
+        </mc:AlternateContent>
+      </w:r>
+      <w:r>
+        <w:rPr>
+          <w:highlight w:val="none"/>
+        </w:rPr>
+      </w:r>
+      <w:r>
+        <w:rPr>
+          <w:highlight w:val="none"/>
+        </w:rPr>
+      </w:r>
+    </w:p>
+    <w:p>
+      <w:pPr>
         <w:pStyle w:val="906"/>
         <w:numPr>
           <w:ilvl w:val="0"/>
@@ -1104,7 +998,7 @@
               <wp:inline xmlns:wp="http://schemas.openxmlformats.org/drawingml/2006/wordprocessingDrawing" distT="0" distB="0" distL="0" distR="0">
                 <wp:extent cx="3819525" cy="3581400"/>
                 <wp:effectExtent l="0" t="0" r="0" b="0"/>
-                <wp:docPr id="6" name=""/>
+                <wp:docPr id="9" name=""/>
                 <wp:cNvGraphicFramePr>
                   <a:graphicFrameLocks xmlns:a="http://schemas.openxmlformats.org/drawingml/2006/main" noChangeAspect="1"/>
                 </wp:cNvGraphicFramePr>
@@ -1119,7 +1013,7 @@
                         <pic:nvPr/>
                       </pic:nvPicPr>
                       <pic:blipFill rotWithShape="1">
-                        <a:blip r:embed="rId14"/>
+                        <a:blip r:embed="rId17"/>
                         <a:stretch/>
                       </pic:blipFill>
                       <pic:spPr bwMode="auto">
@@ -1158,8 +1052,8 @@
                 <v:path o:extrusionok="f" gradientshapeok="t" o:connecttype="rect"/>
                 <o:lock v:ext="edit" aspectratio="t"/>
               </v:shapetype>
-              <v:shape id="_x0000_i5" o:spid="_x0000_s5" type="#_x0000_t75" style="width:300.75pt;height:282.00pt;mso-wrap-distance-left:0.00pt;mso-wrap-distance-top:0.00pt;mso-wrap-distance-right:0.00pt;mso-wrap-distance-bottom:0.00pt;z-index:1;" stroked="false">
-                <v:imagedata r:id="rId14" o:title=""/>
+              <v:shape id="_x0000_i8" o:spid="_x0000_s8" type="#_x0000_t75" style="width:300.75pt;height:282.00pt;mso-wrap-distance-left:0.00pt;mso-wrap-distance-top:0.00pt;mso-wrap-distance-right:0.00pt;mso-wrap-distance-bottom:0.00pt;z-index:1;" stroked="false">
+                <v:imagedata r:id="rId17" o:title=""/>
                 <o:lock v:ext="edit" rotation="t"/>
               </v:shape>
             </w:pict>
@@ -1931,7 +1825,7 @@
               <wp:inline xmlns:wp="http://schemas.openxmlformats.org/drawingml/2006/wordprocessingDrawing" distT="0" distB="0" distL="0" distR="0">
                 <wp:extent cx="5731510" cy="1044846"/>
                 <wp:effectExtent l="0" t="0" r="0" b="0"/>
-                <wp:docPr id="7" name=""/>
+                <wp:docPr id="10" name=""/>
                 <wp:cNvGraphicFramePr>
                   <a:graphicFrameLocks xmlns:a="http://schemas.openxmlformats.org/drawingml/2006/main" noChangeAspect="1"/>
                 </wp:cNvGraphicFramePr>
@@ -1946,7 +1840,7 @@
                         <pic:nvPr/>
                       </pic:nvPicPr>
                       <pic:blipFill rotWithShape="1">
-                        <a:blip r:embed="rId15"/>
+                        <a:blip r:embed="rId18"/>
                         <a:stretch/>
                       </pic:blipFill>
                       <pic:spPr bwMode="auto">
@@ -1985,8 +1879,8 @@
                 <v:path o:extrusionok="f" gradientshapeok="t" o:connecttype="rect"/>
                 <o:lock v:ext="edit" aspectratio="t"/>
               </v:shapetype>
-              <v:shape id="_x0000_i6" o:spid="_x0000_s6" type="#_x0000_t75" style="width:451.30pt;height:82.27pt;mso-wrap-distance-left:0.00pt;mso-wrap-distance-top:0.00pt;mso-wrap-distance-right:0.00pt;mso-wrap-distance-bottom:0.00pt;z-index:1;" stroked="false">
-                <v:imagedata r:id="rId15" o:title=""/>
+              <v:shape id="_x0000_i9" o:spid="_x0000_s9" type="#_x0000_t75" style="width:451.30pt;height:82.27pt;mso-wrap-distance-left:0.00pt;mso-wrap-distance-top:0.00pt;mso-wrap-distance-right:0.00pt;mso-wrap-distance-bottom:0.00pt;z-index:1;" stroked="false">
+                <v:imagedata r:id="rId18" o:title=""/>
                 <o:lock v:ext="edit" rotation="t"/>
               </v:shape>
             </w:pict>
@@ -2018,7 +1912,7 @@
               <wp:inline xmlns:wp="http://schemas.openxmlformats.org/drawingml/2006/wordprocessingDrawing" distT="0" distB="0" distL="0" distR="0">
                 <wp:extent cx="5731510" cy="551178"/>
                 <wp:effectExtent l="0" t="0" r="0" b="0"/>
-                <wp:docPr id="8" name=""/>
+                <wp:docPr id="11" name=""/>
                 <wp:cNvGraphicFramePr>
                   <a:graphicFrameLocks xmlns:a="http://schemas.openxmlformats.org/drawingml/2006/main" noChangeAspect="1"/>
                 </wp:cNvGraphicFramePr>
@@ -2033,7 +1927,7 @@
                         <pic:nvPr/>
                       </pic:nvPicPr>
                       <pic:blipFill rotWithShape="1">
-                        <a:blip r:embed="rId16"/>
+                        <a:blip r:embed="rId19"/>
                         <a:stretch/>
                       </pic:blipFill>
                       <pic:spPr bwMode="auto">
@@ -2072,8 +1966,8 @@
                 <v:path o:extrusionok="f" gradientshapeok="t" o:connecttype="rect"/>
                 <o:lock v:ext="edit" aspectratio="t"/>
               </v:shapetype>
-              <v:shape id="_x0000_i7" o:spid="_x0000_s7" type="#_x0000_t75" style="width:451.30pt;height:43.40pt;mso-wrap-distance-left:0.00pt;mso-wrap-distance-top:0.00pt;mso-wrap-distance-right:0.00pt;mso-wrap-distance-bottom:0.00pt;z-index:1;" stroked="false">
-                <v:imagedata r:id="rId16" o:title=""/>
+              <v:shape id="_x0000_i10" o:spid="_x0000_s10" type="#_x0000_t75" style="width:451.30pt;height:43.40pt;mso-wrap-distance-left:0.00pt;mso-wrap-distance-top:0.00pt;mso-wrap-distance-right:0.00pt;mso-wrap-distance-bottom:0.00pt;z-index:1;" stroked="false">
+                <v:imagedata r:id="rId19" o:title=""/>
                 <o:lock v:ext="edit" rotation="t"/>
               </v:shape>
             </w:pict>
@@ -2092,6 +1986,12 @@
           <w:lang w:val="en-GB"/>
         </w:rPr>
       </w:r>
+      <w:r>
+        <w:rPr>
+          <w:highlight w:val="none"/>
+          <w:lang w:val="en-GB"/>
+        </w:rPr>
+      </w:r>
     </w:p>
     <w:p>
       <w:pPr>
@@ -2126,6 +2026,11 @@
       </w:r>
       <w:r>
         <w:t xml:space="preserve"> 3:</w:t>
+      </w:r>
+      <w:r>
+        <w:rPr>
+          <w:highlight w:val="none"/>
+        </w:rPr>
       </w:r>
       <w:r>
         <w:rPr>
@@ -2181,7 +2086,7 @@
       </w:r>
       <w:r>
         <w:rPr>
-          <w:rFonts w:ascii="Calibri" w:hAnsi="Calibri" w:eastAsia="Calibri" w:cs="Calibri"/>
+          <w:rFonts w:ascii="Calibri" w:hAnsi="Calibri" w:cs="Calibri"/>
           <w:color w:val="4472c4" w:themeColor="accent1"/>
           <w:sz w:val="22"/>
           <w:szCs w:val="22"/>
@@ -2246,7 +2151,7 @@
       </w:r>
       <w:r>
         <w:rPr>
-          <w:rFonts w:ascii="Calibri" w:hAnsi="Calibri" w:eastAsia="Calibri" w:cs="Calibri"/>
+          <w:rFonts w:ascii="Calibri" w:hAnsi="Calibri" w:cs="Calibri"/>
           <w:color w:val="4472c4" w:themeColor="accent1"/>
           <w:sz w:val="22"/>
           <w:szCs w:val="22"/>
@@ -2976,6 +2881,7 @@
       <w:r>
         <w:rPr>
           <w:color w:val="4472c4" w:themeColor="accent1"/>
+          <w:highlight w:val="none"/>
         </w:rPr>
       </w:r>
       <w:r>
@@ -3024,6 +2930,11 @@
       </w:pPr>
       <w:r>
         <w:t xml:space="preserve">Uitdaging: geef het aantal een bewuste waarde. Bijvoorbeeld 100 ipv 5</w:t>
+      </w:r>
+      <w:r>
+        <w:rPr>
+          <w:highlight w:val="none"/>
+        </w:rPr>
       </w:r>
       <w:r>
         <w:rPr>

</xml_diff>

<commit_message>
opd 1 af, denk ik
</commit_message>
<xml_diff>
--- a/Sec-Week-1/C security practicum 1.docx
+++ b/Sec-Week-1/C security practicum 1.docx
@@ -313,7 +313,7 @@
         <w:spacing/>
         <w:ind w:firstLine="0" w:left="720"/>
         <w:rPr>
-          <w:color w:val="c00000"/>
+          <w:color w:val="000000" w:themeColor="text1"/>
         </w:rPr>
       </w:pPr>
       <w:r>
@@ -405,7 +405,12 @@
       </w:r>
       <w:r>
         <w:rPr>
-          <w:color w:val="c00000"/>
+          <w:color w:val="000000" w:themeColor="text1"/>
+        </w:rPr>
+      </w:r>
+      <w:r>
+        <w:rPr>
+          <w:color w:val="000000" w:themeColor="text1"/>
         </w:rPr>
       </w:r>
     </w:p>
@@ -415,88 +420,114 @@
         <w:spacing/>
         <w:ind w:firstLine="0" w:left="720"/>
         <w:rPr>
-          <w:color w:val="c00000"/>
+          <w:highlight w:val="none"/>
         </w:rPr>
       </w:pPr>
       <w:r>
         <w:rPr>
-          <w:color w:val="c00000"/>
+          <w:color w:val="000000" w:themeColor="text1"/>
           <w:lang w:val="en-GB"/>
         </w:rPr>
-        <w:t xml:space="preserve">D) </w:t>
+        <w:t xml:space="preserve">D</w:t>
       </w:r>
       <w:r>
         <w:rPr>
-          <w:color w:val="c00000"/>
+          <w:color w:val="000000" w:themeColor="text1"/>
+          <w:lang w:val="en-GB"/>
+        </w:rPr>
+        <w:t xml:space="preserve">) </w:t>
+      </w:r>
+      <w:r>
+        <w:rPr>
+          <w:color w:val="000000" w:themeColor="text1"/>
         </w:rPr>
         <w:t xml:space="preserve">Maak een voorbeeld met een pointer die door een buffer</w:t>
       </w:r>
       <w:r>
         <w:rPr>
-          <w:color w:val="c00000"/>
+          <w:color w:val="000000" w:themeColor="text1"/>
         </w:rPr>
         <w:t xml:space="preserve">overflow</w:t>
       </w:r>
       <w:r>
         <w:rPr>
-          <w:color w:val="c00000"/>
+          <w:color w:val="000000" w:themeColor="text1"/>
         </w:rPr>
         <w:t xml:space="preserve"> wordt aangepast. Laat</w:t>
       </w:r>
       <w:r>
         <w:rPr>
-          <w:color w:val="c00000"/>
+          <w:color w:val="000000" w:themeColor="text1"/>
         </w:rPr>
         <w:t xml:space="preserve"> z</w:t>
       </w:r>
       <w:r>
         <w:rPr>
-          <w:color w:val="c00000"/>
+          <w:color w:val="000000" w:themeColor="text1"/>
         </w:rPr>
         <w:t xml:space="preserve">ien in het memory window</w:t>
       </w:r>
       <w:r>
         <w:rPr>
-          <w:color w:val="c00000"/>
+          <w:color w:val="000000" w:themeColor="text1"/>
         </w:rPr>
         <w:t xml:space="preserve"> </w:t>
       </w:r>
       <w:r>
         <w:rPr>
-          <w:color w:val="c00000"/>
+          <w:color w:val="000000" w:themeColor="text1"/>
         </w:rPr>
-        <w:t xml:space="preserve"> dat de waarde (=adres)  is aangepast. </w:t>
+        <w:t xml:space="preserve"> d</w:t>
       </w:r>
       <w:r>
         <w:rPr>
-          <w:color w:val="c00000"/>
+          <w:color w:val="000000" w:themeColor="text1"/>
+        </w:rPr>
+        <w:t xml:space="preserve">at de waarde (=adres)  is aangepast. </w:t>
+        <w:br/>
+      </w:r>
+      <w:r>
+        <w:rPr>
+          <w:color w:val="4472c4" w:themeColor="accent1"/>
+          <w:lang w:val="en-GB"/>
+        </w:rPr>
+        <w:t xml:space="preserve">door dat we buiten de  buffer schrijven, overschrijven we nu buiten de override dus overschrijven we ptr van buffie</w:t>
+      </w:r>
+      <w:r>
+        <w:rPr>
+          <w:color w:val="000000" w:themeColor="text1"/>
+        </w:rPr>
+      </w:r>
+      <w:r>
+        <w:rPr>
+          <w:highlight w:val="none"/>
+        </w:rPr>
+      </w:r>
+    </w:p>
+    <w:p>
+      <w:pPr>
+        <w:pBdr/>
+        <w:spacing/>
+        <w:ind w:firstLine="0" w:left="720"/>
+        <w:rPr>
+          <w:color w:val="000000" w:themeColor="text1"/>
+        </w:rPr>
+      </w:pPr>
+      <w:r>
+        <w:rPr>
+          <w:color w:val="4472c4" w:themeColor="accent1"/>
           <w:highlight w:val="none"/>
         </w:rPr>
       </w:r>
       <w:r>
         <w:rPr>
-          <w:color w:val="c00000"/>
-        </w:rPr>
-      </w:r>
-    </w:p>
-    <w:p>
-      <w:pPr>
-        <w:pBdr/>
-        <w:spacing/>
-        <w:ind w:firstLine="0" w:left="720"/>
-        <w:rPr/>
-      </w:pPr>
-      <w:r>
-        <w:rPr>
           <w:highlight w:val="none"/>
         </w:rPr>
-      </w:r>
-      <w:r>
         <mc:AlternateContent>
           <mc:Choice Requires="wpg">
             <w:drawing>
               <wp:inline xmlns:wp="http://schemas.openxmlformats.org/drawingml/2006/wordprocessingDrawing" distT="0" distB="0" distL="0" distR="0">
-                <wp:extent cx="4610100" cy="3571875"/>
+                <wp:extent cx="5731510" cy="2768404"/>
                 <wp:effectExtent l="0" t="0" r="0" b="0"/>
                 <wp:docPr id="4" name=""/>
                 <wp:cNvGraphicFramePr>
@@ -506,7 +537,7 @@
                   <a:graphicData uri="http://schemas.openxmlformats.org/drawingml/2006/picture">
                     <pic:pic xmlns:pic="http://schemas.openxmlformats.org/drawingml/2006/picture">
                       <pic:nvPicPr>
-                        <pic:cNvPr id="628426508" name=""/>
+                        <pic:cNvPr id="1353732506" name=""/>
                         <pic:cNvPicPr>
                           <a:picLocks noChangeAspect="1"/>
                         </pic:cNvPicPr>
@@ -519,7 +550,7 @@
                       <pic:spPr bwMode="auto">
                         <a:xfrm>
                           <a:off x="0" y="0"/>
-                          <a:ext cx="4610099" cy="3571875"/>
+                          <a:ext cx="5731509" cy="2768404"/>
                         </a:xfrm>
                         <a:prstGeom prst="rect">
                           <a:avLst/>
@@ -552,13 +583,36 @@
                 <v:path o:extrusionok="f" gradientshapeok="t" o:connecttype="rect"/>
                 <o:lock v:ext="edit" aspectratio="t"/>
               </v:shapetype>
-              <v:shape id="_x0000_i3" o:spid="_x0000_s3" type="#_x0000_t75" style="width:363.00pt;height:281.25pt;mso-wrap-distance-left:0.00pt;mso-wrap-distance-top:0.00pt;mso-wrap-distance-right:0.00pt;mso-wrap-distance-bottom:0.00pt;z-index:1;" stroked="false">
+              <v:shape id="_x0000_i3" o:spid="_x0000_s3" type="#_x0000_t75" style="width:451.30pt;height:217.98pt;mso-wrap-distance-left:0.00pt;mso-wrap-distance-top:0.00pt;mso-wrap-distance-right:0.00pt;mso-wrap-distance-bottom:0.00pt;z-index:1;" stroked="false">
                 <v:imagedata r:id="rId12" o:title=""/>
                 <o:lock v:ext="edit" rotation="t"/>
               </v:shape>
             </w:pict>
           </mc:Fallback>
         </mc:AlternateContent>
+      </w:r>
+      <w:r>
+        <w:rPr>
+          <w:color w:val="000000" w:themeColor="text1"/>
+        </w:rPr>
+      </w:r>
+      <w:r>
+        <w:rPr>
+          <w:color w:val="000000" w:themeColor="text1"/>
+        </w:rPr>
+      </w:r>
+    </w:p>
+    <w:p>
+      <w:pPr>
+        <w:pBdr/>
+        <w:spacing/>
+        <w:ind w:firstLine="0" w:left="720"/>
+        <w:rPr/>
+      </w:pPr>
+      <w:r>
+        <w:rPr>
+          <w:highlight w:val="none"/>
+        </w:rPr>
       </w:r>
       <w:r>
         <w:rPr>
@@ -602,7 +656,7 @@
                   <a:graphicData uri="http://schemas.openxmlformats.org/drawingml/2006/picture">
                     <pic:pic xmlns:pic="http://schemas.openxmlformats.org/drawingml/2006/picture">
                       <pic:nvPicPr>
-                        <pic:cNvPr id="1523707406" name=""/>
+                        <pic:cNvPr id="1053168447" name=""/>
                         <pic:cNvPicPr>
                           <a:picLocks noChangeAspect="1"/>
                         </pic:cNvPicPr>
@@ -615,7 +669,7 @@
                       <pic:spPr bwMode="auto">
                         <a:xfrm>
                           <a:off x="0" y="0"/>
-                          <a:ext cx="4619624" cy="2990849"/>
+                          <a:ext cx="4619623" cy="2990848"/>
                         </a:xfrm>
                         <a:prstGeom prst="rect">
                           <a:avLst/>
@@ -656,6 +710,8 @@
           </mc:Fallback>
         </mc:AlternateContent>
       </w:r>
+      <w:r/>
+      <w:r/>
       <w:r/>
     </w:p>
     <w:p>
@@ -1490,11 +1546,9 @@
         </w:rPr>
         <w:t xml:space="preserve">BBBBBBBBBBBBBBBBBBBBBBBBBBBBBBBBBBBBBBBBBBBBBBBBBBBBBBBBBBBBBBBBBBBBBBBBBBBBBBBB2025-01-01 5</w:t>
       </w:r>
-      <w:r/>
       <w:r>
         <w:rPr>
           <w:color w:val="4472c4" w:themeColor="accent1"/>
-          <w:highlight w:val="none"/>
         </w:rPr>
       </w:r>
       <w:r>
@@ -1586,12 +1640,6 @@
       </w:r>
       <w:r>
         <w:rPr>
-          <w:lang w:val="en-GB"/>
-        </w:rPr>
-      </w:r>
-      <w:r/>
-      <w:r>
-        <w:rPr>
           <w:highlight w:val="none"/>
           <w:lang w:val="en-GB"/>
         </w:rPr>
@@ -1608,7 +1656,6 @@
           <w:lang w:val="en-GB"/>
         </w:rPr>
       </w:pPr>
-      <w:r/>
       <w:r>
         <w:rPr>
           <w:lang w:val="en-GB"/>
@@ -1900,14 +1947,6 @@
           <w:sz w:val="22"/>
           <w:szCs w:val="22"/>
         </w:rPr>
-      </w:r>
-      <w:r>
-        <w:rPr>
-          <w:rFonts w:ascii="Calibri" w:hAnsi="Calibri" w:eastAsia="Calibri" w:cs="Calibri"/>
-          <w:color w:val="4472c4" w:themeColor="accent1"/>
-          <w:sz w:val="22"/>
-          <w:szCs w:val="22"/>
-        </w:rPr>
         <w:t xml:space="preserve">snprintf(klantnr, sizeof(klantnr), "%s", buffer2);</w:t>
       </w:r>
       <w:r>
@@ -2400,7 +2439,9 @@
         <w:spacing/>
         <w:ind/>
         <w:rPr>
-          <w:color w:val="c00000"/>
+          <w:color w:val="4472c4" w:themeColor="accent1"/>
+          <w:highlight w:val="none"/>
+          <w:lang w:val="en-GB"/>
         </w:rPr>
       </w:pPr>
       <w:r>
@@ -2409,38 +2450,35 @@
       </w:r>
       <w:r>
         <w:rPr>
-          <w:color w:val="c00000"/>
+          <w:color w:val="4472c4" w:themeColor="accent1"/>
+          <w:lang w:val="en-GB"/>
         </w:rPr>
-        <w:t xml:space="preserve">Kwetsbaarheid: artikelnr[8] buffer overloopt naar adjacent int aantal via onbeveiligde fscanf:</w:t>
-        <w:br/>
+        <w:t xml:space="preserve">door </w:t>
       </w:r>
       <w:r>
         <w:rPr>
-          <w:color w:val="c00000"/>
+          <w:color w:val="4472c4" w:themeColor="accent1"/>
+          <w:lang w:val="en-GB"/>
         </w:rPr>
-        <w:t xml:space="preserve">while (fscanf(f, " %s %d", artikelnr, &amp;aantal) == 2) {  // Regel 107 - GEEN lengtelimiet!</w:t>
+        <w:t xml:space="preserve">A500202Sa 5</w:t>
       </w:r>
       <w:r>
         <w:rPr>
-          <w:color w:val="c00000"/>
+          <w:color w:val="4472c4" w:themeColor="accent1"/>
+          <w:lang w:val="en-GB"/>
         </w:rPr>
-        <w:br/>
+        <w:t xml:space="preserve"> in te vullen waar van Sa in AsCII waarden  97 heeft krijg je een overflow waardoor je het artiekel nummer kan aan passen door overflow</w:t>
       </w:r>
       <w:r>
         <w:rPr>
-          <w:color w:val="c00000"/>
-          <w:highlight w:val="none"/>
-        </w:rPr>
-        <w:t xml:space="preserve">Exploit - Schadelijk invoerbestand:</w:t>
-      </w:r>
-      <w:r>
-        <w:rPr>
-          <w:color w:val="c00000"/>
+          <w:lang w:val="en-GB"/>
         </w:rPr>
       </w:r>
       <w:r>
         <w:rPr>
-          <w:color w:val="c00000"/>
+          <w:color w:val="4472c4" w:themeColor="accent1"/>
+          <w:highlight w:val="none"/>
+          <w:lang w:val="en-GB"/>
         </w:rPr>
       </w:r>
     </w:p>
@@ -2451,23 +2489,88 @@
         <w:ind/>
         <w:rPr>
           <w:color w:val="c00000"/>
+          <w:lang w:val="en-GB"/>
         </w:rPr>
       </w:pPr>
       <w:r>
         <w:rPr>
-          <w:color w:val="c00000"/>
+          <w:color w:val="4472c4" w:themeColor="accent1"/>
           <w:highlight w:val="none"/>
+          <w:lang w:val="en-GB"/>
         </w:rPr>
-        <w:t xml:space="preserve">KLANT 12345</w:t>
+        <mc:AlternateContent>
+          <mc:Choice Requires="wpg">
+            <w:drawing>
+              <wp:inline xmlns:wp="http://schemas.openxmlformats.org/drawingml/2006/wordprocessingDrawing" distT="0" distB="0" distL="0" distR="0">
+                <wp:extent cx="4124325" cy="3467100"/>
+                <wp:effectExtent l="0" t="0" r="0" b="0"/>
+                <wp:docPr id="9" name=""/>
+                <wp:cNvGraphicFramePr>
+                  <a:graphicFrameLocks xmlns:a="http://schemas.openxmlformats.org/drawingml/2006/main" noChangeAspect="1"/>
+                </wp:cNvGraphicFramePr>
+                <a:graphic xmlns:a="http://schemas.openxmlformats.org/drawingml/2006/main">
+                  <a:graphicData uri="http://schemas.openxmlformats.org/drawingml/2006/picture">
+                    <pic:pic xmlns:pic="http://schemas.openxmlformats.org/drawingml/2006/picture">
+                      <pic:nvPicPr>
+                        <pic:cNvPr id="1650303031" name=""/>
+                        <pic:cNvPicPr>
+                          <a:picLocks noChangeAspect="1"/>
+                        </pic:cNvPicPr>
+                        <pic:nvPr/>
+                      </pic:nvPicPr>
+                      <pic:blipFill>
+                        <a:blip r:embed="rId17"/>
+                        <a:stretch/>
+                      </pic:blipFill>
+                      <pic:spPr bwMode="auto">
+                        <a:xfrm>
+                          <a:off x="0" y="0"/>
+                          <a:ext cx="4124324" cy="3467099"/>
+                        </a:xfrm>
+                        <a:prstGeom prst="rect">
+                          <a:avLst/>
+                        </a:prstGeom>
+                      </pic:spPr>
+                    </pic:pic>
+                  </a:graphicData>
+                </a:graphic>
+              </wp:inline>
+            </w:drawing>
+          </mc:Choice>
+          <mc:Fallback>
+            <w:pict>
+              <v:shapetype id="_x0000_t75" coordsize="21600,21600" o:spt="75" o:preferrelative="t" path="m@4@5l@4@11@9@11@9@5xe" filled="f" stroked="f">
+                <v:stroke joinstyle="miter"/>
+                <v:formulas>
+                  <v:f eqn="if lineDrawn pixelLineWidth 0"/>
+                  <v:f eqn="sum @0 1 0"/>
+                  <v:f eqn="sum 0 0 @1"/>
+                  <v:f eqn="prod @2 1 2"/>
+                  <v:f eqn="prod @3 21600 pixelWidth"/>
+                  <v:f eqn="prod @3 21600 pixelHeight"/>
+                  <v:f eqn="sum @0 0 1"/>
+                  <v:f eqn="prod @6 1 2"/>
+                  <v:f eqn="prod @7 21600 pixelWidth"/>
+                  <v:f eqn="sum @8 21600 0"/>
+                  <v:f eqn="prod @7 21600 pixelHeight"/>
+                  <v:f eqn="sum @10 21600 0"/>
+                </v:formulas>
+                <v:path o:extrusionok="f" gradientshapeok="t" o:connecttype="rect"/>
+                <o:lock v:ext="edit" aspectratio="t"/>
+              </v:shapetype>
+              <v:shape id="_x0000_i8" o:spid="_x0000_s8" type="#_x0000_t75" style="width:324.75pt;height:273.00pt;mso-wrap-distance-left:0.00pt;mso-wrap-distance-top:0.00pt;mso-wrap-distance-right:0.00pt;mso-wrap-distance-bottom:0.00pt;z-index:1;" stroked="false">
+                <v:imagedata r:id="rId17" o:title=""/>
+                <o:lock v:ext="edit" rotation="t"/>
+              </v:shape>
+            </w:pict>
+          </mc:Fallback>
+        </mc:AlternateContent>
       </w:r>
       <w:r>
         <w:rPr>
-          <w:color w:val="c00000"/>
-        </w:rPr>
-      </w:r>
-      <w:r>
-        <w:rPr>
-          <w:color w:val="c00000"/>
+          <w:color w:val="4472c4" w:themeColor="accent1"/>
+          <w:highlight w:val="none"/>
+          <w:lang w:val="en-GB"/>
         </w:rPr>
       </w:r>
     </w:p>
@@ -2476,133 +2579,8 @@
         <w:pBdr/>
         <w:spacing/>
         <w:ind/>
-        <w:rPr>
-          <w:color w:val="c00000"/>
-        </w:rPr>
-      </w:pPr>
-      <w:r>
-        <w:rPr>
-          <w:color w:val="c00000"/>
-          <w:highlight w:val="none"/>
-        </w:rPr>
-        <w:t xml:space="preserve">DATUM HEADER</w:t>
-      </w:r>
-      <w:r>
-        <w:rPr>
-          <w:color w:val="c00000"/>
-        </w:rPr>
-      </w:r>
-      <w:r>
-        <w:rPr>
-          <w:color w:val="c00000"/>
-        </w:rPr>
-      </w:r>
-    </w:p>
-    <w:p>
-      <w:pPr>
-        <w:pBdr/>
-        <w:spacing/>
-        <w:ind/>
-        <w:rPr>
-          <w:color w:val="c00000"/>
-        </w:rPr>
-      </w:pPr>
-      <w:r>
-        <w:rPr>
-          <w:color w:val="c00000"/>
-          <w:highlight w:val="none"/>
-        </w:rPr>
-        <w:t xml:space="preserve">AAAAAAAA\xFF\x0F\x00\x00 100</w:t>
-      </w:r>
-      <w:r>
-        <w:rPr>
-          <w:color w:val="c00000"/>
-          <w:highlight w:val="none"/>
-        </w:rPr>
-        <w:br/>
-      </w:r>
-      <w:r>
-        <w:rPr>
-          <w:color w:val="c00000"/>
-          <w:highlight w:val="none"/>
-        </w:rPr>
-        <w:t xml:space="preserve">De 8 A's vullen artikelnr[8], daarna overloopt \xFF\x0F\x00\x00 en stelt aantal = 4095 in plaats van 100.</w:t>
-      </w:r>
-      <w:r>
-        <w:rPr>
-          <w:color w:val="c00000"/>
-        </w:rPr>
-      </w:r>
-      <w:r>
-        <w:rPr>
-          <w:color w:val="c00000"/>
-        </w:rPr>
-      </w:r>
-    </w:p>
-    <w:p>
-      <w:pPr>
-        <w:pBdr/>
-        <w:spacing/>
-        <w:ind/>
-        <w:rPr>
-          <w:color w:val="c00000"/>
-          <w:highlight w:val="none"/>
-        </w:rPr>
-      </w:pPr>
-      <w:r>
-        <w:rPr>
-          <w:color w:val="c00000"/>
-          <w:highlight w:val="none"/>
-        </w:rPr>
-        <w:t xml:space="preserve">Fix (1 regel wijziging):</w:t>
-      </w:r>
-      <w:r>
-        <w:rPr>
-          <w:color w:val="c00000"/>
-          <w:highlight w:val="none"/>
-        </w:rPr>
-        <w:br/>
-      </w:r>
-      <w:r>
-        <w:rPr>
-          <w:color w:val="c00000"/>
-          <w:highlight w:val="none"/>
-        </w:rPr>
-        <w:t xml:space="preserve">while (fscanf(f, " %7s %d", artikelnr, &amp;aantal) == 2) {</w:t>
-      </w:r>
-      <w:r>
-        <w:rPr>
-          <w:color w:val="c00000"/>
-          <w:highlight w:val="none"/>
-        </w:rPr>
-      </w:r>
-      <w:r>
-        <w:rPr>
-          <w:color w:val="c00000"/>
-          <w:highlight w:val="none"/>
-        </w:rPr>
-      </w:r>
-    </w:p>
-    <w:p>
-      <w:pPr>
-        <w:pBdr/>
-        <w:spacing/>
-        <w:ind/>
         <w:rPr/>
       </w:pPr>
-      <w:r>
-        <w:rPr>
-          <w:color w:val="c00000"/>
-          <w:highlight w:val="none"/>
-        </w:rPr>
-      </w:r>
-      <w:r>
-        <w:rPr>
-          <w:color w:val="c00000"/>
-          <w:highlight w:val="none"/>
-        </w:rPr>
-        <w:t xml:space="preserve">Voeg 7 lengtespecificatie toe: %7s in plaats van %s</w:t>
-      </w:r>
       <w:r>
         <w:rPr>
           <w:highlight w:val="none"/>

</xml_diff>